<commit_message>
Rebuild STS and the browsable specification from c59b1ed2
Generated by .github/workflows/publish.yml. Edit source/, model/ or
manifest.json — never artifacts/ or docs/, which the next build discards.
</commit_message>
<xml_diff>
--- a/artifacts/OPC-30050.docx
+++ b/artifacts/OPC-30050.docx
@@ -80,7 +80,7 @@
                                 <pic:cNvPicPr/>
                               </pic:nvPicPr>
                               <pic:blipFill>
-                                <a:blip r:embed="Rc1c01a8f94f24ae8"/>
+                                <a:blip r:embed="R6105235a477b4290"/>
                                 <a:stretch>
                                   <a:fillRect/>
                                 </a:stretch>
@@ -183,7 +183,7 @@
                                 <pic:cNvPicPr/>
                               </pic:nvPicPr>
                               <pic:blipFill>
-                                <a:blip r:embed="Rea6623c2af7d48a6"/>
+                                <a:blip r:embed="Rc4fc30fa021b48e0"/>
                                 <a:stretch>
                                   <a:fillRect/>
                                 </a:stretch>
@@ -1485,7 +1485,7 @@
         <w:spacing w:before="60"/>
         <w:ind w:left="340"/>
       </w:pPr>
-      <w:hyperlink r:id="Rae254f9927134848">
+      <w:hyperlink r:id="R7cf5b554a1e64d75">
         <w:r>
           <w:rPr>
             <w:rStyle w:val="Hyperlink"/>
@@ -1520,7 +1520,7 @@
         <w:spacing w:before="60"/>
         <w:ind w:left="340"/>
       </w:pPr>
-      <w:hyperlink r:id="Rde2a22e0e02e4ef6">
+      <w:hyperlink r:id="Ra0902f0757bc49ce">
         <w:r>
           <w:rPr>
             <w:rStyle w:val="Hyperlink"/>
@@ -1555,7 +1555,7 @@
         <w:spacing w:before="60"/>
         <w:ind w:left="340"/>
       </w:pPr>
-      <w:hyperlink r:id="Rba82db7288e04fd2">
+      <w:hyperlink r:id="Rbaafb75a3fe04310">
         <w:r>
           <w:rPr>
             <w:rStyle w:val="Hyperlink"/>
@@ -1590,7 +1590,7 @@
         <w:spacing w:before="60"/>
         <w:ind w:left="340"/>
       </w:pPr>
-      <w:hyperlink r:id="Reb3494bcd7884c87">
+      <w:hyperlink r:id="R9a5bdd70db3b44a5">
         <w:r>
           <w:rPr>
             <w:rStyle w:val="Hyperlink"/>
@@ -1625,7 +1625,7 @@
         <w:spacing w:before="60"/>
         <w:ind w:left="340"/>
       </w:pPr>
-      <w:hyperlink r:id="R26eee5618cb041e6">
+      <w:hyperlink r:id="Rd21d7757a66a4adc">
         <w:r>
           <w:rPr>
             <w:rStyle w:val="Hyperlink"/>
@@ -1660,7 +1660,7 @@
         <w:spacing w:before="60"/>
         <w:ind w:left="340"/>
       </w:pPr>
-      <w:hyperlink r:id="Re44cf727f4c949b3">
+      <w:hyperlink r:id="R18b73f176fba491b">
         <w:r>
           <w:rPr>
             <w:rStyle w:val="Hyperlink"/>
@@ -1695,7 +1695,7 @@
         <w:spacing w:before="60"/>
         <w:ind w:left="340"/>
       </w:pPr>
-      <w:hyperlink r:id="Rf6d4af894ef64338">
+      <w:hyperlink r:id="R420d9f7293a74d50">
         <w:r>
           <w:rPr>
             <w:rStyle w:val="Hyperlink"/>
@@ -1730,7 +1730,7 @@
         <w:spacing w:before="60"/>
         <w:ind w:left="340"/>
       </w:pPr>
-      <w:hyperlink r:id="R82df062633f4459c">
+      <w:hyperlink r:id="R08b5c4d46c024d85">
         <w:r>
           <w:rPr>
             <w:rStyle w:val="Hyperlink"/>
@@ -1765,7 +1765,7 @@
         <w:spacing w:before="60"/>
         <w:ind w:left="340"/>
       </w:pPr>
-      <w:hyperlink r:id="R476c0aabf7414b62">
+      <w:hyperlink r:id="R36bfd2b8ea2344d9">
         <w:r>
           <w:rPr>
             <w:rStyle w:val="Hyperlink"/>
@@ -1800,7 +1800,7 @@
         <w:spacing w:before="60"/>
         <w:ind w:left="340"/>
       </w:pPr>
-      <w:hyperlink r:id="Rb0e30a2049414df9">
+      <w:hyperlink r:id="Rafc3965e5776462d">
         <w:r>
           <w:rPr>
             <w:rStyle w:val="Hyperlink"/>
@@ -1835,7 +1835,7 @@
         <w:spacing w:before="60"/>
         <w:ind w:left="340"/>
       </w:pPr>
-      <w:hyperlink r:id="Rf874da99bae24e19">
+      <w:hyperlink r:id="R665eeb1d596244b2">
         <w:r>
           <w:rPr>
             <w:rStyle w:val="Hyperlink"/>
@@ -1870,7 +1870,7 @@
         <w:spacing w:before="60"/>
         <w:ind w:left="340"/>
       </w:pPr>
-      <w:hyperlink r:id="R0c6eda30bb834fff">
+      <w:hyperlink r:id="R45136ae14b724830">
         <w:r>
           <w:rPr>
             <w:rStyle w:val="Hyperlink"/>
@@ -1905,7 +1905,7 @@
         <w:spacing w:before="60"/>
         <w:ind w:left="340"/>
       </w:pPr>
-      <w:hyperlink r:id="R3f3f043d346e4e51">
+      <w:hyperlink r:id="Rabc9e17333e24510">
         <w:r>
           <w:rPr>
             <w:rStyle w:val="Hyperlink"/>
@@ -1940,7 +1940,7 @@
         <w:spacing w:before="60"/>
         <w:ind w:left="340"/>
       </w:pPr>
-      <w:hyperlink r:id="R6bdcf82907d248da">
+      <w:hyperlink r:id="Raf0af82a94524140">
         <w:r>
           <w:rPr>
             <w:rStyle w:val="Hyperlink"/>
@@ -3003,7 +3003,7 @@
                     <pic:cNvPicPr/>
                   </pic:nvPicPr>
                   <pic:blipFill>
-                    <a:blip r:embed="R414c0f9133724e4c"/>
+                    <a:blip r:embed="Re3174ccf01d5477c"/>
                     <a:stretch>
                       <a:fillRect/>
                     </a:stretch>
@@ -3286,7 +3286,7 @@
                     <pic:cNvPicPr/>
                   </pic:nvPicPr>
                   <pic:blipFill>
-                    <a:blip r:embed="Rc29bbc927a3b4bc1"/>
+                    <a:blip r:embed="Ra3ec4e4a69074e25"/>
                     <a:stretch>
                       <a:fillRect/>
                     </a:stretch>
@@ -4427,7 +4427,7 @@
                     <pic:cNvPicPr/>
                   </pic:nvPicPr>
                   <pic:blipFill>
-                    <a:blip r:embed="Rdec7569e9074437b"/>
+                    <a:blip r:embed="R9a2fb2f981cb4e09"/>
                     <a:stretch>
                       <a:fillRect/>
                     </a:stretch>
@@ -4712,7 +4712,7 @@
                     <pic:cNvPicPr/>
                   </pic:nvPicPr>
                   <pic:blipFill>
-                    <a:blip r:embed="R0ca7c45cf32048c4"/>
+                    <a:blip r:embed="R1bdde739b8934357"/>
                     <a:stretch>
                       <a:fillRect/>
                     </a:stretch>
@@ -5080,7 +5080,7 @@
                     <pic:cNvPicPr/>
                   </pic:nvPicPr>
                   <pic:blipFill>
-                    <a:blip r:embed="Rce696154c849407d"/>
+                    <a:blip r:embed="R0fe7267efc6c415a"/>
                     <a:stretch>
                       <a:fillRect/>
                     </a:stretch>
@@ -5290,7 +5290,7 @@
                     <pic:cNvPicPr/>
                   </pic:nvPicPr>
                   <pic:blipFill>
-                    <a:blip r:embed="Rb0a96b51ebb7449d"/>
+                    <a:blip r:embed="R7e8ef16796694404"/>
                     <a:stretch>
                       <a:fillRect/>
                     </a:stretch>
@@ -5374,7 +5374,7 @@
                     <pic:cNvPicPr/>
                   </pic:nvPicPr>
                   <pic:blipFill>
-                    <a:blip r:embed="R4a9d06bff4a8431b"/>
+                    <a:blip r:embed="R5103183c351c4482"/>
                     <a:stretch>
                       <a:fillRect/>
                     </a:stretch>
@@ -6845,7 +6845,7 @@
                     <pic:cNvPicPr/>
                   </pic:nvPicPr>
                   <pic:blipFill>
-                    <a:blip r:embed="R963e4f4f5312468f"/>
+                    <a:blip r:embed="Rd813def0e4924485"/>
                     <a:stretch>
                       <a:fillRect/>
                     </a:stretch>
@@ -7449,7 +7449,7 @@
                     <pic:cNvPicPr/>
                   </pic:nvPicPr>
                   <pic:blipFill>
-                    <a:blip r:embed="R43f4aacf5182410a"/>
+                    <a:blip r:embed="R9ceb4c443c08424c"/>
                     <a:stretch>
                       <a:fillRect/>
                     </a:stretch>
@@ -7602,7 +7602,7 @@
                     <pic:cNvPicPr/>
                   </pic:nvPicPr>
                   <pic:blipFill>
-                    <a:blip r:embed="Rbe01d0fc8446432e"/>
+                    <a:blip r:embed="R7067108107914c3a"/>
                     <a:stretch>
                       <a:fillRect/>
                     </a:stretch>
@@ -8134,7 +8134,7 @@
                     <pic:cNvPicPr/>
                   </pic:nvPicPr>
                   <pic:blipFill>
-                    <a:blip r:embed="Rf796f029b0db4a55"/>
+                    <a:blip r:embed="R57d8d89d968646b3"/>
                     <a:stretch>
                       <a:fillRect/>
                     </a:stretch>
@@ -9994,7 +9994,7 @@
                     <pic:cNvPicPr/>
                   </pic:nvPicPr>
                   <pic:blipFill>
-                    <a:blip r:embed="R3f2dc20e40e54312"/>
+                    <a:blip r:embed="R4ff0b8a5b0894e81"/>
                     <a:stretch>
                       <a:fillRect/>
                     </a:stretch>
@@ -12470,7 +12470,7 @@
                     <pic:cNvPicPr/>
                   </pic:nvPicPr>
                   <pic:blipFill>
-                    <a:blip r:embed="R64325a12574d4403"/>
+                    <a:blip r:embed="Rd9f6ca79eacc44e3"/>
                     <a:stretch>
                       <a:fillRect/>
                     </a:stretch>
@@ -15197,7 +15197,7 @@
                     <pic:cNvPicPr/>
                   </pic:nvPicPr>
                   <pic:blipFill>
-                    <a:blip r:embed="Rdde166aba0c547a8"/>
+                    <a:blip r:embed="R0a1d1ce7202a4eea"/>
                     <a:stretch>
                       <a:fillRect/>
                     </a:stretch>
@@ -15557,7 +15557,7 @@
                     <pic:cNvPicPr/>
                   </pic:nvPicPr>
                   <pic:blipFill>
-                    <a:blip r:embed="R46637ff30d3647b3"/>
+                    <a:blip r:embed="Ra80514c5dd54475a"/>
                     <a:stretch>
                       <a:fillRect/>
                     </a:stretch>
@@ -15722,7 +15722,7 @@
                     <pic:cNvPicPr/>
                   </pic:nvPicPr>
                   <pic:blipFill>
-                    <a:blip r:embed="Rbb6a3b32a009479a"/>
+                    <a:blip r:embed="R87183dba2857425b"/>
                     <a:stretch>
                       <a:fillRect/>
                     </a:stretch>
@@ -17984,7 +17984,7 @@
                     <pic:cNvPicPr/>
                   </pic:nvPicPr>
                   <pic:blipFill>
-                    <a:blip r:embed="R16916738576e4241"/>
+                    <a:blip r:embed="Rcdb7777ed5204c57"/>
                     <a:stretch>
                       <a:fillRect/>
                     </a:stretch>
@@ -20494,7 +20494,7 @@
                     <pic:cNvPicPr/>
                   </pic:nvPicPr>
                   <pic:blipFill>
-                    <a:blip r:embed="Re5588b65c7fd4a57"/>
+                    <a:blip r:embed="R62d679e869b44478"/>
                     <a:stretch>
                       <a:fillRect/>
                     </a:stretch>
@@ -42319,7 +42319,7 @@
                     <pic:cNvPicPr/>
                   </pic:nvPicPr>
                   <pic:blipFill>
-                    <a:blip r:embed="R16184a35e7184595"/>
+                    <a:blip r:embed="R624861b22c884a8e"/>
                     <a:stretch>
                       <a:fillRect/>
                     </a:stretch>
@@ -42394,7 +42394,7 @@
                     <pic:cNvPicPr/>
                   </pic:nvPicPr>
                   <pic:blipFill>
-                    <a:blip r:embed="Rbe60912a42384bb0"/>
+                    <a:blip r:embed="R18d4483a94924f84"/>
                     <a:stretch>
                       <a:fillRect/>
                     </a:stretch>
@@ -50334,7 +50334,7 @@
             <w:pPr>
               <w:pStyle w:val="TABLE-cell"/>
             </w:pPr>
-            <w:hyperlink r:id="R41d8a77fd8d24198">
+            <w:hyperlink r:id="Rec31a8d5f90b4aa4">
               <w:r>
                 <w:rPr>
                   <w:rStyle w:val="Hyperlink"/>
@@ -50370,7 +50370,7 @@
             <w:pPr>
               <w:pStyle w:val="TABLE-cell"/>
             </w:pPr>
-            <w:hyperlink r:id="R1f88ea0f10664e06">
+            <w:hyperlink r:id="Re11a2eac5cab4067">
               <w:r>
                 <w:rPr>
                   <w:rStyle w:val="Hyperlink"/>
@@ -62117,7 +62117,7 @@
       <w:pPr>
         <w:pStyle w:val="PARAGRAPH"/>
       </w:pPr>
-      <w:hyperlink r:id="Rb69a0f6976af413d">
+      <w:hyperlink r:id="R96036e7f0d7d4142">
         <w:r>
           <w:rPr>
             <w:rStyle w:val="Hyperlink"/>
@@ -62144,7 +62144,7 @@
         <w:rPr/>
         <w:t xml:space="preserve"> can be found </w:t>
       </w:r>
-      <w:hyperlink r:id="Rb95370e468684b83">
+      <w:hyperlink r:id="R3646ea39346e4a45">
         <w:r>
           <w:rPr>
             <w:rStyle w:val="Hyperlink"/>
@@ -62170,7 +62170,7 @@
       <w:pPr>
         <w:pStyle w:val="PARAGRAPH"/>
       </w:pPr>
-      <w:hyperlink r:id="Re2158c8ba6ed4811">
+      <w:hyperlink r:id="R01ce9b03bba94191">
         <w:r>
           <w:rPr>
             <w:rStyle w:val="Hyperlink"/>
@@ -62192,7 +62192,7 @@
       <w:pPr>
         <w:pStyle w:val="PARAGRAPH"/>
       </w:pPr>
-      <w:hyperlink r:id="R88c708fb568442a5">
+      <w:hyperlink r:id="R72221ab49af440bd">
         <w:r>
           <w:rPr>
             <w:rStyle w:val="Hyperlink"/>
@@ -62214,7 +62214,7 @@
       <w:pPr>
         <w:pStyle w:val="PARAGRAPH"/>
       </w:pPr>
-      <w:hyperlink r:id="R175d3a6296f54675">
+      <w:hyperlink r:id="R5a6f40deda3f427d">
         <w:r>
           <w:rPr>
             <w:rStyle w:val="Hyperlink"/>
@@ -62236,7 +62236,7 @@
       <w:pPr>
         <w:pStyle w:val="PARAGRAPH"/>
       </w:pPr>
-      <w:hyperlink r:id="Re2d0db99846645d0">
+      <w:hyperlink r:id="Rd9691a341f574dd2">
         <w:r>
           <w:rPr>
             <w:rStyle w:val="Hyperlink"/>

</xml_diff>

<commit_message>
Rebuild STS and the browsable specification from 25a67d19
Generated by .github/workflows/publish.yml. Edit source/, model/ or
manifest.json — never artifacts/ or docs/, which the next build discards.
</commit_message>
<xml_diff>
--- a/artifacts/OPC-30050.docx
+++ b/artifacts/OPC-30050.docx
@@ -80,7 +80,7 @@
                                 <pic:cNvPicPr/>
                               </pic:nvPicPr>
                               <pic:blipFill>
-                                <a:blip r:embed="R6105235a477b4290"/>
+                                <a:blip r:embed="Rdd3cde08a3184f97"/>
                                 <a:stretch>
                                   <a:fillRect/>
                                 </a:stretch>
@@ -183,7 +183,7 @@
                                 <pic:cNvPicPr/>
                               </pic:nvPicPr>
                               <pic:blipFill>
-                                <a:blip r:embed="Rc4fc30fa021b48e0"/>
+                                <a:blip r:embed="R7c0fe716db3840c9"/>
                                 <a:stretch>
                                   <a:fillRect/>
                                 </a:stretch>
@@ -1485,7 +1485,7 @@
         <w:spacing w:before="60"/>
         <w:ind w:left="340"/>
       </w:pPr>
-      <w:hyperlink r:id="R7cf5b554a1e64d75">
+      <w:hyperlink r:id="R47c0451baf7a424c">
         <w:r>
           <w:rPr>
             <w:rStyle w:val="Hyperlink"/>
@@ -1520,7 +1520,7 @@
         <w:spacing w:before="60"/>
         <w:ind w:left="340"/>
       </w:pPr>
-      <w:hyperlink r:id="Ra0902f0757bc49ce">
+      <w:hyperlink r:id="R6cf64c4c6d6f4343">
         <w:r>
           <w:rPr>
             <w:rStyle w:val="Hyperlink"/>
@@ -1555,7 +1555,7 @@
         <w:spacing w:before="60"/>
         <w:ind w:left="340"/>
       </w:pPr>
-      <w:hyperlink r:id="Rbaafb75a3fe04310">
+      <w:hyperlink r:id="R1ff765550c27473d">
         <w:r>
           <w:rPr>
             <w:rStyle w:val="Hyperlink"/>
@@ -1590,7 +1590,7 @@
         <w:spacing w:before="60"/>
         <w:ind w:left="340"/>
       </w:pPr>
-      <w:hyperlink r:id="R9a5bdd70db3b44a5">
+      <w:hyperlink r:id="R3c1c39d755ab40da">
         <w:r>
           <w:rPr>
             <w:rStyle w:val="Hyperlink"/>
@@ -1625,7 +1625,7 @@
         <w:spacing w:before="60"/>
         <w:ind w:left="340"/>
       </w:pPr>
-      <w:hyperlink r:id="Rd21d7757a66a4adc">
+      <w:hyperlink r:id="Rdf93671197634043">
         <w:r>
           <w:rPr>
             <w:rStyle w:val="Hyperlink"/>
@@ -1660,7 +1660,7 @@
         <w:spacing w:before="60"/>
         <w:ind w:left="340"/>
       </w:pPr>
-      <w:hyperlink r:id="R18b73f176fba491b">
+      <w:hyperlink r:id="R037a68d500674c41">
         <w:r>
           <w:rPr>
             <w:rStyle w:val="Hyperlink"/>
@@ -1695,7 +1695,7 @@
         <w:spacing w:before="60"/>
         <w:ind w:left="340"/>
       </w:pPr>
-      <w:hyperlink r:id="R420d9f7293a74d50">
+      <w:hyperlink r:id="Rd7b4a0af96e0447d">
         <w:r>
           <w:rPr>
             <w:rStyle w:val="Hyperlink"/>
@@ -1730,7 +1730,7 @@
         <w:spacing w:before="60"/>
         <w:ind w:left="340"/>
       </w:pPr>
-      <w:hyperlink r:id="R08b5c4d46c024d85">
+      <w:hyperlink r:id="Rd7269c46fd34411d">
         <w:r>
           <w:rPr>
             <w:rStyle w:val="Hyperlink"/>
@@ -1744,11 +1744,151 @@
         <w:pStyle w:val="PARAGRAPH"/>
         <w:spacing w:after="0"/>
       </w:pPr>
-      <w:bookmarkStart w:name="Sts_ref_uapart19" w:id="14"/>
+      <w:bookmarkStart w:name="Sts_ref_uapart9" w:id="14"/>
+      <w:r>
+        <w:t xml:space="preserve">OPC 10000-9</w:t>
+      </w:r>
+      <w:bookmarkEnd w:id="14"/>
+      <w:r>
+        <w:t xml:space="preserve">, </w:t>
+      </w:r>
+      <w:r>
+        <w:rPr>
+          <w:i/>
+        </w:rPr>
+        <w:t xml:space="preserve">OPC Unified Architecture - Part 9: Alarms &amp; Conditions</w:t>
+      </w:r>
+    </w:p>
+    <w:p>
+      <w:pPr>
+        <w:pStyle w:val="PARAGRAPH"/>
+        <w:spacing w:before="60"/>
+        <w:ind w:left="340"/>
+      </w:pPr>
+      <w:hyperlink r:id="R3364dfd13c8e4958">
+        <w:r>
+          <w:rPr>
+            <w:rStyle w:val="Hyperlink"/>
+          </w:rPr>
+          <w:t xml:space="preserve">http://www.opcfoundation.org/documents/10000-9/</w:t>
+        </w:r>
+      </w:hyperlink>
+    </w:p>
+    <w:p>
+      <w:pPr>
+        <w:pStyle w:val="PARAGRAPH"/>
+        <w:spacing w:after="0"/>
+      </w:pPr>
+      <w:bookmarkStart w:name="Sts_ref_uapart10" w:id="15"/>
+      <w:r>
+        <w:t xml:space="preserve">OPC 10000-10</w:t>
+      </w:r>
+      <w:bookmarkEnd w:id="15"/>
+      <w:r>
+        <w:t xml:space="preserve">, </w:t>
+      </w:r>
+      <w:r>
+        <w:rPr>
+          <w:i/>
+        </w:rPr>
+        <w:t xml:space="preserve">OPC Unified Architecture - Part 10: Programs</w:t>
+      </w:r>
+    </w:p>
+    <w:p>
+      <w:pPr>
+        <w:pStyle w:val="PARAGRAPH"/>
+        <w:spacing w:before="60"/>
+        <w:ind w:left="340"/>
+      </w:pPr>
+      <w:hyperlink r:id="Rd363f4fe68b24f76">
+        <w:r>
+          <w:rPr>
+            <w:rStyle w:val="Hyperlink"/>
+          </w:rPr>
+          <w:t xml:space="preserve">http://www.opcfoundation.org/documents/10000-10/</w:t>
+        </w:r>
+      </w:hyperlink>
+    </w:p>
+    <w:p>
+      <w:pPr>
+        <w:pStyle w:val="PARAGRAPH"/>
+        <w:spacing w:after="0"/>
+      </w:pPr>
+      <w:bookmarkStart w:name="Sts_ref_uapart11" w:id="16"/>
+      <w:r>
+        <w:t xml:space="preserve">OPC 10000-11</w:t>
+      </w:r>
+      <w:bookmarkEnd w:id="16"/>
+      <w:r>
+        <w:t xml:space="preserve">, </w:t>
+      </w:r>
+      <w:r>
+        <w:rPr>
+          <w:i/>
+        </w:rPr>
+        <w:t xml:space="preserve">OPC Unified Architecture - Part 11: Historical Access</w:t>
+      </w:r>
+    </w:p>
+    <w:p>
+      <w:pPr>
+        <w:pStyle w:val="PARAGRAPH"/>
+        <w:spacing w:before="60"/>
+        <w:ind w:left="340"/>
+      </w:pPr>
+      <w:hyperlink r:id="Rf528f24c0f3d4f88">
+        <w:r>
+          <w:rPr>
+            <w:rStyle w:val="Hyperlink"/>
+          </w:rPr>
+          <w:t xml:space="preserve">http://www.opcfoundation.org/documents/10000-11/</w:t>
+        </w:r>
+      </w:hyperlink>
+    </w:p>
+    <w:p>
+      <w:pPr>
+        <w:pStyle w:val="PARAGRAPH"/>
+        <w:spacing w:after="0"/>
+      </w:pPr>
+      <w:bookmarkStart w:name="Sts_ref_uapart13" w:id="17"/>
+      <w:r>
+        <w:t xml:space="preserve">OPC 10000-13</w:t>
+      </w:r>
+      <w:bookmarkEnd w:id="17"/>
+      <w:r>
+        <w:t xml:space="preserve">, </w:t>
+      </w:r>
+      <w:r>
+        <w:rPr>
+          <w:i/>
+        </w:rPr>
+        <w:t xml:space="preserve">OPC Unified Architecture - Part 13: Aggregates</w:t>
+      </w:r>
+    </w:p>
+    <w:p>
+      <w:pPr>
+        <w:pStyle w:val="PARAGRAPH"/>
+        <w:spacing w:before="60"/>
+        <w:ind w:left="340"/>
+      </w:pPr>
+      <w:hyperlink r:id="Rb717ff56cdf94933">
+        <w:r>
+          <w:rPr>
+            <w:rStyle w:val="Hyperlink"/>
+          </w:rPr>
+          <w:t xml:space="preserve">http://www.opcfoundation.org/documents/10000-13/</w:t>
+        </w:r>
+      </w:hyperlink>
+    </w:p>
+    <w:p>
+      <w:pPr>
+        <w:pStyle w:val="PARAGRAPH"/>
+        <w:spacing w:after="0"/>
+      </w:pPr>
+      <w:bookmarkStart w:name="Sts_ref_uapart19" w:id="18"/>
       <w:r>
         <w:t xml:space="preserve">OPC 10000-19</w:t>
       </w:r>
-      <w:bookmarkEnd w:id="14"/>
+      <w:bookmarkEnd w:id="18"/>
       <w:r>
         <w:t xml:space="preserve">, </w:t>
       </w:r>
@@ -1765,7 +1905,7 @@
         <w:spacing w:before="60"/>
         <w:ind w:left="340"/>
       </w:pPr>
-      <w:hyperlink r:id="R36bfd2b8ea2344d9">
+      <w:hyperlink r:id="Rcff3ebc5800342c1">
         <w:r>
           <w:rPr>
             <w:rStyle w:val="Hyperlink"/>
@@ -1779,11 +1919,11 @@
         <w:pStyle w:val="PARAGRAPH"/>
         <w:spacing w:after="0"/>
       </w:pPr>
-      <w:bookmarkStart w:name="Sts_ref_uapart100" w:id="15"/>
+      <w:bookmarkStart w:name="Sts_ref_uapart100" w:id="19"/>
       <w:r>
         <w:t xml:space="preserve">OPC 10000-100</w:t>
       </w:r>
-      <w:bookmarkEnd w:id="15"/>
+      <w:bookmarkEnd w:id="19"/>
       <w:r>
         <w:t xml:space="preserve">, </w:t>
       </w:r>
@@ -1800,7 +1940,7 @@
         <w:spacing w:before="60"/>
         <w:ind w:left="340"/>
       </w:pPr>
-      <w:hyperlink r:id="Rafc3965e5776462d">
+      <w:hyperlink r:id="R2fc173864f4e4693">
         <w:r>
           <w:rPr>
             <w:rStyle w:val="Hyperlink"/>
@@ -1814,11 +1954,11 @@
         <w:pStyle w:val="PARAGRAPH"/>
         <w:spacing w:after="0"/>
       </w:pPr>
-      <w:bookmarkStart w:name="Sts_ref_rfc5280" w:id="16"/>
+      <w:bookmarkStart w:name="Sts_ref_rfc5280" w:id="20"/>
       <w:r>
         <w:t xml:space="preserve">IETF RFC 5280</w:t>
       </w:r>
-      <w:bookmarkEnd w:id="16"/>
+      <w:bookmarkEnd w:id="20"/>
       <w:r>
         <w:t xml:space="preserve">, </w:t>
       </w:r>
@@ -1835,7 +1975,7 @@
         <w:spacing w:before="60"/>
         <w:ind w:left="340"/>
       </w:pPr>
-      <w:hyperlink r:id="R665eeb1d596244b2">
+      <w:hyperlink r:id="R39e32215f56d4786">
         <w:r>
           <w:rPr>
             <w:rStyle w:val="Hyperlink"/>
@@ -1849,11 +1989,11 @@
         <w:pStyle w:val="PARAGRAPH"/>
         <w:spacing w:after="0"/>
       </w:pPr>
-      <w:bookmarkStart w:name="Sts_ref_tr88" w:id="17"/>
+      <w:bookmarkStart w:name="Sts_ref_tr88" w:id="21"/>
       <w:r>
         <w:t xml:space="preserve">ISA-TR88.00.02-2022</w:t>
       </w:r>
-      <w:bookmarkEnd w:id="17"/>
+      <w:bookmarkEnd w:id="21"/>
       <w:r>
         <w:t xml:space="preserve">, </w:t>
       </w:r>
@@ -1870,7 +2010,7 @@
         <w:spacing w:before="60"/>
         <w:ind w:left="340"/>
       </w:pPr>
-      <w:hyperlink r:id="R45136ae14b724830">
+      <w:hyperlink r:id="R095c55773da54b4b">
         <w:r>
           <w:rPr>
             <w:rStyle w:val="Hyperlink"/>
@@ -1884,11 +2024,11 @@
         <w:pStyle w:val="PARAGRAPH"/>
         <w:spacing w:after="0"/>
       </w:pPr>
-      <w:bookmarkStart w:name="Sts_ref_s88" w:id="18"/>
+      <w:bookmarkStart w:name="Sts_ref_s88" w:id="22"/>
       <w:r>
         <w:t xml:space="preserve">ANSI/ISA–88.01–1995</w:t>
       </w:r>
-      <w:bookmarkEnd w:id="18"/>
+      <w:bookmarkEnd w:id="22"/>
       <w:r>
         <w:t xml:space="preserve">, </w:t>
       </w:r>
@@ -1905,7 +2045,7 @@
         <w:spacing w:before="60"/>
         <w:ind w:left="340"/>
       </w:pPr>
-      <w:hyperlink r:id="Rabc9e17333e24510">
+      <w:hyperlink r:id="R483a19e402fe40e6">
         <w:r>
           <w:rPr>
             <w:rStyle w:val="Hyperlink"/>
@@ -1919,11 +2059,11 @@
         <w:pStyle w:val="PARAGRAPH"/>
         <w:spacing w:after="0"/>
       </w:pPr>
-      <w:bookmarkStart w:name="Sts_ref_opc30000" w:id="19"/>
+      <w:bookmarkStart w:name="Sts_ref_opc30000" w:id="23"/>
       <w:r>
         <w:t xml:space="preserve">OPC 30000</w:t>
       </w:r>
-      <w:bookmarkEnd w:id="19"/>
+      <w:bookmarkEnd w:id="23"/>
       <w:r>
         <w:t xml:space="preserve">, </w:t>
       </w:r>
@@ -1940,7 +2080,7 @@
         <w:spacing w:before="60"/>
         <w:ind w:left="340"/>
       </w:pPr>
-      <w:hyperlink r:id="Raf0af82a94524140">
+      <w:hyperlink r:id="R20ed0db71c7b46ea">
         <w:r>
           <w:rPr>
             <w:rStyle w:val="Hyperlink"/>
@@ -1953,23 +2093,23 @@
       <w:pPr>
         <w:pStyle w:val="Heading1"/>
       </w:pPr>
-      <w:bookmarkStart w:name="Sts_sec_3" w:id="20"/>
+      <w:bookmarkStart w:name="Sts_sec_3" w:id="24"/>
       <w:r>
         <w:rPr/>
         <w:t xml:space="preserve">Terms, definitions and abbreviations</w:t>
       </w:r>
-      <w:bookmarkEnd w:id="20"/>
+      <w:bookmarkEnd w:id="24"/>
     </w:p>
     <w:p>
       <w:pPr>
         <w:pStyle w:val="Heading2"/>
       </w:pPr>
-      <w:bookmarkStart w:name="Sts_sec_3_1" w:id="21"/>
+      <w:bookmarkStart w:name="Sts_sec_3_1" w:id="25"/>
       <w:r>
         <w:rPr/>
         <w:t xml:space="preserve">Overview</w:t>
       </w:r>
-      <w:bookmarkEnd w:id="21"/>
+      <w:bookmarkEnd w:id="25"/>
     </w:p>
     <w:p>
       <w:pPr>
@@ -2131,6 +2271,86 @@
       <w:r>
         <w:rPr/>
         <w:t xml:space="preserve">OPC 10000-8</w:t>
+      </w:r>
+      <w:r>
+        <w:fldChar w:fldCharType="end"/>
+      </w:r>
+      <w:r>
+        <w:rPr/>
+        <w:t xml:space="preserve">, </w:t>
+      </w:r>
+      <w:r>
+        <w:fldChar w:fldCharType="begin"/>
+      </w:r>
+      <w:r>
+        <w:instrText xml:space="preserve"> REF Sts_ref_uapart9 \h \* MERGEFORMAT </w:instrText>
+      </w:r>
+      <w:r>
+        <w:fldChar w:fldCharType="separate"/>
+      </w:r>
+      <w:r>
+        <w:rPr/>
+        <w:t xml:space="preserve">OPC 10000-9</w:t>
+      </w:r>
+      <w:r>
+        <w:fldChar w:fldCharType="end"/>
+      </w:r>
+      <w:r>
+        <w:rPr/>
+        <w:t xml:space="preserve">, </w:t>
+      </w:r>
+      <w:r>
+        <w:fldChar w:fldCharType="begin"/>
+      </w:r>
+      <w:r>
+        <w:instrText xml:space="preserve"> REF Sts_ref_uapart10 \h \* MERGEFORMAT </w:instrText>
+      </w:r>
+      <w:r>
+        <w:fldChar w:fldCharType="separate"/>
+      </w:r>
+      <w:r>
+        <w:rPr/>
+        <w:t xml:space="preserve">OPC 10000-10</w:t>
+      </w:r>
+      <w:r>
+        <w:fldChar w:fldCharType="end"/>
+      </w:r>
+      <w:r>
+        <w:rPr/>
+        <w:t xml:space="preserve">, </w:t>
+      </w:r>
+      <w:r>
+        <w:fldChar w:fldCharType="begin"/>
+      </w:r>
+      <w:r>
+        <w:instrText xml:space="preserve"> REF Sts_ref_uapart11 \h \* MERGEFORMAT </w:instrText>
+      </w:r>
+      <w:r>
+        <w:fldChar w:fldCharType="separate"/>
+      </w:r>
+      <w:r>
+        <w:rPr/>
+        <w:t xml:space="preserve">OPC 10000-11</w:t>
+      </w:r>
+      <w:r>
+        <w:fldChar w:fldCharType="end"/>
+      </w:r>
+      <w:r>
+        <w:rPr/>
+        <w:t xml:space="preserve">, </w:t>
+      </w:r>
+      <w:r>
+        <w:fldChar w:fldCharType="begin"/>
+      </w:r>
+      <w:r>
+        <w:instrText xml:space="preserve"> REF Sts_ref_uapart13 \h \* MERGEFORMAT </w:instrText>
+      </w:r>
+      <w:r>
+        <w:fldChar w:fldCharType="separate"/>
+      </w:r>
+      <w:r>
+        <w:rPr/>
+        <w:t xml:space="preserve">OPC 10000-13</w:t>
       </w:r>
       <w:r>
         <w:fldChar w:fldCharType="end"/>
@@ -2289,12 +2509,12 @@
       <w:pPr>
         <w:pStyle w:val="Heading2"/>
       </w:pPr>
-      <w:bookmarkStart w:name="Sts_sec_3_2" w:id="22"/>
+      <w:bookmarkStart w:name="Sts_sec_3_2" w:id="26"/>
       <w:r>
         <w:rPr/>
         <w:t xml:space="preserve">Terms and definitions</w:t>
       </w:r>
-      <w:bookmarkEnd w:id="22"/>
+      <w:bookmarkEnd w:id="26"/>
     </w:p>
     <w:p>
       <w:pPr>
@@ -2477,12 +2697,12 @@
       <w:pPr>
         <w:pStyle w:val="Heading2"/>
       </w:pPr>
-      <w:bookmarkStart w:name="Sts_sec_3_3" w:id="23"/>
+      <w:bookmarkStart w:name="Sts_sec_3_3" w:id="27"/>
       <w:r>
         <w:rPr/>
         <w:t xml:space="preserve">Abbreviations</w:t>
       </w:r>
-      <w:bookmarkEnd w:id="23"/>
+      <w:bookmarkEnd w:id="27"/>
     </w:p>
     <w:tbl>
       <w:tblPr>
@@ -2856,23 +3076,23 @@
       <w:pPr>
         <w:pStyle w:val="Heading1"/>
       </w:pPr>
-      <w:bookmarkStart w:name="Sts_sec_4" w:id="24"/>
+      <w:bookmarkStart w:name="Sts_sec_4" w:id="28"/>
       <w:r>
         <w:rPr/>
         <w:t xml:space="preserve">Concept</w:t>
       </w:r>
-      <w:bookmarkEnd w:id="24"/>
+      <w:bookmarkEnd w:id="28"/>
     </w:p>
     <w:p>
       <w:pPr>
         <w:pStyle w:val="Heading2"/>
       </w:pPr>
-      <w:bookmarkStart w:name="Sts_sec_4_1" w:id="25"/>
+      <w:bookmarkStart w:name="Sts_sec_4_1" w:id="29"/>
       <w:r>
         <w:rPr/>
         <w:t xml:space="preserve">Overview</w:t>
       </w:r>
-      <w:bookmarkEnd w:id="25"/>
+      <w:bookmarkEnd w:id="29"/>
     </w:p>
     <w:p>
       <w:pPr>
@@ -2880,7 +3100,27 @@
       </w:pPr>
       <w:r>
         <w:rPr/>
-        <w:t xml:space="preserve">When the &lt;xref ref-type="other" rid="ref_isapart1"&gt;ANSI/ISA-88.01-1995: &lt;/xref&gt; standard was applied to applications across a plant, there was a need to align the terminologies, models and key definitions between different process types: continuous, batch, and discrete processes. Discrete processes involve machines found in the packaging, converting, and material handling applications. The operation of these machines is typically defined by the OEM, system integrator, end user, or is industry specific.</w:t>
+        <w:t xml:space="preserve">When the </w:t>
+      </w:r>
+      <w:r>
+        <w:fldChar w:fldCharType="begin"/>
+      </w:r>
+      <w:r>
+        <w:instrText xml:space="preserve"> REF Sts_ref_s88 \h \* MERGEFORMAT </w:instrText>
+      </w:r>
+      <w:r>
+        <w:fldChar w:fldCharType="separate"/>
+      </w:r>
+      <w:r>
+        <w:rPr/>
+        <w:t xml:space="preserve">ANSI/ISA-88.01-1995</w:t>
+      </w:r>
+      <w:r>
+        <w:fldChar w:fldCharType="end"/>
+      </w:r>
+      <w:r>
+        <w:rPr/>
+        <w:t xml:space="preserve"> standard was applied to applications across a plant, there was a need to align the terminologies, models and key definitions between different process types: continuous, batch, and discrete processes. Discrete processes involve machines found in the packaging, converting, and material handling applications. The operation of these machines is typically defined by the OEM, system integrator, end user, or is industry specific.</w:t>
       </w:r>
     </w:p>
     <w:p>
@@ -2889,7 +3129,27 @@
       </w:pPr>
       <w:r>
         <w:rPr/>
-        <w:t xml:space="preserve">OMAC (Organization for Machine Automation and Control) created a task group with members from technology providers, OEMs, system integrators, and end users to generate the PackML guidelines as a method to show how the &lt;xref ref-type="other" rid="ref_isapart1"&gt;ANSI/ISA-88.01-1995: &lt;/xref&gt; concepts could be extended into packaging machinery and other types of machines typically used in assembly lines, filling lines, and other production lines.</w:t>
+        <w:t xml:space="preserve">OMAC (Organization for Machine Automation and Control) created a task group with members from technology providers, OEMs, system integrators, and end users to generate the PackML guidelines as a method to show how the </w:t>
+      </w:r>
+      <w:r>
+        <w:fldChar w:fldCharType="begin"/>
+      </w:r>
+      <w:r>
+        <w:instrText xml:space="preserve"> REF Sts_ref_s88 \h \* MERGEFORMAT </w:instrText>
+      </w:r>
+      <w:r>
+        <w:fldChar w:fldCharType="separate"/>
+      </w:r>
+      <w:r>
+        <w:rPr/>
+        <w:t xml:space="preserve">ANSI/ISA-88.01-1995</w:t>
+      </w:r>
+      <w:r>
+        <w:fldChar w:fldCharType="end"/>
+      </w:r>
+      <w:r>
+        <w:rPr/>
+        <w:t xml:space="preserve"> concepts could be extended into packaging machinery and other types of machines typically used in assembly lines, filling lines, and other production lines.</w:t>
       </w:r>
     </w:p>
     <w:p>
@@ -2979,7 +3239,67 @@
       </w:pPr>
       <w:r>
         <w:rPr/>
-        <w:t xml:space="preserve">If automated machinery is modelled in an &lt;xref ref-type="other" rid="ref_isapart1"&gt;ANSI/ISA-88.01-1995: &lt;/xref&gt; physical hierarchy, the example mapping shown in &lt;xref ref-type="fig" rid="fig_1_automated-machines-using-the-isa-88-models"&gt;Figure 1&lt;/xref&gt; is possible, from &lt;xref ref-type="other" rid="ref_isapart2"&gt;ISA-TR88.00.02-2015&lt;/xref&gt;. The example in this document will assume that a machine can represent the unit level in the ISA88 hierarchy.</w:t>
+        <w:t xml:space="preserve">If automated machinery is modelled in an </w:t>
+      </w:r>
+      <w:r>
+        <w:fldChar w:fldCharType="begin"/>
+      </w:r>
+      <w:r>
+        <w:instrText xml:space="preserve"> REF Sts_ref_s88 \h \* MERGEFORMAT </w:instrText>
+      </w:r>
+      <w:r>
+        <w:fldChar w:fldCharType="separate"/>
+      </w:r>
+      <w:r>
+        <w:rPr/>
+        <w:t xml:space="preserve">ANSI/ISA-88.01-1995</w:t>
+      </w:r>
+      <w:r>
+        <w:fldChar w:fldCharType="end"/>
+      </w:r>
+      <w:r>
+        <w:rPr/>
+        <w:t xml:space="preserve"> physical hierarchy, the example mapping shown in </w:t>
+      </w:r>
+      <w:r>
+        <w:fldChar w:fldCharType="begin"/>
+      </w:r>
+      <w:r>
+        <w:instrText xml:space="preserve"> REF Sts_fig_1 \h \* MERGEFORMAT </w:instrText>
+      </w:r>
+      <w:r>
+        <w:fldChar w:fldCharType="separate"/>
+      </w:r>
+      <w:r>
+        <w:rPr/>
+        <w:t xml:space="preserve">Figure 1</w:t>
+      </w:r>
+      <w:r>
+        <w:fldChar w:fldCharType="end"/>
+      </w:r>
+      <w:r>
+        <w:rPr/>
+        <w:t xml:space="preserve"> is possible, from </w:t>
+      </w:r>
+      <w:r>
+        <w:fldChar w:fldCharType="begin"/>
+      </w:r>
+      <w:r>
+        <w:instrText xml:space="preserve"> REF Sts_ref_tr88 \h \* MERGEFORMAT </w:instrText>
+      </w:r>
+      <w:r>
+        <w:fldChar w:fldCharType="separate"/>
+      </w:r>
+      <w:r>
+        <w:rPr/>
+        <w:t xml:space="preserve">ISA-TR88.00.02-2022</w:t>
+      </w:r>
+      <w:r>
+        <w:fldChar w:fldCharType="end"/>
+      </w:r>
+      <w:r>
+        <w:rPr/>
+        <w:t xml:space="preserve">. The example in this document will assume that a machine can represent the unit level in the ISA88 hierarchy.</w:t>
       </w:r>
     </w:p>
     <w:p>
@@ -3003,7 +3323,7 @@
                     <pic:cNvPicPr/>
                   </pic:nvPicPr>
                   <pic:blipFill>
-                    <a:blip r:embed="Re3174ccf01d5477c"/>
+                    <a:blip r:embed="R1c32c1432f954897"/>
                     <a:stretch>
                       <a:fillRect/>
                     </a:stretch>
@@ -3028,7 +3348,7 @@
       <w:pPr>
         <w:pStyle w:val="FIGURE-title"/>
       </w:pPr>
-      <w:bookmarkStart w:name="Sts_fig_1" w:id="26"/>
+      <w:bookmarkStart w:name="Sts_fig_1" w:id="30"/>
       <w:r>
         <w:t xml:space="preserve">Figure </w:t>
       </w:r>
@@ -3048,7 +3368,7 @@
       <w:r>
         <w:fldChar w:fldCharType="end"/>
       </w:r>
-      <w:bookmarkEnd w:id="26"/>
+      <w:bookmarkEnd w:id="30"/>
       <w:r>
         <w:t xml:space="preserve"> – </w:t>
       </w:r>
@@ -3070,23 +3390,23 @@
       <w:pPr>
         <w:pStyle w:val="Heading2"/>
       </w:pPr>
-      <w:bookmarkStart w:name="Sts_sec_4_2" w:id="27"/>
+      <w:bookmarkStart w:name="Sts_sec_4_2" w:id="31"/>
       <w:r>
         <w:rPr/>
         <w:t xml:space="preserve">PackML Overview</w:t>
       </w:r>
-      <w:bookmarkEnd w:id="27"/>
+      <w:bookmarkEnd w:id="31"/>
     </w:p>
     <w:p>
       <w:pPr>
         <w:pStyle w:val="Heading3"/>
       </w:pPr>
-      <w:bookmarkStart w:name="Sts_sec_4_2_1" w:id="28"/>
+      <w:bookmarkStart w:name="Sts_sec_4_2_1" w:id="32"/>
       <w:r>
         <w:rPr/>
         <w:t xml:space="preserve">Introduction</w:t>
       </w:r>
-      <w:bookmarkEnd w:id="28"/>
+      <w:bookmarkEnd w:id="32"/>
     </w:p>
     <w:p>
       <w:pPr>
@@ -3101,12 +3421,12 @@
       <w:pPr>
         <w:pStyle w:val="Heading3"/>
       </w:pPr>
-      <w:bookmarkStart w:name="Sts_sec_4_2_2" w:id="29"/>
+      <w:bookmarkStart w:name="Sts_sec_4_2_2" w:id="33"/>
       <w:r>
         <w:rPr/>
         <w:t xml:space="preserve">Why PackML?</w:t>
       </w:r>
-      <w:bookmarkEnd w:id="29"/>
+      <w:bookmarkEnd w:id="33"/>
     </w:p>
     <w:p>
       <w:pPr>
@@ -3184,12 +3504,12 @@
       <w:pPr>
         <w:pStyle w:val="Heading3"/>
       </w:pPr>
-      <w:bookmarkStart w:name="Sts_sec_4_2_3" w:id="30"/>
+      <w:bookmarkStart w:name="Sts_sec_4_2_3" w:id="34"/>
       <w:r>
         <w:rPr/>
         <w:t xml:space="preserve">PackML Elements</w:t>
       </w:r>
-      <w:bookmarkEnd w:id="30"/>
+      <w:bookmarkEnd w:id="34"/>
     </w:p>
     <w:p>
       <w:pPr>
@@ -3240,12 +3560,12 @@
       <w:pPr>
         <w:pStyle w:val="Heading3"/>
       </w:pPr>
-      <w:bookmarkStart w:name="Sts_sec_4_2_4" w:id="31"/>
+      <w:bookmarkStart w:name="Sts_sec_4_2_4" w:id="35"/>
       <w:r>
         <w:rPr/>
         <w:t xml:space="preserve">Standard Modes</w:t>
       </w:r>
-      <w:bookmarkEnd w:id="31"/>
+      <w:bookmarkEnd w:id="35"/>
     </w:p>
     <w:p>
       <w:pPr>
@@ -3253,7 +3573,27 @@
       </w:pPr>
       <w:r>
         <w:rPr/>
-        <w:t xml:space="preserve">A Unit can be in different modes, for example Producing, Maintenance, Manual, Clean, Calibration, etc. A Unit control mode is an ordered subset of states and commands that determines the strategy carried out by the Unit process, as shown in &lt;xref ref-type="fig" rid="fig_2_mode-management-of-states"&gt;Figure 2&lt;/xref&gt;. For example, the producing mode is used when the unit is producing, a manual mode may be used when the unit is being manually controlled for troubleshooting.</w:t>
+        <w:t xml:space="preserve">A Unit can be in different modes, for example Producing, Maintenance, Manual, Clean, Calibration, etc. A Unit control mode is an ordered subset of states and commands that determines the strategy carried out by the Unit process, as shown in </w:t>
+      </w:r>
+      <w:r>
+        <w:fldChar w:fldCharType="begin"/>
+      </w:r>
+      <w:r>
+        <w:instrText xml:space="preserve"> REF Sts_fig_2 \h \* MERGEFORMAT </w:instrText>
+      </w:r>
+      <w:r>
+        <w:fldChar w:fldCharType="separate"/>
+      </w:r>
+      <w:r>
+        <w:rPr/>
+        <w:t xml:space="preserve">Figure 2</w:t>
+      </w:r>
+      <w:r>
+        <w:fldChar w:fldCharType="end"/>
+      </w:r>
+      <w:r>
+        <w:rPr/>
+        <w:t xml:space="preserve">. For example, the producing mode is used when the unit is producing, a manual mode may be used when the unit is being manually controlled for troubleshooting.</w:t>
       </w:r>
     </w:p>
     <w:p>
@@ -3286,7 +3626,7 @@
                     <pic:cNvPicPr/>
                   </pic:nvPicPr>
                   <pic:blipFill>
-                    <a:blip r:embed="Ra3ec4e4a69074e25"/>
+                    <a:blip r:embed="R8cea0bae4c8f4bb5"/>
                     <a:stretch>
                       <a:fillRect/>
                     </a:stretch>
@@ -3311,7 +3651,7 @@
       <w:pPr>
         <w:pStyle w:val="FIGURE-title"/>
       </w:pPr>
-      <w:bookmarkStart w:name="Sts_fig_2" w:id="32"/>
+      <w:bookmarkStart w:name="Sts_fig_2" w:id="36"/>
       <w:r>
         <w:t xml:space="preserve">Figure </w:t>
       </w:r>
@@ -3331,7 +3671,7 @@
       <w:r>
         <w:fldChar w:fldCharType="end"/>
       </w:r>
-      <w:bookmarkEnd w:id="32"/>
+      <w:bookmarkEnd w:id="36"/>
       <w:r>
         <w:t xml:space="preserve"> – </w:t>
       </w:r>
@@ -3353,12 +3693,12 @@
       <w:pPr>
         <w:pStyle w:val="Heading3"/>
       </w:pPr>
-      <w:bookmarkStart w:name="Sts_sec_4_2_5" w:id="33"/>
+      <w:bookmarkStart w:name="Sts_sec_4_2_5" w:id="37"/>
       <w:r>
         <w:rPr/>
         <w:t xml:space="preserve">Standard States</w:t>
       </w:r>
-      <w:bookmarkEnd w:id="33"/>
+      <w:bookmarkEnd w:id="37"/>
     </w:p>
     <w:p>
       <w:pPr>
@@ -3366,19 +3706,39 @@
       </w:pPr>
       <w:r>
         <w:rPr/>
-        <w:t xml:space="preserve">PackML Interface State Model is used to visualize and control the state of a unit/machine. The PackML Interface State Model is a state model that represents the Unit/Machine State in a standardized manner. The interface description is based on a state model, a state description and related control commands. For additional information see &lt;xref ref-type="other" rid="ref_isapart2"&gt;ISA-TR88.00.02-2015&lt;/xref&gt;.</w:t>
+        <w:t xml:space="preserve">PackML Interface State Model is used to visualize and control the state of a unit/machine. The PackML Interface State Model is a state model that represents the Unit/Machine State in a standardized manner. The interface description is based on a state model, a state description and related control commands. For additional information see </w:t>
+      </w:r>
+      <w:r>
+        <w:fldChar w:fldCharType="begin"/>
+      </w:r>
+      <w:r>
+        <w:instrText xml:space="preserve"> REF Sts_ref_tr88 \h \* MERGEFORMAT </w:instrText>
+      </w:r>
+      <w:r>
+        <w:fldChar w:fldCharType="separate"/>
+      </w:r>
+      <w:r>
+        <w:rPr/>
+        <w:t xml:space="preserve">ISA-TR88.00.02-2022</w:t>
+      </w:r>
+      <w:r>
+        <w:fldChar w:fldCharType="end"/>
+      </w:r>
+      <w:r>
+        <w:rPr/>
+        <w:t xml:space="preserve">.</w:t>
       </w:r>
     </w:p>
     <w:p>
       <w:pPr>
         <w:pStyle w:val="Heading3"/>
       </w:pPr>
-      <w:bookmarkStart w:name="Sts_sec_4_2_6" w:id="34"/>
+      <w:bookmarkStart w:name="Sts_sec_4_2_6" w:id="38"/>
       <w:r>
         <w:rPr/>
         <w:t xml:space="preserve">Standard Tag Names</w:t>
       </w:r>
-      <w:bookmarkEnd w:id="34"/>
+      <w:bookmarkEnd w:id="38"/>
     </w:p>
     <w:p>
       <w:pPr>
@@ -3393,23 +3753,23 @@
       <w:pPr>
         <w:pStyle w:val="Heading3"/>
       </w:pPr>
-      <w:bookmarkStart w:name="Sts_sec_4_2_7" w:id="35"/>
+      <w:bookmarkStart w:name="Sts_sec_4_2_7" w:id="39"/>
       <w:r>
         <w:rPr/>
         <w:t xml:space="preserve">PackML Object Model</w:t>
       </w:r>
-      <w:bookmarkEnd w:id="35"/>
+      <w:bookmarkEnd w:id="39"/>
     </w:p>
     <w:p>
       <w:pPr>
         <w:pStyle w:val="Heading4"/>
       </w:pPr>
-      <w:bookmarkStart w:name="Sts_sec_4_2_7_1" w:id="36"/>
+      <w:bookmarkStart w:name="Sts_sec_4_2_7_1" w:id="40"/>
       <w:r>
         <w:rPr/>
         <w:t xml:space="preserve">Overview</w:t>
       </w:r>
-      <w:bookmarkEnd w:id="36"/>
+      <w:bookmarkEnd w:id="40"/>
     </w:p>
     <w:p>
       <w:pPr>
@@ -3424,12 +3784,12 @@
       <w:pPr>
         <w:pStyle w:val="Heading4"/>
       </w:pPr>
-      <w:bookmarkStart w:name="Sts_sec_4_2_7_2" w:id="37"/>
+      <w:bookmarkStart w:name="Sts_sec_4_2_7_2" w:id="41"/>
       <w:r>
         <w:rPr/>
         <w:t xml:space="preserve">Command Tags</w:t>
       </w:r>
-      <w:bookmarkEnd w:id="37"/>
+      <w:bookmarkEnd w:id="41"/>
     </w:p>
     <w:p>
       <w:pPr>
@@ -3437,7 +3797,27 @@
       </w:pPr>
       <w:r>
         <w:rPr/>
-        <w:t xml:space="preserve">Command tags allow interaction with the state machine and general functionality of the server.  Command tags include changing units, changing state machines. For additional detail see &lt;xref ref-type="other" rid="ref_isapart2"&gt;ISA-TR88.00.02-2015&lt;/xref&gt;. In OPC UA command tags are generally mapped to </w:t>
+        <w:t xml:space="preserve">Command tags allow interaction with the state machine and general functionality of the server.  Command tags include changing units, changing state machines. For additional detail see </w:t>
+      </w:r>
+      <w:r>
+        <w:fldChar w:fldCharType="begin"/>
+      </w:r>
+      <w:r>
+        <w:instrText xml:space="preserve"> REF Sts_ref_tr88 \h \* MERGEFORMAT </w:instrText>
+      </w:r>
+      <w:r>
+        <w:fldChar w:fldCharType="separate"/>
+      </w:r>
+      <w:r>
+        <w:rPr/>
+        <w:t xml:space="preserve">ISA-TR88.00.02-2022</w:t>
+      </w:r>
+      <w:r>
+        <w:fldChar w:fldCharType="end"/>
+      </w:r>
+      <w:r>
+        <w:rPr/>
+        <w:t xml:space="preserve">. In OPC UA command tags are generally mapped to </w:t>
       </w:r>
       <w:r>
         <w:rPr>
@@ -3454,12 +3834,12 @@
       <w:pPr>
         <w:pStyle w:val="Heading4"/>
       </w:pPr>
-      <w:bookmarkStart w:name="Sts_sec_4_2_7_3" w:id="38"/>
+      <w:bookmarkStart w:name="Sts_sec_4_2_7_3" w:id="42"/>
       <w:r>
         <w:rPr/>
         <w:t xml:space="preserve">Status Tags</w:t>
       </w:r>
-      <w:bookmarkEnd w:id="38"/>
+      <w:bookmarkEnd w:id="42"/>
     </w:p>
     <w:p>
       <w:pPr>
@@ -3467,19 +3847,39 @@
       </w:pPr>
       <w:r>
         <w:rPr/>
-        <w:t xml:space="preserve">Status tags provide information about the state of the machine or device. This includes feedback from the commands issued and the general status. For additional detail see &lt;xref ref-type="other" rid="ref_isapart2"&gt;ISA-TR88.00.02-2015&lt;/xref&gt;.</w:t>
+        <w:t xml:space="preserve">Status tags provide information about the state of the machine or device. This includes feedback from the commands issued and the general status. For additional detail see </w:t>
+      </w:r>
+      <w:r>
+        <w:fldChar w:fldCharType="begin"/>
+      </w:r>
+      <w:r>
+        <w:instrText xml:space="preserve"> REF Sts_ref_tr88 \h \* MERGEFORMAT </w:instrText>
+      </w:r>
+      <w:r>
+        <w:fldChar w:fldCharType="separate"/>
+      </w:r>
+      <w:r>
+        <w:rPr/>
+        <w:t xml:space="preserve">ISA-TR88.00.02-2022</w:t>
+      </w:r>
+      <w:r>
+        <w:fldChar w:fldCharType="end"/>
+      </w:r>
+      <w:r>
+        <w:rPr/>
+        <w:t xml:space="preserve">.</w:t>
       </w:r>
     </w:p>
     <w:p>
       <w:pPr>
         <w:pStyle w:val="Heading4"/>
       </w:pPr>
-      <w:bookmarkStart w:name="Sts_sec_4_2_7_4" w:id="39"/>
+      <w:bookmarkStart w:name="Sts_sec_4_2_7_4" w:id="43"/>
       <w:r>
         <w:rPr/>
         <w:t xml:space="preserve">Admin Tags</w:t>
       </w:r>
-      <w:bookmarkEnd w:id="39"/>
+      <w:bookmarkEnd w:id="43"/>
     </w:p>
     <w:p>
       <w:pPr>
@@ -3487,30 +3887,50 @@
       </w:pPr>
       <w:r>
         <w:rPr/>
-        <w:t xml:space="preserve">Admin tags provide information about alarming in the machines or device. This include Alarm history and some summary statistics about the machine or device.  For additional detail see &lt;xref ref-type="other" rid="ref_isapart2"&gt;ISA-TR88.00.02-2015&lt;/xref&gt;.</w:t>
+        <w:t xml:space="preserve">Admin tags provide information about alarming in the machines or device. This include Alarm history and some summary statistics about the machine or device.  For additional detail see </w:t>
+      </w:r>
+      <w:r>
+        <w:fldChar w:fldCharType="begin"/>
+      </w:r>
+      <w:r>
+        <w:instrText xml:space="preserve"> REF Sts_ref_tr88 \h \* MERGEFORMAT </w:instrText>
+      </w:r>
+      <w:r>
+        <w:fldChar w:fldCharType="separate"/>
+      </w:r>
+      <w:r>
+        <w:rPr/>
+        <w:t xml:space="preserve">ISA-TR88.00.02-2022</w:t>
+      </w:r>
+      <w:r>
+        <w:fldChar w:fldCharType="end"/>
+      </w:r>
+      <w:r>
+        <w:rPr/>
+        <w:t xml:space="preserve">.</w:t>
       </w:r>
     </w:p>
     <w:p>
       <w:pPr>
         <w:pStyle w:val="Heading3"/>
       </w:pPr>
-      <w:bookmarkStart w:name="Sts_sec_4_2_8" w:id="40"/>
+      <w:bookmarkStart w:name="Sts_sec_4_2_8" w:id="44"/>
       <w:r>
         <w:rPr/>
         <w:t xml:space="preserve">Standard Tag Values</w:t>
       </w:r>
-      <w:bookmarkEnd w:id="40"/>
+      <w:bookmarkEnd w:id="44"/>
     </w:p>
     <w:p>
       <w:pPr>
         <w:pStyle w:val="Heading4"/>
       </w:pPr>
-      <w:bookmarkStart w:name="Sts_sec_4_2_8_1" w:id="41"/>
+      <w:bookmarkStart w:name="Sts_sec_4_2_8_1" w:id="45"/>
       <w:r>
         <w:rPr/>
         <w:t xml:space="preserve">Overview</w:t>
       </w:r>
-      <w:bookmarkEnd w:id="41"/>
+      <w:bookmarkEnd w:id="45"/>
     </w:p>
     <w:p>
       <w:pPr>
@@ -3525,12 +3945,12 @@
       <w:pPr>
         <w:pStyle w:val="Heading4"/>
       </w:pPr>
-      <w:bookmarkStart w:name="Sts_sec_4_2_8_2" w:id="42"/>
+      <w:bookmarkStart w:name="Sts_sec_4_2_8_2" w:id="46"/>
       <w:r>
         <w:rPr/>
         <w:t xml:space="preserve">Machine Speed</w:t>
       </w:r>
-      <w:bookmarkEnd w:id="42"/>
+      <w:bookmarkEnd w:id="46"/>
     </w:p>
     <w:p>
       <w:pPr>
@@ -3818,12 +4238,12 @@
       <w:pPr>
         <w:pStyle w:val="Heading4"/>
       </w:pPr>
-      <w:bookmarkStart w:name="Sts_sec_4_2_8_3" w:id="43"/>
+      <w:bookmarkStart w:name="Sts_sec_4_2_8_3" w:id="47"/>
       <w:r>
         <w:rPr/>
         <w:t xml:space="preserve">Material Interlock</w:t>
       </w:r>
-      <w:bookmarkEnd w:id="43"/>
+      <w:bookmarkEnd w:id="47"/>
     </w:p>
     <w:p>
       <w:pPr>
@@ -4158,12 +4578,12 @@
       <w:pPr>
         <w:pStyle w:val="Heading4"/>
       </w:pPr>
-      <w:bookmarkStart w:name="Sts_sec_4_2_8_4" w:id="44"/>
+      <w:bookmarkStart w:name="Sts_sec_4_2_8_4" w:id="48"/>
       <w:r>
         <w:rPr/>
         <w:t xml:space="preserve">Remote Interface Structure</w:t>
       </w:r>
-      <w:bookmarkEnd w:id="44"/>
+      <w:bookmarkEnd w:id="48"/>
     </w:p>
     <w:p>
       <w:pPr>
@@ -4196,23 +4616,23 @@
       <w:pPr>
         <w:pStyle w:val="Heading2"/>
       </w:pPr>
-      <w:bookmarkStart w:name="Sts_sec_4_3" w:id="45"/>
+      <w:bookmarkStart w:name="Sts_sec_4_3" w:id="49"/>
       <w:r>
         <w:rPr/>
         <w:t xml:space="preserve">OPC UA Overview</w:t>
       </w:r>
-      <w:bookmarkEnd w:id="45"/>
+      <w:bookmarkEnd w:id="49"/>
     </w:p>
     <w:p>
       <w:pPr>
         <w:pStyle w:val="Heading3"/>
       </w:pPr>
-      <w:bookmarkStart w:name="Sts_sec_4_3_1" w:id="46"/>
+      <w:bookmarkStart w:name="Sts_sec_4_3_1" w:id="50"/>
       <w:r>
         <w:rPr/>
         <w:t xml:space="preserve">Introduction</w:t>
       </w:r>
-      <w:bookmarkEnd w:id="46"/>
+      <w:bookmarkEnd w:id="50"/>
     </w:p>
     <w:p>
       <w:pPr>
@@ -4227,12 +4647,12 @@
       <w:pPr>
         <w:pStyle w:val="Heading3"/>
       </w:pPr>
-      <w:bookmarkStart w:name="Sts_sec_4_3_2" w:id="47"/>
+      <w:bookmarkStart w:name="Sts_sec_4_3_2" w:id="51"/>
       <w:r>
         <w:rPr/>
         <w:t xml:space="preserve">What is OPC UA?</w:t>
       </w:r>
-      <w:bookmarkEnd w:id="47"/>
+      <w:bookmarkEnd w:id="51"/>
     </w:p>
     <w:p>
       <w:pPr>
@@ -4249,7 +4669,7 @@
       </w:pPr>
       <w:r>
         <w:rPr/>
-        <w:t xml:space="preserve">A state of art security model (see &lt;xref ref-type="other" rid="ref_uapart2"&gt;</w:t>
+        <w:t xml:space="preserve">A state of art security model (see </w:t>
       </w:r>
       <w:r>
         <w:fldChar w:fldCharType="begin"/>
@@ -4269,7 +4689,7 @@
       </w:r>
       <w:r>
         <w:rPr/>
-        <w:t xml:space="preserve">&lt;/xref&gt;).</w:t>
+        <w:t xml:space="preserve">).</w:t>
       </w:r>
     </w:p>
     <w:p>
@@ -4305,7 +4725,7 @@
       </w:pPr>
       <w:r>
         <w:rPr/>
-        <w:t xml:space="preserve">The OPC UA model is scalable from small devices to ERP systems. OPC UA devices process information locally and then provide that data in a consistent format to any application requesting data - ERP, MES, PMS, Maintenance Systems, HMI, Smartphone or a standard Browser, for examples. For a more complete overview see &lt;xref ref-type="other" rid="ref_uapart1"&gt;</w:t>
+        <w:t xml:space="preserve">The OPC UA model is scalable from small devices to ERP systems. OPC UA devices process information locally and then provide that data in a consistent format to any application requesting data - ERP, MES, PMS, Maintenance Systems, HMI, Smartphone or a standard Browser, for examples. For a more complete overview see </w:t>
       </w:r>
       <w:r>
         <w:fldChar w:fldCharType="begin"/>
@@ -4325,19 +4745,19 @@
       </w:r>
       <w:r>
         <w:rPr/>
-        <w:t xml:space="preserve">&lt;/xref&gt;.</w:t>
+        <w:t xml:space="preserve">.</w:t>
       </w:r>
     </w:p>
     <w:p>
       <w:pPr>
         <w:pStyle w:val="Heading3"/>
       </w:pPr>
-      <w:bookmarkStart w:name="Sts_sec_4_3_3" w:id="48"/>
+      <w:bookmarkStart w:name="Sts_sec_4_3_3" w:id="52"/>
       <w:r>
         <w:rPr/>
         <w:t xml:space="preserve">Basics of OPC UA</w:t>
       </w:r>
-      <w:bookmarkEnd w:id="48"/>
+      <w:bookmarkEnd w:id="52"/>
     </w:p>
     <w:p>
       <w:pPr>
@@ -4354,7 +4774,7 @@
       </w:pPr>
       <w:r>
         <w:rPr/>
-        <w:t xml:space="preserve">As an Extensible Standard, OPC UA provides a set of services (see &lt;xref ref-type="other" rid="ref_uapart4"&gt;</w:t>
+        <w:t xml:space="preserve">As an Extensible Standard, OPC UA provides a set of services (</w:t>
       </w:r>
       <w:r>
         <w:fldChar w:fldCharType="begin"/>
@@ -4374,7 +4794,7 @@
       </w:r>
       <w:r>
         <w:rPr/>
-        <w:t xml:space="preserve">&lt;/xref&gt;) and a basic information model framework. This framework provides an easy manner for creating and exposing vendor defined information in a standard way. More importantly all OPC UA </w:t>
+        <w:t xml:space="preserve">) and a basic information model framework. This framework provides an easy manner for creating and exposing vendor defined information in a standard way. More importantly all OPC UA </w:t>
       </w:r>
       <w:r>
         <w:rPr>
@@ -4403,7 +4823,27 @@
       </w:r>
       <w:r>
         <w:rPr/>
-        <w:t xml:space="preserve"> can be any consumer of data from another device on the network to browser based thin clients and ERP systems. The full scope of OPC UA applications are shown in &lt;xref ref-type="fig" rid="fig_3_the-scope-of-opc-ua-within-an-enterprise"&gt;Figure 3&lt;/xref&gt;.</w:t>
+        <w:t xml:space="preserve"> can be any consumer of data from another device on the network to browser based thin clients and ERP systems. The full scope of OPC UA applications are shown in </w:t>
+      </w:r>
+      <w:r>
+        <w:fldChar w:fldCharType="begin"/>
+      </w:r>
+      <w:r>
+        <w:instrText xml:space="preserve"> REF Sts_fig_3 \h \* MERGEFORMAT </w:instrText>
+      </w:r>
+      <w:r>
+        <w:fldChar w:fldCharType="separate"/>
+      </w:r>
+      <w:r>
+        <w:rPr/>
+        <w:t xml:space="preserve">Figure 3</w:t>
+      </w:r>
+      <w:r>
+        <w:fldChar w:fldCharType="end"/>
+      </w:r>
+      <w:r>
+        <w:rPr/>
+        <w:t xml:space="preserve">.</w:t>
       </w:r>
     </w:p>
     <w:p>
@@ -4427,7 +4867,7 @@
                     <pic:cNvPicPr/>
                   </pic:nvPicPr>
                   <pic:blipFill>
-                    <a:blip r:embed="R9a2fb2f981cb4e09"/>
+                    <a:blip r:embed="R7876f7a4db1444be"/>
                     <a:stretch>
                       <a:fillRect/>
                     </a:stretch>
@@ -4452,7 +4892,7 @@
       <w:pPr>
         <w:pStyle w:val="FIGURE-title"/>
       </w:pPr>
-      <w:bookmarkStart w:name="Sts_fig_3" w:id="49"/>
+      <w:bookmarkStart w:name="Sts_fig_3" w:id="53"/>
       <w:r>
         <w:t xml:space="preserve">Figure </w:t>
       </w:r>
@@ -4472,7 +4912,7 @@
       <w:r>
         <w:fldChar w:fldCharType="end"/>
       </w:r>
-      <w:bookmarkEnd w:id="49"/>
+      <w:bookmarkEnd w:id="53"/>
       <w:r>
         <w:t xml:space="preserve"> – </w:t>
       </w:r>
@@ -4494,23 +4934,23 @@
       <w:pPr>
         <w:pStyle w:val="Heading3"/>
       </w:pPr>
-      <w:bookmarkStart w:name="Sts_sec_4_3_4" w:id="50"/>
+      <w:bookmarkStart w:name="Sts_sec_4_3_4" w:id="54"/>
       <w:r>
         <w:rPr/>
         <w:t xml:space="preserve">Information Modelling in OPC UA</w:t>
       </w:r>
-      <w:bookmarkEnd w:id="50"/>
+      <w:bookmarkEnd w:id="54"/>
     </w:p>
     <w:p>
       <w:pPr>
         <w:pStyle w:val="Heading4"/>
       </w:pPr>
-      <w:bookmarkStart w:name="Sts_sec_4_3_4_1" w:id="51"/>
+      <w:bookmarkStart w:name="Sts_sec_4_3_4_1" w:id="55"/>
       <w:r>
         <w:rPr/>
         <w:t xml:space="preserve">Concepts</w:t>
       </w:r>
-      <w:bookmarkEnd w:id="51"/>
+      <w:bookmarkEnd w:id="55"/>
     </w:p>
     <w:p>
       <w:pPr>
@@ -4688,7 +5128,27 @@
       </w:r>
       <w:r>
         <w:rPr/>
-        <w:t xml:space="preserve"> representing a 'Reservation' is shown in &lt;xref ref-type="fig" rid="fig_4_a-basic-object-in-an-opc-ua-address-space"&gt;Figure 4&lt;/xref&gt;.</w:t>
+        <w:t xml:space="preserve"> representing a 'Reservation' is shown in </w:t>
+      </w:r>
+      <w:r>
+        <w:fldChar w:fldCharType="begin"/>
+      </w:r>
+      <w:r>
+        <w:instrText xml:space="preserve"> REF Sts_fig_4 \h \* MERGEFORMAT </w:instrText>
+      </w:r>
+      <w:r>
+        <w:fldChar w:fldCharType="separate"/>
+      </w:r>
+      <w:r>
+        <w:rPr/>
+        <w:t xml:space="preserve">Figure 4</w:t>
+      </w:r>
+      <w:r>
+        <w:fldChar w:fldCharType="end"/>
+      </w:r>
+      <w:r>
+        <w:rPr/>
+        <w:t xml:space="preserve">.</w:t>
       </w:r>
     </w:p>
     <w:p>
@@ -4712,7 +5172,7 @@
                     <pic:cNvPicPr/>
                   </pic:nvPicPr>
                   <pic:blipFill>
-                    <a:blip r:embed="R1bdde739b8934357"/>
+                    <a:blip r:embed="R054614ae790b44cf"/>
                     <a:stretch>
                       <a:fillRect/>
                     </a:stretch>
@@ -4737,7 +5197,7 @@
       <w:pPr>
         <w:pStyle w:val="FIGURE-title"/>
       </w:pPr>
-      <w:bookmarkStart w:name="Sts_fig_4" w:id="52"/>
+      <w:bookmarkStart w:name="Sts_fig_4" w:id="56"/>
       <w:r>
         <w:t xml:space="preserve">Figure </w:t>
       </w:r>
@@ -4757,7 +5217,7 @@
       <w:r>
         <w:fldChar w:fldCharType="end"/>
       </w:r>
-      <w:bookmarkEnd w:id="52"/>
+      <w:bookmarkEnd w:id="56"/>
       <w:r>
         <w:t xml:space="preserve"> – </w:t>
       </w:r>
@@ -4848,7 +5308,27 @@
       </w:r>
       <w:r>
         <w:rPr/>
-        <w:t xml:space="preserve">) Node which describes their semantics and structure. &lt;xref ref-type="fig" rid="fig_5_the-relationship-between-type-definitions-and-instances"&gt;Figure 5&lt;/xref&gt; illustrates the relationship between an Instance and its Type Definition.</w:t>
+        <w:t xml:space="preserve">) Node which describes their semantics and structure. </w:t>
+      </w:r>
+      <w:r>
+        <w:fldChar w:fldCharType="begin"/>
+      </w:r>
+      <w:r>
+        <w:instrText xml:space="preserve"> REF Sts_fig_5 \h \* MERGEFORMAT </w:instrText>
+      </w:r>
+      <w:r>
+        <w:fldChar w:fldCharType="separate"/>
+      </w:r>
+      <w:r>
+        <w:rPr/>
+        <w:t xml:space="preserve">Figure 5</w:t>
+      </w:r>
+      <w:r>
+        <w:fldChar w:fldCharType="end"/>
+      </w:r>
+      <w:r>
+        <w:rPr/>
+        <w:t xml:space="preserve"> illustrates the relationship between an Instance and its Type Definition.</w:t>
       </w:r>
     </w:p>
     <w:p>
@@ -4897,7 +5377,27 @@
       </w:r>
       <w:r>
         <w:rPr/>
-        <w:t xml:space="preserve">. In the example in &lt;xref ref-type="fig" rid="fig_5_the-relationship-between-type-definitions-and-instances"&gt;Figure 5&lt;/xref&gt; the PersonType </w:t>
+        <w:t xml:space="preserve">. In the example in </w:t>
+      </w:r>
+      <w:r>
+        <w:fldChar w:fldCharType="begin"/>
+      </w:r>
+      <w:r>
+        <w:instrText xml:space="preserve"> REF Sts_fig_5 \h \* MERGEFORMAT </w:instrText>
+      </w:r>
+      <w:r>
+        <w:fldChar w:fldCharType="separate"/>
+      </w:r>
+      <w:r>
+        <w:rPr/>
+        <w:t xml:space="preserve">Figure 5</w:t>
+      </w:r>
+      <w:r>
+        <w:fldChar w:fldCharType="end"/>
+      </w:r>
+      <w:r>
+        <w:rPr/>
+        <w:t xml:space="preserve"> the PersonType </w:t>
       </w:r>
       <w:r>
         <w:rPr>
@@ -4986,7 +5486,7 @@
       </w:r>
       <w:r>
         <w:rPr/>
-        <w:t xml:space="preserve"> and extend it. There are rules regarding sub typing defined in &lt;xref ref-type="other" rid="ref_uapart3"&gt;</w:t>
+        <w:t xml:space="preserve"> and extend it. There are rules regarding sub typing defined in </w:t>
       </w:r>
       <w:r>
         <w:fldChar w:fldCharType="begin"/>
@@ -5006,7 +5506,7 @@
       </w:r>
       <w:r>
         <w:rPr/>
-        <w:t xml:space="preserve">&lt;/xref&gt;, but in general they allow the extension of a given type or the restriction of a </w:t>
+        <w:t xml:space="preserve">, but in general they allow the extension of a given type or the restriction of a </w:t>
       </w:r>
       <w:r>
         <w:rPr>
@@ -5080,7 +5580,7 @@
                     <pic:cNvPicPr/>
                   </pic:nvPicPr>
                   <pic:blipFill>
-                    <a:blip r:embed="R0fe7267efc6c415a"/>
+                    <a:blip r:embed="R59063647250e44a2"/>
                     <a:stretch>
                       <a:fillRect/>
                     </a:stretch>
@@ -5105,7 +5605,7 @@
       <w:pPr>
         <w:pStyle w:val="FIGURE-title"/>
       </w:pPr>
-      <w:bookmarkStart w:name="Sts_fig_5" w:id="53"/>
+      <w:bookmarkStart w:name="Sts_fig_5" w:id="57"/>
       <w:r>
         <w:t xml:space="preserve">Figure </w:t>
       </w:r>
@@ -5125,7 +5625,7 @@
       <w:r>
         <w:fldChar w:fldCharType="end"/>
       </w:r>
-      <w:bookmarkEnd w:id="53"/>
+      <w:bookmarkEnd w:id="57"/>
       <w:r>
         <w:t xml:space="preserve"> – </w:t>
       </w:r>
@@ -5256,7 +5756,27 @@
       </w:r>
       <w:r>
         <w:rPr/>
-        <w:t xml:space="preserve">. Subtypes inherit the semantics of the parent but may add additional restrictions. &lt;xref ref-type="fig" rid="fig_6_examples-of-references-between-objects"&gt;Figure 6&lt;/xref&gt; depicts several references connecting different </w:t>
+        <w:t xml:space="preserve">. Subtypes inherit the semantics of the parent but may add additional restrictions. </w:t>
+      </w:r>
+      <w:r>
+        <w:fldChar w:fldCharType="begin"/>
+      </w:r>
+      <w:r>
+        <w:instrText xml:space="preserve"> REF Sts_fig_6 \h \* MERGEFORMAT </w:instrText>
+      </w:r>
+      <w:r>
+        <w:fldChar w:fldCharType="separate"/>
+      </w:r>
+      <w:r>
+        <w:rPr/>
+        <w:t xml:space="preserve">Figure 6</w:t>
+      </w:r>
+      <w:r>
+        <w:fldChar w:fldCharType="end"/>
+      </w:r>
+      <w:r>
+        <w:rPr/>
+        <w:t xml:space="preserve"> depicts several references connecting different </w:t>
       </w:r>
       <w:r>
         <w:rPr>
@@ -5290,7 +5810,7 @@
                     <pic:cNvPicPr/>
                   </pic:nvPicPr>
                   <pic:blipFill>
-                    <a:blip r:embed="R7e8ef16796694404"/>
+                    <a:blip r:embed="Ra51f5aac4c804cc1"/>
                     <a:stretch>
                       <a:fillRect/>
                     </a:stretch>
@@ -5315,7 +5835,7 @@
       <w:pPr>
         <w:pStyle w:val="FIGURE-title"/>
       </w:pPr>
-      <w:bookmarkStart w:name="Sts_fig_6" w:id="54"/>
+      <w:bookmarkStart w:name="Sts_fig_6" w:id="58"/>
       <w:r>
         <w:t xml:space="preserve">Figure </w:t>
       </w:r>
@@ -5335,7 +5855,7 @@
       <w:r>
         <w:fldChar w:fldCharType="end"/>
       </w:r>
-      <w:bookmarkEnd w:id="54"/>
+      <w:bookmarkEnd w:id="58"/>
       <w:r>
         <w:t xml:space="preserve"> – </w:t>
       </w:r>
@@ -5350,7 +5870,27 @@
       </w:pPr>
       <w:r>
         <w:rPr/>
-        <w:t xml:space="preserve">The figures above use a notation that was developed for the OPC UA specification. The notation is summarized in &lt;xref ref-type="fig" rid="fig_7_the-opc-ua-information-model-notation"&gt;Figure 7&lt;/xref&gt;. UML representations can also be used; however, the OPC UA notation is less ambiguous because there is a direct mapping from the elements in the figures to Nodes in the address space of an OPC UA server.</w:t>
+        <w:t xml:space="preserve">The figures above use a notation that was developed for the OPC UA specification. The notation is summarized in </w:t>
+      </w:r>
+      <w:r>
+        <w:fldChar w:fldCharType="begin"/>
+      </w:r>
+      <w:r>
+        <w:instrText xml:space="preserve"> REF Sts_fig_7 \h \* MERGEFORMAT </w:instrText>
+      </w:r>
+      <w:r>
+        <w:fldChar w:fldCharType="separate"/>
+      </w:r>
+      <w:r>
+        <w:rPr/>
+        <w:t xml:space="preserve">Figure 7</w:t>
+      </w:r>
+      <w:r>
+        <w:fldChar w:fldCharType="end"/>
+      </w:r>
+      <w:r>
+        <w:rPr/>
+        <w:t xml:space="preserve">. UML representations can also be used; however, the OPC UA notation is less ambiguous because there is a direct mapping from the elements in the figures to Nodes in the address space of an OPC UA server.</w:t>
       </w:r>
     </w:p>
     <w:p>
@@ -5374,7 +5914,7 @@
                     <pic:cNvPicPr/>
                   </pic:nvPicPr>
                   <pic:blipFill>
-                    <a:blip r:embed="R5103183c351c4482"/>
+                    <a:blip r:embed="Rb9d8d171435147b4"/>
                     <a:stretch>
                       <a:fillRect/>
                     </a:stretch>
@@ -5399,7 +5939,7 @@
       <w:pPr>
         <w:pStyle w:val="FIGURE-title"/>
       </w:pPr>
-      <w:bookmarkStart w:name="Sts_fig_7" w:id="55"/>
+      <w:bookmarkStart w:name="Sts_fig_7" w:id="59"/>
       <w:r>
         <w:t xml:space="preserve">Figure </w:t>
       </w:r>
@@ -5419,7 +5959,7 @@
       <w:r>
         <w:fldChar w:fldCharType="end"/>
       </w:r>
-      <w:bookmarkEnd w:id="55"/>
+      <w:bookmarkEnd w:id="59"/>
       <w:r>
         <w:t xml:space="preserve"> – </w:t>
       </w:r>
@@ -5454,7 +5994,7 @@
       </w:r>
       <w:r>
         <w:rPr/>
-        <w:t xml:space="preserve"> can be found in &lt;xref ref-type="other" rid="ref_uapart3"&gt;</w:t>
+        <w:t xml:space="preserve"> can be found in </w:t>
       </w:r>
       <w:r>
         <w:fldChar w:fldCharType="begin"/>
@@ -5474,7 +6014,7 @@
       </w:r>
       <w:r>
         <w:rPr/>
-        <w:t xml:space="preserve">&lt;/xref&gt; and the base OPC UA Address space is described in &lt;xref ref-type="other" rid="ref_uapart5"&gt;</w:t>
+        <w:t xml:space="preserve"> and the base OPC UA Address space is described in </w:t>
       </w:r>
       <w:r>
         <w:fldChar w:fldCharType="begin"/>
@@ -5494,7 +6034,7 @@
       </w:r>
       <w:r>
         <w:rPr/>
-        <w:t xml:space="preserve">&lt;/xref&gt;.</w:t>
+        <w:t xml:space="preserve">.</w:t>
       </w:r>
     </w:p>
     <w:p>
@@ -5523,7 +6063,7 @@
       </w:r>
       <w:r>
         <w:rPr/>
-        <w:t xml:space="preserve"> support all functionality in the OPC UA specifications. OPC UA includes the concept of profiles, which segment the functionality into testable certifiable units. This allows the development of companion specification (such as OPC UA for ISA-95) that can describe the subset of functionality that is expected to be implemented. The profiles do not restrict functionality, but generate requirements for a minimum set of functionality (see &lt;xref ref-type="other" rid="ref_uapart7"&gt;</w:t>
+        <w:t xml:space="preserve"> support all functionality in the OPC UA specifications. OPC UA includes the concept of profiles, which segment the functionality into testable certifiable units. This allows the development of companion specification (such as OPC UA for ISA-95) that can describe the subset of functionality that is expected to be implemented. The profiles do not restrict functionality, but generate requirements for a minimum set of functionality (see </w:t>
       </w:r>
       <w:r>
         <w:fldChar w:fldCharType="begin"/>
@@ -5543,7 +6083,7 @@
       </w:r>
       <w:r>
         <w:rPr/>
-        <w:t xml:space="preserve">&lt;/xref&gt;).</w:t>
+        <w:t xml:space="preserve">).</w:t>
       </w:r>
     </w:p>
     <w:p>
@@ -5552,7 +6092,7 @@
       </w:pPr>
       <w:r>
         <w:rPr/>
-        <w:t xml:space="preserve">The OPC Foundation also defines a set of information models that provide a basic set of functionality. The Data Access specification (see &lt;xref ref-type="other" rid="ref_uapart8"&gt;</w:t>
+        <w:t xml:space="preserve">The OPC Foundation also defines a set of information models that provide a basic set of functionality. The Data Access specification (see </w:t>
       </w:r>
       <w:r>
         <w:fldChar w:fldCharType="begin"/>
@@ -5572,7 +6112,87 @@
       </w:r>
       <w:r>
         <w:rPr/>
-        <w:t xml:space="preserve">&lt;/xref&gt;) provides a basic information model for typical data. The Alarm and Condition specification (see &lt;xref ref-type="other" rid="ref_uapart9"&gt;OPC 10000-9&lt;/xref&gt;) defines a standard information model for Alarms and Conditions. The Programs specification (see &lt;xref ref-type="other" rid="ref_uapart10"&gt;OPC 10000-10&lt;/xref&gt;) defines a standard information model for extending the functionality available via method calls and state machines. The Historical Access specification (see &lt;xref ref-type="other" rid="ref_uapart11"&gt;OPC 10000-11&lt;/xref&gt;) defines the information model associated with Historical Data and Historical Events. The aggregates specification (see &lt;xref ref-type="other" rid="ref_uapart13"&gt;OPC 10000-13&lt;/xref&gt;) defines a series of standard aggregate functions that allow a </w:t>
+        <w:t xml:space="preserve">) provides a basic information model for typical data. The Alarm and Condition specification (see </w:t>
+      </w:r>
+      <w:r>
+        <w:fldChar w:fldCharType="begin"/>
+      </w:r>
+      <w:r>
+        <w:instrText xml:space="preserve"> REF Sts_ref_uapart9 \h \* MERGEFORMAT </w:instrText>
+      </w:r>
+      <w:r>
+        <w:fldChar w:fldCharType="separate"/>
+      </w:r>
+      <w:r>
+        <w:rPr/>
+        <w:t xml:space="preserve">OPC 10000-9</w:t>
+      </w:r>
+      <w:r>
+        <w:fldChar w:fldCharType="end"/>
+      </w:r>
+      <w:r>
+        <w:rPr/>
+        <w:t xml:space="preserve">) defines a standard information model for Alarms and Conditions. The Programs specification (see </w:t>
+      </w:r>
+      <w:r>
+        <w:fldChar w:fldCharType="begin"/>
+      </w:r>
+      <w:r>
+        <w:instrText xml:space="preserve"> REF Sts_ref_uapart10 \h \* MERGEFORMAT </w:instrText>
+      </w:r>
+      <w:r>
+        <w:fldChar w:fldCharType="separate"/>
+      </w:r>
+      <w:r>
+        <w:rPr/>
+        <w:t xml:space="preserve">OPC 10000-10</w:t>
+      </w:r>
+      <w:r>
+        <w:fldChar w:fldCharType="end"/>
+      </w:r>
+      <w:r>
+        <w:rPr/>
+        <w:t xml:space="preserve">) defines a standard information model for extending the functionality available via method calls and state machines. The Historical Access specification (see </w:t>
+      </w:r>
+      <w:r>
+        <w:fldChar w:fldCharType="begin"/>
+      </w:r>
+      <w:r>
+        <w:instrText xml:space="preserve"> REF Sts_ref_uapart11 \h \* MERGEFORMAT </w:instrText>
+      </w:r>
+      <w:r>
+        <w:fldChar w:fldCharType="separate"/>
+      </w:r>
+      <w:r>
+        <w:rPr/>
+        <w:t xml:space="preserve">OPC 10000-11</w:t>
+      </w:r>
+      <w:r>
+        <w:fldChar w:fldCharType="end"/>
+      </w:r>
+      <w:r>
+        <w:rPr/>
+        <w:t xml:space="preserve">) defines the information model associated with Historical Data and Historical Events. The aggregates specification (see </w:t>
+      </w:r>
+      <w:r>
+        <w:fldChar w:fldCharType="begin"/>
+      </w:r>
+      <w:r>
+        <w:instrText xml:space="preserve"> REF Sts_ref_uapart13 \h \* MERGEFORMAT </w:instrText>
+      </w:r>
+      <w:r>
+        <w:fldChar w:fldCharType="separate"/>
+      </w:r>
+      <w:r>
+        <w:rPr/>
+        <w:t xml:space="preserve">OPC 10000-13</w:t>
+      </w:r>
+      <w:r>
+        <w:fldChar w:fldCharType="end"/>
+      </w:r>
+      <w:r>
+        <w:rPr/>
+        <w:t xml:space="preserve">) defines a series of standard aggregate functions that allow a </w:t>
       </w:r>
       <w:r>
         <w:rPr>
@@ -5589,12 +6209,12 @@
       <w:pPr>
         <w:pStyle w:val="Heading4"/>
       </w:pPr>
-      <w:bookmarkStart w:name="Sts_sec_4_3_4_2" w:id="56"/>
+      <w:bookmarkStart w:name="Sts_sec_4_3_4_2" w:id="60"/>
       <w:r>
         <w:rPr/>
         <w:t xml:space="preserve">Namespaces</w:t>
       </w:r>
-      <w:bookmarkEnd w:id="56"/>
+      <w:bookmarkEnd w:id="60"/>
     </w:p>
     <w:p>
       <w:pPr>
@@ -5903,12 +6523,12 @@
       <w:pPr>
         <w:pStyle w:val="Heading4"/>
       </w:pPr>
-      <w:bookmarkStart w:name="Sts_sec_4_3_4_3" w:id="57"/>
+      <w:bookmarkStart w:name="Sts_sec_4_3_4_3" w:id="61"/>
       <w:r>
         <w:rPr/>
         <w:t xml:space="preserve">Companion Specifications</w:t>
       </w:r>
-      <w:bookmarkEnd w:id="57"/>
+      <w:bookmarkEnd w:id="61"/>
     </w:p>
     <w:p>
       <w:pPr>
@@ -5956,7 +6576,27 @@
       </w:r>
       <w:r>
         <w:rPr/>
-        <w:t xml:space="preserve"> that represent the concepts used in the vertical market. &lt;xref ref-type="table" rid="tbl_1_example-objecttype-definition"&gt;Table 1&lt;/xref&gt; contains an example of an </w:t>
+        <w:t xml:space="preserve"> that represent the concepts used in the vertical market. </w:t>
+      </w:r>
+      <w:r>
+        <w:fldChar w:fldCharType="begin"/>
+      </w:r>
+      <w:r>
+        <w:instrText xml:space="preserve"> REF Sts_tbl_1 \h \* MERGEFORMAT </w:instrText>
+      </w:r>
+      <w:r>
+        <w:fldChar w:fldCharType="separate"/>
+      </w:r>
+      <w:r>
+        <w:rPr/>
+        <w:t xml:space="preserve">Table 1</w:t>
+      </w:r>
+      <w:r>
+        <w:fldChar w:fldCharType="end"/>
+      </w:r>
+      <w:r>
+        <w:rPr/>
+        <w:t xml:space="preserve"> contains an example of an </w:t>
       </w:r>
       <w:r>
         <w:rPr>
@@ -5973,7 +6613,7 @@
       <w:pPr>
         <w:pStyle w:val="TABLE-title"/>
       </w:pPr>
-      <w:bookmarkStart w:name="Sts_tbl_1" w:id="58"/>
+      <w:bookmarkStart w:name="Sts_tbl_1" w:id="62"/>
       <w:r>
         <w:t xml:space="preserve">Table </w:t>
       </w:r>
@@ -5993,7 +6633,7 @@
       <w:r>
         <w:fldChar w:fldCharType="end"/>
       </w:r>
-      <w:bookmarkEnd w:id="58"/>
+      <w:bookmarkEnd w:id="62"/>
       <w:r>
         <w:t xml:space="preserve"> – </w:t>
       </w:r>
@@ -6801,7 +7441,27 @@
       </w:r>
       <w:r>
         <w:rPr/>
-        <w:t xml:space="preserve"> is not defined if the cardinality is greater than 1. &lt;xref ref-type="fig" rid="fig_8_a-visual-representation-of-the-sample-objecttype"&gt;Figure 8&lt;/xref&gt; visually depicts the </w:t>
+        <w:t xml:space="preserve"> is not defined if the cardinality is greater than 1. </w:t>
+      </w:r>
+      <w:r>
+        <w:fldChar w:fldCharType="begin"/>
+      </w:r>
+      <w:r>
+        <w:instrText xml:space="preserve"> REF Sts_fig_8 \h \* MERGEFORMAT </w:instrText>
+      </w:r>
+      <w:r>
+        <w:fldChar w:fldCharType="separate"/>
+      </w:r>
+      <w:r>
+        <w:rPr/>
+        <w:t xml:space="preserve">Figure 8</w:t>
+      </w:r>
+      <w:r>
+        <w:fldChar w:fldCharType="end"/>
+      </w:r>
+      <w:r>
+        <w:rPr/>
+        <w:t xml:space="preserve"> visually depicts the </w:t>
       </w:r>
       <w:r>
         <w:rPr>
@@ -6811,7 +7471,27 @@
       </w:r>
       <w:r>
         <w:rPr/>
-        <w:t xml:space="preserve"> defined in &lt;xref ref-type="table" rid="tbl_1_example-objecttype-definition"&gt;Table 1&lt;/xref&gt; along with two instances of the </w:t>
+        <w:t xml:space="preserve"> defined in </w:t>
+      </w:r>
+      <w:r>
+        <w:fldChar w:fldCharType="begin"/>
+      </w:r>
+      <w:r>
+        <w:instrText xml:space="preserve"> REF Sts_tbl_1 \h \* MERGEFORMAT </w:instrText>
+      </w:r>
+      <w:r>
+        <w:fldChar w:fldCharType="separate"/>
+      </w:r>
+      <w:r>
+        <w:rPr/>
+        <w:t xml:space="preserve">Table 1</w:t>
+      </w:r>
+      <w:r>
+        <w:fldChar w:fldCharType="end"/>
+      </w:r>
+      <w:r>
+        <w:rPr/>
+        <w:t xml:space="preserve"> along with two instances of the </w:t>
       </w:r>
       <w:r>
         <w:rPr>
@@ -6845,7 +7525,7 @@
                     <pic:cNvPicPr/>
                   </pic:nvPicPr>
                   <pic:blipFill>
-                    <a:blip r:embed="Rd813def0e4924485"/>
+                    <a:blip r:embed="R17de109c8e8c4877"/>
                     <a:stretch>
                       <a:fillRect/>
                     </a:stretch>
@@ -6870,7 +7550,7 @@
       <w:pPr>
         <w:pStyle w:val="FIGURE-title"/>
       </w:pPr>
-      <w:bookmarkStart w:name="Sts_fig_8" w:id="59"/>
+      <w:bookmarkStart w:name="Sts_fig_8" w:id="63"/>
       <w:r>
         <w:t xml:space="preserve">Figure </w:t>
       </w:r>
@@ -6890,7 +7570,7 @@
       <w:r>
         <w:fldChar w:fldCharType="end"/>
       </w:r>
-      <w:bookmarkEnd w:id="59"/>
+      <w:bookmarkEnd w:id="63"/>
       <w:r>
         <w:t xml:space="preserve"> – </w:t>
       </w:r>
@@ -6903,12 +7583,12 @@
       <w:pPr>
         <w:pStyle w:val="Heading1"/>
       </w:pPr>
-      <w:bookmarkStart w:name="Sts_sec_5" w:id="60"/>
+      <w:bookmarkStart w:name="Sts_sec_5" w:id="64"/>
       <w:r>
         <w:rPr/>
         <w:t xml:space="preserve">Modelling Approach of PackML</w:t>
       </w:r>
-      <w:bookmarkEnd w:id="60"/>
+      <w:bookmarkEnd w:id="64"/>
     </w:p>
     <w:p>
       <w:pPr>
@@ -6998,12 +7678,12 @@
       <w:pPr>
         <w:pStyle w:val="Heading2"/>
       </w:pPr>
-      <w:bookmarkStart w:name="Sts_sec_5_1" w:id="61"/>
+      <w:bookmarkStart w:name="Sts_sec_5_1" w:id="65"/>
       <w:r>
         <w:rPr/>
         <w:t xml:space="preserve">OPC UA Notation</w:t>
       </w:r>
-      <w:bookmarkEnd w:id="61"/>
+      <w:bookmarkEnd w:id="65"/>
     </w:p>
     <w:p>
       <w:pPr>
@@ -7178,23 +7858,23 @@
       <w:pPr>
         <w:pStyle w:val="Heading1"/>
       </w:pPr>
-      <w:bookmarkStart w:name="Sts_sec_6" w:id="62"/>
+      <w:bookmarkStart w:name="Sts_sec_6" w:id="66"/>
       <w:r>
         <w:rPr/>
         <w:t xml:space="preserve">PackML Data Representation Model</w:t>
       </w:r>
-      <w:bookmarkEnd w:id="62"/>
+      <w:bookmarkEnd w:id="66"/>
     </w:p>
     <w:p>
       <w:pPr>
         <w:pStyle w:val="Heading2"/>
       </w:pPr>
-      <w:bookmarkStart w:name="Sts_sec_6_1" w:id="63"/>
+      <w:bookmarkStart w:name="Sts_sec_6_1" w:id="67"/>
       <w:r>
         <w:rPr/>
         <w:t xml:space="preserve">General</w:t>
       </w:r>
-      <w:bookmarkEnd w:id="63"/>
+      <w:bookmarkEnd w:id="67"/>
     </w:p>
     <w:p>
       <w:pPr>
@@ -7449,7 +8129,7 @@
                     <pic:cNvPicPr/>
                   </pic:nvPicPr>
                   <pic:blipFill>
-                    <a:blip r:embed="R9ceb4c443c08424c"/>
+                    <a:blip r:embed="R212b53170f78462b"/>
                     <a:stretch>
                       <a:fillRect/>
                     </a:stretch>
@@ -7474,7 +8154,7 @@
       <w:pPr>
         <w:pStyle w:val="FIGURE-title"/>
       </w:pPr>
-      <w:bookmarkStart w:name="Sts_fig_9" w:id="64"/>
+      <w:bookmarkStart w:name="Sts_fig_9" w:id="68"/>
       <w:r>
         <w:t xml:space="preserve">Figure </w:t>
       </w:r>
@@ -7494,7 +8174,7 @@
       <w:r>
         <w:fldChar w:fldCharType="end"/>
       </w:r>
-      <w:bookmarkEnd w:id="64"/>
+      <w:bookmarkEnd w:id="68"/>
       <w:r>
         <w:t xml:space="preserve"> – </w:t>
       </w:r>
@@ -7565,12 +8245,12 @@
       <w:pPr>
         <w:pStyle w:val="Heading2"/>
       </w:pPr>
-      <w:bookmarkStart w:name="Sts_sec_6_2" w:id="65"/>
+      <w:bookmarkStart w:name="Sts_sec_6_2" w:id="69"/>
       <w:r>
         <w:rPr/>
         <w:t xml:space="preserve">Instance AddressSpace</w:t>
       </w:r>
-      <w:bookmarkEnd w:id="65"/>
+      <w:bookmarkEnd w:id="69"/>
     </w:p>
     <w:p>
       <w:pPr>
@@ -7602,7 +8282,7 @@
                     <pic:cNvPicPr/>
                   </pic:nvPicPr>
                   <pic:blipFill>
-                    <a:blip r:embed="R7067108107914c3a"/>
+                    <a:blip r:embed="Rb180b7bca97f43bc"/>
                     <a:stretch>
                       <a:fillRect/>
                     </a:stretch>
@@ -7627,7 +8307,7 @@
       <w:pPr>
         <w:pStyle w:val="FIGURE-title"/>
       </w:pPr>
-      <w:bookmarkStart w:name="Sts_fig_10" w:id="66"/>
+      <w:bookmarkStart w:name="Sts_fig_10" w:id="70"/>
       <w:r>
         <w:t xml:space="preserve">Figure </w:t>
       </w:r>
@@ -7647,7 +8327,7 @@
       <w:r>
         <w:fldChar w:fldCharType="end"/>
       </w:r>
-      <w:bookmarkEnd w:id="66"/>
+      <w:bookmarkEnd w:id="70"/>
       <w:r>
         <w:t xml:space="preserve"> – </w:t>
       </w:r>
@@ -7738,7 +8418,7 @@
       <w:pPr>
         <w:pStyle w:val="TABLE-title"/>
       </w:pPr>
-      <w:bookmarkStart w:name="Sts_tbl_2" w:id="67"/>
+      <w:bookmarkStart w:name="Sts_tbl_2" w:id="71"/>
       <w:r>
         <w:t xml:space="preserve">Table </w:t>
       </w:r>
@@ -7758,7 +8438,7 @@
       <w:r>
         <w:fldChar w:fldCharType="end"/>
       </w:r>
-      <w:bookmarkEnd w:id="67"/>
+      <w:bookmarkEnd w:id="71"/>
       <w:r>
         <w:t xml:space="preserve"> – </w:t>
       </w:r>
@@ -8016,23 +8696,23 @@
       <w:pPr>
         <w:pStyle w:val="Heading2"/>
       </w:pPr>
-      <w:bookmarkStart w:name="Sts_sec_6_3" w:id="68"/>
+      <w:bookmarkStart w:name="Sts_sec_6_3" w:id="72"/>
       <w:r>
         <w:rPr/>
         <w:t xml:space="preserve">Objects and ObjectTypes</w:t>
       </w:r>
-      <w:bookmarkEnd w:id="68"/>
+      <w:bookmarkEnd w:id="72"/>
     </w:p>
     <w:p>
       <w:pPr>
         <w:pStyle w:val="Heading3"/>
       </w:pPr>
-      <w:bookmarkStart w:name="Sts_sec_6_3_1" w:id="69"/>
+      <w:bookmarkStart w:name="Sts_sec_6_3_1" w:id="73"/>
       <w:r>
         <w:rPr/>
         <w:t xml:space="preserve">Overview</w:t>
       </w:r>
-      <w:bookmarkEnd w:id="69"/>
+      <w:bookmarkEnd w:id="73"/>
     </w:p>
     <w:p>
       <w:pPr>
@@ -8087,12 +8767,12 @@
       <w:pPr>
         <w:pStyle w:val="Heading3"/>
       </w:pPr>
-      <w:bookmarkStart w:name="Sts_sec_6_3_2" w:id="70"/>
+      <w:bookmarkStart w:name="Sts_sec_6_3_2" w:id="74"/>
       <w:r>
         <w:rPr/>
         <w:t xml:space="preserve">PackMLBaseObjectType</w:t>
       </w:r>
-      <w:bookmarkEnd w:id="70"/>
+      <w:bookmarkEnd w:id="74"/>
     </w:p>
     <w:p>
       <w:pPr>
@@ -8134,7 +8814,7 @@
                     <pic:cNvPicPr/>
                   </pic:nvPicPr>
                   <pic:blipFill>
-                    <a:blip r:embed="R57d8d89d968646b3"/>
+                    <a:blip r:embed="Rbcd5b41e5af446b8"/>
                     <a:stretch>
                       <a:fillRect/>
                     </a:stretch>
@@ -8159,7 +8839,7 @@
       <w:pPr>
         <w:pStyle w:val="FIGURE-title"/>
       </w:pPr>
-      <w:bookmarkStart w:name="Sts_fig_11" w:id="71"/>
+      <w:bookmarkStart w:name="Sts_fig_11" w:id="75"/>
       <w:r>
         <w:t xml:space="preserve">Figure </w:t>
       </w:r>
@@ -8179,7 +8859,7 @@
       <w:r>
         <w:fldChar w:fldCharType="end"/>
       </w:r>
-      <w:bookmarkEnd w:id="71"/>
+      <w:bookmarkEnd w:id="75"/>
       <w:r>
         <w:t xml:space="preserve"> – </w:t>
       </w:r>
@@ -8211,7 +8891,7 @@
       <w:pPr>
         <w:pStyle w:val="TABLE-title"/>
       </w:pPr>
-      <w:bookmarkStart w:name="Sts_tbl_3" w:id="72"/>
+      <w:bookmarkStart w:name="Sts_tbl_3" w:id="76"/>
       <w:r>
         <w:t xml:space="preserve">Table </w:t>
       </w:r>
@@ -8231,7 +8911,7 @@
       <w:r>
         <w:fldChar w:fldCharType="end"/>
       </w:r>
-      <w:bookmarkEnd w:id="72"/>
+      <w:bookmarkEnd w:id="76"/>
       <w:r>
         <w:t xml:space="preserve"> – </w:t>
       </w:r>
@@ -9937,12 +10617,12 @@
       <w:pPr>
         <w:pStyle w:val="Heading3"/>
       </w:pPr>
-      <w:bookmarkStart w:name="Sts_sec_6_3_3" w:id="73"/>
+      <w:bookmarkStart w:name="Sts_sec_6_3_3" w:id="77"/>
       <w:r>
         <w:rPr/>
         <w:t xml:space="preserve">PackMLStatusObjectType</w:t>
       </w:r>
-      <w:bookmarkEnd w:id="73"/>
+      <w:bookmarkEnd w:id="77"/>
     </w:p>
     <w:p>
       <w:pPr>
@@ -9994,7 +10674,7 @@
                     <pic:cNvPicPr/>
                   </pic:nvPicPr>
                   <pic:blipFill>
-                    <a:blip r:embed="R4ff0b8a5b0894e81"/>
+                    <a:blip r:embed="Rfd7b9b14c71a49f2"/>
                     <a:stretch>
                       <a:fillRect/>
                     </a:stretch>
@@ -10019,7 +10699,7 @@
       <w:pPr>
         <w:pStyle w:val="FIGURE-title"/>
       </w:pPr>
-      <w:bookmarkStart w:name="Sts_fig_12" w:id="74"/>
+      <w:bookmarkStart w:name="Sts_fig_12" w:id="78"/>
       <w:r>
         <w:t xml:space="preserve">Figure </w:t>
       </w:r>
@@ -10039,7 +10719,7 @@
       <w:r>
         <w:fldChar w:fldCharType="end"/>
       </w:r>
-      <w:bookmarkEnd w:id="74"/>
+      <w:bookmarkEnd w:id="78"/>
       <w:r>
         <w:t xml:space="preserve"> – </w:t>
       </w:r>
@@ -10071,7 +10751,7 @@
       <w:pPr>
         <w:pStyle w:val="TABLE-title"/>
       </w:pPr>
-      <w:bookmarkStart w:name="Sts_tbl_4" w:id="75"/>
+      <w:bookmarkStart w:name="Sts_tbl_4" w:id="79"/>
       <w:r>
         <w:t xml:space="preserve">Table </w:t>
       </w:r>
@@ -10091,7 +10771,7 @@
       <w:r>
         <w:fldChar w:fldCharType="end"/>
       </w:r>
-      <w:bookmarkEnd w:id="75"/>
+      <w:bookmarkEnd w:id="79"/>
       <w:r>
         <w:t xml:space="preserve"> – </w:t>
       </w:r>
@@ -12413,12 +13093,12 @@
       <w:pPr>
         <w:pStyle w:val="Heading3"/>
       </w:pPr>
-      <w:bookmarkStart w:name="Sts_sec_6_3_4" w:id="76"/>
+      <w:bookmarkStart w:name="Sts_sec_6_3_4" w:id="80"/>
       <w:r>
         <w:rPr/>
         <w:t xml:space="preserve">PackMLAdminObjectType</w:t>
       </w:r>
-      <w:bookmarkEnd w:id="76"/>
+      <w:bookmarkEnd w:id="80"/>
     </w:p>
     <w:p>
       <w:pPr>
@@ -12470,7 +13150,7 @@
                     <pic:cNvPicPr/>
                   </pic:nvPicPr>
                   <pic:blipFill>
-                    <a:blip r:embed="Rd9f6ca79eacc44e3"/>
+                    <a:blip r:embed="R5ee044c1ab8348b0"/>
                     <a:stretch>
                       <a:fillRect/>
                     </a:stretch>
@@ -12495,7 +13175,7 @@
       <w:pPr>
         <w:pStyle w:val="FIGURE-title"/>
       </w:pPr>
-      <w:bookmarkStart w:name="Sts_fig_13" w:id="77"/>
+      <w:bookmarkStart w:name="Sts_fig_13" w:id="81"/>
       <w:r>
         <w:t xml:space="preserve">Figure </w:t>
       </w:r>
@@ -12515,7 +13195,7 @@
       <w:r>
         <w:fldChar w:fldCharType="end"/>
       </w:r>
-      <w:bookmarkEnd w:id="77"/>
+      <w:bookmarkEnd w:id="81"/>
       <w:r>
         <w:t xml:space="preserve"> – </w:t>
       </w:r>
@@ -12537,7 +13217,7 @@
       <w:pPr>
         <w:pStyle w:val="TABLE-title"/>
       </w:pPr>
-      <w:bookmarkStart w:name="Sts_tbl_5" w:id="78"/>
+      <w:bookmarkStart w:name="Sts_tbl_5" w:id="82"/>
       <w:r>
         <w:t xml:space="preserve">Table </w:t>
       </w:r>
@@ -12557,7 +13237,7 @@
       <w:r>
         <w:fldChar w:fldCharType="end"/>
       </w:r>
-      <w:bookmarkEnd w:id="78"/>
+      <w:bookmarkEnd w:id="82"/>
       <w:r>
         <w:t xml:space="preserve"> – </w:t>
       </w:r>
@@ -15150,12 +15830,12 @@
       <w:pPr>
         <w:pStyle w:val="Heading3"/>
       </w:pPr>
-      <w:bookmarkStart w:name="Sts_sec_6_3_5" w:id="79"/>
+      <w:bookmarkStart w:name="Sts_sec_6_3_5" w:id="83"/>
       <w:r>
         <w:rPr/>
         <w:t xml:space="preserve">StateMachines Overview</w:t>
       </w:r>
-      <w:bookmarkEnd w:id="79"/>
+      <w:bookmarkEnd w:id="83"/>
     </w:p>
     <w:p>
       <w:pPr>
@@ -15197,7 +15877,7 @@
                     <pic:cNvPicPr/>
                   </pic:nvPicPr>
                   <pic:blipFill>
-                    <a:blip r:embed="R0a1d1ce7202a4eea"/>
+                    <a:blip r:embed="R7134aa90fb244243"/>
                     <a:stretch>
                       <a:fillRect/>
                     </a:stretch>
@@ -15222,7 +15902,7 @@
       <w:pPr>
         <w:pStyle w:val="FIGURE-title"/>
       </w:pPr>
-      <w:bookmarkStart w:name="Sts_fig_14" w:id="80"/>
+      <w:bookmarkStart w:name="Sts_fig_14" w:id="84"/>
       <w:r>
         <w:t xml:space="preserve">Figure </w:t>
       </w:r>
@@ -15242,7 +15922,7 @@
       <w:r>
         <w:fldChar w:fldCharType="end"/>
       </w:r>
-      <w:bookmarkEnd w:id="80"/>
+      <w:bookmarkEnd w:id="84"/>
       <w:r>
         <w:t xml:space="preserve"> – </w:t>
       </w:r>
@@ -15557,7 +16237,7 @@
                     <pic:cNvPicPr/>
                   </pic:nvPicPr>
                   <pic:blipFill>
-                    <a:blip r:embed="Ra80514c5dd54475a"/>
+                    <a:blip r:embed="R040ed20906844676"/>
                     <a:stretch>
                       <a:fillRect/>
                     </a:stretch>
@@ -15582,7 +16262,7 @@
       <w:pPr>
         <w:pStyle w:val="FIGURE-title"/>
       </w:pPr>
-      <w:bookmarkStart w:name="Sts_fig_15" w:id="81"/>
+      <w:bookmarkStart w:name="Sts_fig_15" w:id="85"/>
       <w:r>
         <w:t xml:space="preserve">Figure </w:t>
       </w:r>
@@ -15602,7 +16282,7 @@
       <w:r>
         <w:fldChar w:fldCharType="end"/>
       </w:r>
-      <w:bookmarkEnd w:id="81"/>
+      <w:bookmarkEnd w:id="85"/>
       <w:r>
         <w:t xml:space="preserve"> – </w:t>
       </w:r>
@@ -15615,12 +16295,12 @@
       <w:pPr>
         <w:pStyle w:val="Heading3"/>
       </w:pPr>
-      <w:bookmarkStart w:name="Sts_sec_6_3_6" w:id="82"/>
+      <w:bookmarkStart w:name="Sts_sec_6_3_6" w:id="86"/>
       <w:r>
         <w:rPr/>
         <w:t xml:space="preserve">PackMLBaseStateMachineType</w:t>
       </w:r>
-      <w:bookmarkEnd w:id="82"/>
+      <w:bookmarkEnd w:id="86"/>
     </w:p>
     <w:p>
       <w:pPr>
@@ -15722,7 +16402,7 @@
                     <pic:cNvPicPr/>
                   </pic:nvPicPr>
                   <pic:blipFill>
-                    <a:blip r:embed="R87183dba2857425b"/>
+                    <a:blip r:embed="R2151a7cd47994147"/>
                     <a:stretch>
                       <a:fillRect/>
                     </a:stretch>
@@ -15747,7 +16427,7 @@
       <w:pPr>
         <w:pStyle w:val="FIGURE-title"/>
       </w:pPr>
-      <w:bookmarkStart w:name="Sts_fig_16" w:id="83"/>
+      <w:bookmarkStart w:name="Sts_fig_16" w:id="87"/>
       <w:r>
         <w:t xml:space="preserve">Figure </w:t>
       </w:r>
@@ -15767,7 +16447,7 @@
       <w:r>
         <w:fldChar w:fldCharType="end"/>
       </w:r>
-      <w:bookmarkEnd w:id="83"/>
+      <w:bookmarkEnd w:id="87"/>
       <w:r>
         <w:t xml:space="preserve"> – </w:t>
       </w:r>
@@ -15809,7 +16489,7 @@
       <w:pPr>
         <w:pStyle w:val="TABLE-title"/>
       </w:pPr>
-      <w:bookmarkStart w:name="Sts_tbl_6" w:id="84"/>
+      <w:bookmarkStart w:name="Sts_tbl_6" w:id="88"/>
       <w:r>
         <w:t xml:space="preserve">Table </w:t>
       </w:r>
@@ -15829,7 +16509,7 @@
       <w:r>
         <w:fldChar w:fldCharType="end"/>
       </w:r>
-      <w:bookmarkEnd w:id="84"/>
+      <w:bookmarkEnd w:id="88"/>
       <w:r>
         <w:t xml:space="preserve"> – </w:t>
       </w:r>
@@ -17282,7 +17962,7 @@
       <w:pPr>
         <w:pStyle w:val="TABLE-title"/>
       </w:pPr>
-      <w:bookmarkStart w:name="Sts_tbl_7" w:id="85"/>
+      <w:bookmarkStart w:name="Sts_tbl_7" w:id="89"/>
       <w:r>
         <w:t xml:space="preserve">Table </w:t>
       </w:r>
@@ -17302,7 +17982,7 @@
       <w:r>
         <w:fldChar w:fldCharType="end"/>
       </w:r>
-      <w:bookmarkEnd w:id="85"/>
+      <w:bookmarkEnd w:id="89"/>
       <w:r>
         <w:t xml:space="preserve"> – </w:t>
       </w:r>
@@ -17878,12 +18558,12 @@
       <w:pPr>
         <w:pStyle w:val="Heading3"/>
       </w:pPr>
-      <w:bookmarkStart w:name="Sts_sec_6_3_7" w:id="86"/>
+      <w:bookmarkStart w:name="Sts_sec_6_3_7" w:id="90"/>
       <w:r>
         <w:rPr/>
         <w:t xml:space="preserve">PackMLMachineStateMachineType</w:t>
       </w:r>
-      <w:bookmarkEnd w:id="86"/>
+      <w:bookmarkEnd w:id="90"/>
     </w:p>
     <w:p>
       <w:pPr>
@@ -17984,7 +18664,7 @@
                     <pic:cNvPicPr/>
                   </pic:nvPicPr>
                   <pic:blipFill>
-                    <a:blip r:embed="Rcdb7777ed5204c57"/>
+                    <a:blip r:embed="R358d96a410104dd9"/>
                     <a:stretch>
                       <a:fillRect/>
                     </a:stretch>
@@ -18009,7 +18689,7 @@
       <w:pPr>
         <w:pStyle w:val="FIGURE-title"/>
       </w:pPr>
-      <w:bookmarkStart w:name="Sts_fig_17" w:id="87"/>
+      <w:bookmarkStart w:name="Sts_fig_17" w:id="91"/>
       <w:r>
         <w:t xml:space="preserve">Figure </w:t>
       </w:r>
@@ -18029,7 +18709,7 @@
       <w:r>
         <w:fldChar w:fldCharType="end"/>
       </w:r>
-      <w:bookmarkEnd w:id="87"/>
+      <w:bookmarkEnd w:id="91"/>
       <w:r>
         <w:t xml:space="preserve"> – </w:t>
       </w:r>
@@ -18081,7 +18761,7 @@
       <w:pPr>
         <w:pStyle w:val="TABLE-title"/>
       </w:pPr>
-      <w:bookmarkStart w:name="Sts_tbl_8" w:id="88"/>
+      <w:bookmarkStart w:name="Sts_tbl_8" w:id="92"/>
       <w:r>
         <w:t xml:space="preserve">Table </w:t>
       </w:r>
@@ -18101,7 +18781,7 @@
       <w:r>
         <w:fldChar w:fldCharType="end"/>
       </w:r>
-      <w:bookmarkEnd w:id="88"/>
+      <w:bookmarkEnd w:id="92"/>
       <w:r>
         <w:t xml:space="preserve"> – </w:t>
       </w:r>
@@ -19691,7 +20371,7 @@
       <w:pPr>
         <w:pStyle w:val="TABLE-title"/>
       </w:pPr>
-      <w:bookmarkStart w:name="Sts_tbl_9" w:id="89"/>
+      <w:bookmarkStart w:name="Sts_tbl_9" w:id="93"/>
       <w:r>
         <w:t xml:space="preserve">Table </w:t>
       </w:r>
@@ -19711,7 +20391,7 @@
       <w:r>
         <w:fldChar w:fldCharType="end"/>
       </w:r>
-      <w:bookmarkEnd w:id="89"/>
+      <w:bookmarkEnd w:id="93"/>
       <w:r>
         <w:t xml:space="preserve"> – </w:t>
       </w:r>
@@ -20407,12 +21087,12 @@
       <w:pPr>
         <w:pStyle w:val="Heading3"/>
       </w:pPr>
-      <w:bookmarkStart w:name="Sts_sec_6_3_8" w:id="90"/>
+      <w:bookmarkStart w:name="Sts_sec_6_3_8" w:id="94"/>
       <w:r>
         <w:rPr/>
         <w:t xml:space="preserve">PackMLExecuteStateMachineType</w:t>
       </w:r>
-      <w:bookmarkEnd w:id="90"/>
+      <w:bookmarkEnd w:id="94"/>
     </w:p>
     <w:p>
       <w:pPr>
@@ -20494,7 +21174,7 @@
                     <pic:cNvPicPr/>
                   </pic:nvPicPr>
                   <pic:blipFill>
-                    <a:blip r:embed="R62d679e869b44478"/>
+                    <a:blip r:embed="R5c0506c2df264de2"/>
                     <a:stretch>
                       <a:fillRect/>
                     </a:stretch>
@@ -20519,7 +21199,7 @@
       <w:pPr>
         <w:pStyle w:val="FIGURE-title"/>
       </w:pPr>
-      <w:bookmarkStart w:name="Sts_fig_18" w:id="91"/>
+      <w:bookmarkStart w:name="Sts_fig_18" w:id="95"/>
       <w:r>
         <w:t xml:space="preserve">Figure </w:t>
       </w:r>
@@ -20539,7 +21219,7 @@
       <w:r>
         <w:fldChar w:fldCharType="end"/>
       </w:r>
-      <w:bookmarkEnd w:id="91"/>
+      <w:bookmarkEnd w:id="95"/>
       <w:r>
         <w:t xml:space="preserve"> – </w:t>
       </w:r>
@@ -20591,7 +21271,7 @@
       <w:pPr>
         <w:pStyle w:val="TABLE-title"/>
       </w:pPr>
-      <w:bookmarkStart w:name="Sts_tbl_10" w:id="92"/>
+      <w:bookmarkStart w:name="Sts_tbl_10" w:id="96"/>
       <w:r>
         <w:t xml:space="preserve">Table </w:t>
       </w:r>
@@ -20611,7 +21291,7 @@
       <w:r>
         <w:fldChar w:fldCharType="end"/>
       </w:r>
-      <w:bookmarkEnd w:id="92"/>
+      <w:bookmarkEnd w:id="96"/>
       <w:r>
         <w:t xml:space="preserve"> – </w:t>
       </w:r>
@@ -24765,7 +25445,7 @@
       <w:pPr>
         <w:pStyle w:val="TABLE-title"/>
       </w:pPr>
-      <w:bookmarkStart w:name="Sts_tbl_11" w:id="93"/>
+      <w:bookmarkStart w:name="Sts_tbl_11" w:id="97"/>
       <w:r>
         <w:t xml:space="preserve">Table </w:t>
       </w:r>
@@ -24785,7 +25465,7 @@
       <w:r>
         <w:fldChar w:fldCharType="end"/>
       </w:r>
-      <w:bookmarkEnd w:id="93"/>
+      <w:bookmarkEnd w:id="97"/>
       <w:r>
         <w:t xml:space="preserve"> – </w:t>
       </w:r>
@@ -27870,12 +28550,12 @@
       <w:pPr>
         <w:pStyle w:val="Heading2"/>
       </w:pPr>
-      <w:bookmarkStart w:name="Sts_sec_6_4" w:id="94"/>
+      <w:bookmarkStart w:name="Sts_sec_6_4" w:id="98"/>
       <w:r>
         <w:rPr/>
         <w:t xml:space="preserve">Variables and VariableTypes</w:t>
       </w:r>
-      <w:bookmarkEnd w:id="94"/>
+      <w:bookmarkEnd w:id="98"/>
     </w:p>
     <w:p>
       <w:pPr>
@@ -27890,23 +28570,23 @@
       <w:pPr>
         <w:pStyle w:val="Heading2"/>
       </w:pPr>
-      <w:bookmarkStart w:name="Sts_sec_6_5" w:id="95"/>
+      <w:bookmarkStart w:name="Sts_sec_6_5" w:id="99"/>
       <w:r>
         <w:rPr/>
         <w:t xml:space="preserve">DataTypes</w:t>
       </w:r>
-      <w:bookmarkEnd w:id="95"/>
+      <w:bookmarkEnd w:id="99"/>
     </w:p>
     <w:p>
       <w:pPr>
         <w:pStyle w:val="Heading3"/>
       </w:pPr>
-      <w:bookmarkStart w:name="Sts_sec_6_5_1" w:id="96"/>
+      <w:bookmarkStart w:name="Sts_sec_6_5_1" w:id="100"/>
       <w:r>
         <w:rPr/>
         <w:t xml:space="preserve">Overview</w:t>
       </w:r>
-      <w:bookmarkEnd w:id="96"/>
+      <w:bookmarkEnd w:id="100"/>
     </w:p>
     <w:p>
       <w:pPr>
@@ -27921,12 +28601,12 @@
       <w:pPr>
         <w:pStyle w:val="Heading3"/>
       </w:pPr>
-      <w:bookmarkStart w:name="Sts_sec_6_5_2" w:id="97"/>
+      <w:bookmarkStart w:name="Sts_sec_6_5_2" w:id="101"/>
       <w:r>
         <w:rPr/>
         <w:t xml:space="preserve">ProductionMaintenanceModeEnum</w:t>
       </w:r>
-      <w:bookmarkEnd w:id="97"/>
+      <w:bookmarkEnd w:id="101"/>
     </w:p>
     <w:p>
       <w:pPr>
@@ -27971,7 +28651,7 @@
       <w:pPr>
         <w:pStyle w:val="TABLE-title"/>
       </w:pPr>
-      <w:bookmarkStart w:name="Sts_tbl_12" w:id="98"/>
+      <w:bookmarkStart w:name="Sts_tbl_12" w:id="102"/>
       <w:r>
         <w:t xml:space="preserve">Table </w:t>
       </w:r>
@@ -27991,7 +28671,7 @@
       <w:r>
         <w:fldChar w:fldCharType="end"/>
       </w:r>
-      <w:bookmarkEnd w:id="98"/>
+      <w:bookmarkEnd w:id="102"/>
       <w:r>
         <w:t xml:space="preserve"> – </w:t>
       </w:r>
@@ -28298,12 +28978,12 @@
       <w:pPr>
         <w:pStyle w:val="Heading3"/>
       </w:pPr>
-      <w:bookmarkStart w:name="Sts_sec_6_5_3" w:id="99"/>
+      <w:bookmarkStart w:name="Sts_sec_6_5_3" w:id="103"/>
       <w:r>
         <w:rPr/>
         <w:t xml:space="preserve">PackMLCountDataType</w:t>
       </w:r>
-      <w:bookmarkEnd w:id="99"/>
+      <w:bookmarkEnd w:id="103"/>
     </w:p>
     <w:p>
       <w:pPr>
@@ -28328,7 +29008,7 @@
       <w:pPr>
         <w:pStyle w:val="TABLE-title"/>
       </w:pPr>
-      <w:bookmarkStart w:name="Sts_tbl_13" w:id="100"/>
+      <w:bookmarkStart w:name="Sts_tbl_13" w:id="104"/>
       <w:r>
         <w:t xml:space="preserve">Table </w:t>
       </w:r>
@@ -28348,7 +29028,7 @@
       <w:r>
         <w:fldChar w:fldCharType="end"/>
       </w:r>
-      <w:bookmarkEnd w:id="100"/>
+      <w:bookmarkEnd w:id="104"/>
       <w:r>
         <w:t xml:space="preserve"> – </w:t>
       </w:r>
@@ -28699,12 +29379,12 @@
       <w:pPr>
         <w:pStyle w:val="Heading3"/>
       </w:pPr>
-      <w:bookmarkStart w:name="Sts_sec_6_5_4" w:id="101"/>
+      <w:bookmarkStart w:name="Sts_sec_6_5_4" w:id="105"/>
       <w:r>
         <w:rPr/>
         <w:t xml:space="preserve">PackMLDescriptorDataType</w:t>
       </w:r>
-      <w:bookmarkEnd w:id="101"/>
+      <w:bookmarkEnd w:id="105"/>
     </w:p>
     <w:p>
       <w:pPr>
@@ -28739,7 +29419,7 @@
       <w:pPr>
         <w:pStyle w:val="TABLE-title"/>
       </w:pPr>
-      <w:bookmarkStart w:name="Sts_tbl_14" w:id="102"/>
+      <w:bookmarkStart w:name="Sts_tbl_14" w:id="106"/>
       <w:r>
         <w:t xml:space="preserve">Table </w:t>
       </w:r>
@@ -28759,7 +29439,7 @@
       <w:r>
         <w:fldChar w:fldCharType="end"/>
       </w:r>
-      <w:bookmarkEnd w:id="102"/>
+      <w:bookmarkEnd w:id="106"/>
       <w:r>
         <w:t xml:space="preserve"> – </w:t>
       </w:r>
@@ -29063,12 +29743,12 @@
       <w:pPr>
         <w:pStyle w:val="Heading3"/>
       </w:pPr>
-      <w:bookmarkStart w:name="Sts_sec_6_5_5" w:id="103"/>
+      <w:bookmarkStart w:name="Sts_sec_6_5_5" w:id="107"/>
       <w:r>
         <w:rPr/>
         <w:t xml:space="preserve">PackMLIngredientsDataType</w:t>
       </w:r>
-      <w:bookmarkEnd w:id="103"/>
+      <w:bookmarkEnd w:id="107"/>
     </w:p>
     <w:p>
       <w:pPr>
@@ -29103,7 +29783,7 @@
       <w:pPr>
         <w:pStyle w:val="TABLE-title"/>
       </w:pPr>
-      <w:bookmarkStart w:name="Sts_tbl_15" w:id="104"/>
+      <w:bookmarkStart w:name="Sts_tbl_15" w:id="108"/>
       <w:r>
         <w:t xml:space="preserve">Table </w:t>
       </w:r>
@@ -29123,7 +29803,7 @@
       <w:r>
         <w:fldChar w:fldCharType="end"/>
       </w:r>
-      <w:bookmarkEnd w:id="104"/>
+      <w:bookmarkEnd w:id="108"/>
       <w:r>
         <w:t xml:space="preserve"> – </w:t>
       </w:r>
@@ -29333,12 +30013,12 @@
       <w:pPr>
         <w:pStyle w:val="Heading3"/>
       </w:pPr>
-      <w:bookmarkStart w:name="Sts_sec_6_5_6" w:id="105"/>
+      <w:bookmarkStart w:name="Sts_sec_6_5_6" w:id="109"/>
       <w:r>
         <w:rPr/>
         <w:t xml:space="preserve">PackMLProductDataType</w:t>
       </w:r>
-      <w:bookmarkEnd w:id="105"/>
+      <w:bookmarkEnd w:id="109"/>
     </w:p>
     <w:p>
       <w:pPr>
@@ -29373,7 +30053,7 @@
       <w:pPr>
         <w:pStyle w:val="TABLE-title"/>
       </w:pPr>
-      <w:bookmarkStart w:name="Sts_tbl_16" w:id="106"/>
+      <w:bookmarkStart w:name="Sts_tbl_16" w:id="110"/>
       <w:r>
         <w:t xml:space="preserve">Table </w:t>
       </w:r>
@@ -29393,7 +30073,7 @@
       <w:r>
         <w:fldChar w:fldCharType="end"/>
       </w:r>
-      <w:bookmarkEnd w:id="106"/>
+      <w:bookmarkEnd w:id="110"/>
       <w:r>
         <w:t xml:space="preserve"> – </w:t>
       </w:r>
@@ -29650,12 +30330,12 @@
       <w:pPr>
         <w:pStyle w:val="Heading3"/>
       </w:pPr>
-      <w:bookmarkStart w:name="Sts_sec_6_5_7" w:id="107"/>
+      <w:bookmarkStart w:name="Sts_sec_6_5_7" w:id="111"/>
       <w:r>
         <w:rPr/>
         <w:t xml:space="preserve">PackMLRemoteInterfaceDataType</w:t>
       </w:r>
-      <w:bookmarkEnd w:id="107"/>
+      <w:bookmarkEnd w:id="111"/>
     </w:p>
     <w:p>
       <w:pPr>
@@ -29690,7 +30370,7 @@
       <w:pPr>
         <w:pStyle w:val="TABLE-title"/>
       </w:pPr>
-      <w:bookmarkStart w:name="Sts_tbl_17" w:id="108"/>
+      <w:bookmarkStart w:name="Sts_tbl_17" w:id="112"/>
       <w:r>
         <w:t xml:space="preserve">Table </w:t>
       </w:r>
@@ -29710,7 +30390,7 @@
       <w:r>
         <w:fldChar w:fldCharType="end"/>
       </w:r>
-      <w:bookmarkEnd w:id="108"/>
+      <w:bookmarkEnd w:id="112"/>
       <w:r>
         <w:t xml:space="preserve"> – </w:t>
       </w:r>
@@ -30078,23 +30758,23 @@
       <w:pPr>
         <w:pStyle w:val="Heading2"/>
       </w:pPr>
-      <w:bookmarkStart w:name="Sts_sec_6_6" w:id="109"/>
+      <w:bookmarkStart w:name="Sts_sec_6_6" w:id="113"/>
       <w:r>
         <w:rPr/>
         <w:t xml:space="preserve">ReferenceTypes</w:t>
       </w:r>
-      <w:bookmarkEnd w:id="109"/>
+      <w:bookmarkEnd w:id="113"/>
     </w:p>
     <w:p>
       <w:pPr>
         <w:pStyle w:val="Heading3"/>
       </w:pPr>
-      <w:bookmarkStart w:name="Sts_sec_6_6_1" w:id="110"/>
+      <w:bookmarkStart w:name="Sts_sec_6_6_1" w:id="114"/>
       <w:r>
         <w:rPr/>
         <w:t xml:space="preserve">HasInterlock</w:t>
       </w:r>
-      <w:bookmarkEnd w:id="110"/>
+      <w:bookmarkEnd w:id="114"/>
     </w:p>
     <w:p>
       <w:pPr>
@@ -30109,7 +30789,7 @@
       <w:pPr>
         <w:pStyle w:val="TABLE-title"/>
       </w:pPr>
-      <w:bookmarkStart w:name="Sts_tbl_18" w:id="111"/>
+      <w:bookmarkStart w:name="Sts_tbl_18" w:id="115"/>
       <w:r>
         <w:t xml:space="preserve">Table </w:t>
       </w:r>
@@ -30129,7 +30809,7 @@
       <w:r>
         <w:fldChar w:fldCharType="end"/>
       </w:r>
-      <w:bookmarkEnd w:id="111"/>
+      <w:bookmarkEnd w:id="115"/>
       <w:r>
         <w:t xml:space="preserve"> – </w:t>
       </w:r>
@@ -30440,12 +31120,12 @@
       <w:pPr>
         <w:pStyle w:val="Heading3"/>
       </w:pPr>
-      <w:bookmarkStart w:name="Sts_sec_6_6_2" w:id="112"/>
+      <w:bookmarkStart w:name="Sts_sec_6_6_2" w:id="116"/>
       <w:r>
         <w:rPr/>
         <w:t xml:space="preserve">HasAlarm</w:t>
       </w:r>
-      <w:bookmarkEnd w:id="112"/>
+      <w:bookmarkEnd w:id="116"/>
     </w:p>
     <w:p>
       <w:pPr>
@@ -30460,7 +31140,7 @@
       <w:pPr>
         <w:pStyle w:val="TABLE-title"/>
       </w:pPr>
-      <w:bookmarkStart w:name="Sts_tbl_19" w:id="113"/>
+      <w:bookmarkStart w:name="Sts_tbl_19" w:id="117"/>
       <w:r>
         <w:t xml:space="preserve">Table </w:t>
       </w:r>
@@ -30480,7 +31160,7 @@
       <w:r>
         <w:fldChar w:fldCharType="end"/>
       </w:r>
-      <w:bookmarkEnd w:id="113"/>
+      <w:bookmarkEnd w:id="117"/>
       <w:r>
         <w:t xml:space="preserve"> – </w:t>
       </w:r>
@@ -30791,12 +31471,12 @@
       <w:pPr>
         <w:pStyle w:val="Heading3"/>
       </w:pPr>
-      <w:bookmarkStart w:name="Sts_sec_6_6_3" w:id="114"/>
+      <w:bookmarkStart w:name="Sts_sec_6_6_3" w:id="118"/>
       <w:r>
         <w:rPr/>
         <w:t xml:space="preserve">HasAlarmHistory</w:t>
       </w:r>
-      <w:bookmarkEnd w:id="114"/>
+      <w:bookmarkEnd w:id="118"/>
     </w:p>
     <w:p>
       <w:pPr>
@@ -30811,7 +31491,7 @@
       <w:pPr>
         <w:pStyle w:val="TABLE-title"/>
       </w:pPr>
-      <w:bookmarkStart w:name="Sts_tbl_20" w:id="115"/>
+      <w:bookmarkStart w:name="Sts_tbl_20" w:id="119"/>
       <w:r>
         <w:t xml:space="preserve">Table </w:t>
       </w:r>
@@ -30831,7 +31511,7 @@
       <w:r>
         <w:fldChar w:fldCharType="end"/>
       </w:r>
-      <w:bookmarkEnd w:id="115"/>
+      <w:bookmarkEnd w:id="119"/>
       <w:r>
         <w:t xml:space="preserve"> – </w:t>
       </w:r>
@@ -31142,12 +31822,12 @@
       <w:pPr>
         <w:pStyle w:val="Heading3"/>
       </w:pPr>
-      <w:bookmarkStart w:name="Sts_sec_6_6_4" w:id="116"/>
+      <w:bookmarkStart w:name="Sts_sec_6_6_4" w:id="120"/>
       <w:r>
         <w:rPr/>
         <w:t xml:space="preserve">HasWarning</w:t>
       </w:r>
-      <w:bookmarkEnd w:id="116"/>
+      <w:bookmarkEnd w:id="120"/>
     </w:p>
     <w:p>
       <w:pPr>
@@ -31162,7 +31842,7 @@
       <w:pPr>
         <w:pStyle w:val="TABLE-title"/>
       </w:pPr>
-      <w:bookmarkStart w:name="Sts_tbl_21" w:id="117"/>
+      <w:bookmarkStart w:name="Sts_tbl_21" w:id="121"/>
       <w:r>
         <w:t xml:space="preserve">Table </w:t>
       </w:r>
@@ -31182,7 +31862,7 @@
       <w:r>
         <w:fldChar w:fldCharType="end"/>
       </w:r>
-      <w:bookmarkEnd w:id="117"/>
+      <w:bookmarkEnd w:id="121"/>
       <w:r>
         <w:t xml:space="preserve"> – </w:t>
       </w:r>
@@ -31493,12 +32173,12 @@
       <w:pPr>
         <w:pStyle w:val="Heading3"/>
       </w:pPr>
-      <w:bookmarkStart w:name="Sts_sec_6_6_5" w:id="118"/>
+      <w:bookmarkStart w:name="Sts_sec_6_6_5" w:id="122"/>
       <w:r>
         <w:rPr/>
         <w:t xml:space="preserve">HasStopReason</w:t>
       </w:r>
-      <w:bookmarkEnd w:id="118"/>
+      <w:bookmarkEnd w:id="122"/>
     </w:p>
     <w:p>
       <w:pPr>
@@ -31513,7 +32193,7 @@
       <w:pPr>
         <w:pStyle w:val="TABLE-title"/>
       </w:pPr>
-      <w:bookmarkStart w:name="Sts_tbl_22" w:id="119"/>
+      <w:bookmarkStart w:name="Sts_tbl_22" w:id="123"/>
       <w:r>
         <w:t xml:space="preserve">Table </w:t>
       </w:r>
@@ -31533,7 +32213,7 @@
       <w:r>
         <w:fldChar w:fldCharType="end"/>
       </w:r>
-      <w:bookmarkEnd w:id="119"/>
+      <w:bookmarkEnd w:id="123"/>
       <w:r>
         <w:t xml:space="preserve"> – </w:t>
       </w:r>
@@ -31844,23 +32524,23 @@
       <w:pPr>
         <w:pStyle w:val="Heading2"/>
       </w:pPr>
-      <w:bookmarkStart w:name="Sts_sec_6_7" w:id="120"/>
+      <w:bookmarkStart w:name="Sts_sec_6_7" w:id="124"/>
       <w:r>
         <w:rPr/>
         <w:t xml:space="preserve">Methods</w:t>
       </w:r>
-      <w:bookmarkEnd w:id="120"/>
+      <w:bookmarkEnd w:id="124"/>
     </w:p>
     <w:p>
       <w:pPr>
         <w:pStyle w:val="Heading3"/>
       </w:pPr>
-      <w:bookmarkStart w:name="Sts_sec_6_7_1" w:id="121"/>
+      <w:bookmarkStart w:name="Sts_sec_6_7_1" w:id="125"/>
       <w:r>
         <w:rPr/>
         <w:t xml:space="preserve">Overview</w:t>
       </w:r>
-      <w:bookmarkEnd w:id="121"/>
+      <w:bookmarkEnd w:id="125"/>
     </w:p>
     <w:p>
       <w:pPr>
@@ -31875,12 +32555,12 @@
       <w:pPr>
         <w:pStyle w:val="Heading3"/>
       </w:pPr>
-      <w:bookmarkStart w:name="Sts_sec_6_7_2" w:id="122"/>
+      <w:bookmarkStart w:name="Sts_sec_6_7_2" w:id="126"/>
       <w:r>
         <w:rPr/>
         <w:t xml:space="preserve">SetUnitMode Method</w:t>
       </w:r>
-      <w:bookmarkEnd w:id="122"/>
+      <w:bookmarkEnd w:id="126"/>
     </w:p>
     <w:p>
       <w:pPr>
@@ -31952,7 +32632,7 @@
       <w:pPr>
         <w:pStyle w:val="TABLE-title"/>
       </w:pPr>
-      <w:bookmarkStart w:name="Sts_tbl_23" w:id="123"/>
+      <w:bookmarkStart w:name="Sts_tbl_23" w:id="127"/>
       <w:r>
         <w:t xml:space="preserve">Table </w:t>
       </w:r>
@@ -31972,7 +32652,7 @@
       <w:r>
         <w:fldChar w:fldCharType="end"/>
       </w:r>
-      <w:bookmarkEnd w:id="123"/>
+      <w:bookmarkEnd w:id="127"/>
       <w:r>
         <w:t xml:space="preserve"> – </w:t>
       </w:r>
@@ -32079,7 +32759,7 @@
       <w:pPr>
         <w:pStyle w:val="TABLE-title"/>
       </w:pPr>
-      <w:bookmarkStart w:name="Sts_tbl_24" w:id="124"/>
+      <w:bookmarkStart w:name="Sts_tbl_24" w:id="128"/>
       <w:r>
         <w:t xml:space="preserve">Table </w:t>
       </w:r>
@@ -32099,7 +32779,7 @@
       <w:r>
         <w:fldChar w:fldCharType="end"/>
       </w:r>
-      <w:bookmarkEnd w:id="124"/>
+      <w:bookmarkEnd w:id="128"/>
       <w:r>
         <w:t xml:space="preserve"> – </w:t>
       </w:r>
@@ -32630,7 +33310,7 @@
       <w:pPr>
         <w:pStyle w:val="TABLE-title"/>
       </w:pPr>
-      <w:bookmarkStart w:name="Sts_tbl_25" w:id="125"/>
+      <w:bookmarkStart w:name="Sts_tbl_25" w:id="129"/>
       <w:r>
         <w:t xml:space="preserve">Table </w:t>
       </w:r>
@@ -32650,7 +33330,7 @@
       <w:r>
         <w:fldChar w:fldCharType="end"/>
       </w:r>
-      <w:bookmarkEnd w:id="125"/>
+      <w:bookmarkEnd w:id="129"/>
       <w:r>
         <w:t xml:space="preserve"> – </w:t>
       </w:r>
@@ -32938,12 +33618,12 @@
       <w:pPr>
         <w:pStyle w:val="Heading3"/>
       </w:pPr>
-      <w:bookmarkStart w:name="Sts_sec_6_7_3" w:id="126"/>
+      <w:bookmarkStart w:name="Sts_sec_6_7_3" w:id="130"/>
       <w:r>
         <w:rPr/>
         <w:t xml:space="preserve">SetMachSpeed Method</w:t>
       </w:r>
-      <w:bookmarkEnd w:id="126"/>
+      <w:bookmarkEnd w:id="130"/>
     </w:p>
     <w:p>
       <w:pPr>
@@ -33015,7 +33695,7 @@
       <w:pPr>
         <w:pStyle w:val="TABLE-title"/>
       </w:pPr>
-      <w:bookmarkStart w:name="Sts_tbl_26" w:id="127"/>
+      <w:bookmarkStart w:name="Sts_tbl_26" w:id="131"/>
       <w:r>
         <w:t xml:space="preserve">Table </w:t>
       </w:r>
@@ -33035,7 +33715,7 @@
       <w:r>
         <w:fldChar w:fldCharType="end"/>
       </w:r>
-      <w:bookmarkEnd w:id="127"/>
+      <w:bookmarkEnd w:id="131"/>
       <w:r>
         <w:t xml:space="preserve"> – </w:t>
       </w:r>
@@ -33156,7 +33836,7 @@
       <w:pPr>
         <w:pStyle w:val="TABLE-title"/>
       </w:pPr>
-      <w:bookmarkStart w:name="Sts_tbl_27" w:id="128"/>
+      <w:bookmarkStart w:name="Sts_tbl_27" w:id="132"/>
       <w:r>
         <w:t xml:space="preserve">Table </w:t>
       </w:r>
@@ -33176,7 +33856,7 @@
       <w:r>
         <w:fldChar w:fldCharType="end"/>
       </w:r>
-      <w:bookmarkEnd w:id="128"/>
+      <w:bookmarkEnd w:id="132"/>
       <w:r>
         <w:t xml:space="preserve"> – </w:t>
       </w:r>
@@ -33707,7 +34387,7 @@
       <w:pPr>
         <w:pStyle w:val="TABLE-title"/>
       </w:pPr>
-      <w:bookmarkStart w:name="Sts_tbl_28" w:id="129"/>
+      <w:bookmarkStart w:name="Sts_tbl_28" w:id="133"/>
       <w:r>
         <w:t xml:space="preserve">Table </w:t>
       </w:r>
@@ -33727,7 +34407,7 @@
       <w:r>
         <w:fldChar w:fldCharType="end"/>
       </w:r>
-      <w:bookmarkEnd w:id="129"/>
+      <w:bookmarkEnd w:id="133"/>
       <w:r>
         <w:t xml:space="preserve"> – </w:t>
       </w:r>
@@ -34015,12 +34695,12 @@
       <w:pPr>
         <w:pStyle w:val="Heading3"/>
       </w:pPr>
-      <w:bookmarkStart w:name="Sts_sec_6_7_4" w:id="130"/>
+      <w:bookmarkStart w:name="Sts_sec_6_7_4" w:id="134"/>
       <w:r>
         <w:rPr/>
         <w:t xml:space="preserve">SetProduct Method</w:t>
       </w:r>
-      <w:bookmarkEnd w:id="130"/>
+      <w:bookmarkEnd w:id="134"/>
     </w:p>
     <w:p>
       <w:pPr>
@@ -34092,7 +34772,7 @@
       <w:pPr>
         <w:pStyle w:val="TABLE-title"/>
       </w:pPr>
-      <w:bookmarkStart w:name="Sts_tbl_29" w:id="131"/>
+      <w:bookmarkStart w:name="Sts_tbl_29" w:id="135"/>
       <w:r>
         <w:t xml:space="preserve">Table </w:t>
       </w:r>
@@ -34112,7 +34792,7 @@
       <w:r>
         <w:fldChar w:fldCharType="end"/>
       </w:r>
-      <w:bookmarkEnd w:id="131"/>
+      <w:bookmarkEnd w:id="135"/>
       <w:r>
         <w:t xml:space="preserve"> – </w:t>
       </w:r>
@@ -34233,7 +34913,7 @@
       <w:pPr>
         <w:pStyle w:val="TABLE-title"/>
       </w:pPr>
-      <w:bookmarkStart w:name="Sts_tbl_30" w:id="132"/>
+      <w:bookmarkStart w:name="Sts_tbl_30" w:id="136"/>
       <w:r>
         <w:t xml:space="preserve">Table </w:t>
       </w:r>
@@ -34253,7 +34933,7 @@
       <w:r>
         <w:fldChar w:fldCharType="end"/>
       </w:r>
-      <w:bookmarkEnd w:id="132"/>
+      <w:bookmarkEnd w:id="136"/>
       <w:r>
         <w:t xml:space="preserve"> – </w:t>
       </w:r>
@@ -34784,7 +35464,7 @@
       <w:pPr>
         <w:pStyle w:val="TABLE-title"/>
       </w:pPr>
-      <w:bookmarkStart w:name="Sts_tbl_31" w:id="133"/>
+      <w:bookmarkStart w:name="Sts_tbl_31" w:id="137"/>
       <w:r>
         <w:t xml:space="preserve">Table </w:t>
       </w:r>
@@ -34804,7 +35484,7 @@
       <w:r>
         <w:fldChar w:fldCharType="end"/>
       </w:r>
-      <w:bookmarkEnd w:id="133"/>
+      <w:bookmarkEnd w:id="137"/>
       <w:r>
         <w:t xml:space="preserve"> – </w:t>
       </w:r>
@@ -35092,12 +35772,12 @@
       <w:pPr>
         <w:pStyle w:val="Heading3"/>
       </w:pPr>
-      <w:bookmarkStart w:name="Sts_sec_6_7_5" w:id="134"/>
+      <w:bookmarkStart w:name="Sts_sec_6_7_5" w:id="138"/>
       <w:r>
         <w:rPr/>
         <w:t xml:space="preserve">Abort Method</w:t>
       </w:r>
-      <w:bookmarkEnd w:id="134"/>
+      <w:bookmarkEnd w:id="138"/>
     </w:p>
     <w:p>
       <w:pPr>
@@ -35184,7 +35864,7 @@
       <w:pPr>
         <w:pStyle w:val="TABLE-title"/>
       </w:pPr>
-      <w:bookmarkStart w:name="Sts_tbl_32" w:id="135"/>
+      <w:bookmarkStart w:name="Sts_tbl_32" w:id="139"/>
       <w:r>
         <w:t xml:space="preserve">Table </w:t>
       </w:r>
@@ -35204,7 +35884,7 @@
       <w:r>
         <w:fldChar w:fldCharType="end"/>
       </w:r>
-      <w:bookmarkEnd w:id="135"/>
+      <w:bookmarkEnd w:id="139"/>
       <w:r>
         <w:t xml:space="preserve"> – </w:t>
       </w:r>
@@ -35531,7 +36211,7 @@
       <w:pPr>
         <w:pStyle w:val="TABLE-title"/>
       </w:pPr>
-      <w:bookmarkStart w:name="Sts_tbl_33" w:id="136"/>
+      <w:bookmarkStart w:name="Sts_tbl_33" w:id="140"/>
       <w:r>
         <w:t xml:space="preserve">Table </w:t>
       </w:r>
@@ -35551,7 +36231,7 @@
       <w:r>
         <w:fldChar w:fldCharType="end"/>
       </w:r>
-      <w:bookmarkEnd w:id="136"/>
+      <w:bookmarkEnd w:id="140"/>
       <w:r>
         <w:t xml:space="preserve"> – </w:t>
       </w:r>
@@ -35761,12 +36441,12 @@
       <w:pPr>
         <w:pStyle w:val="Heading3"/>
       </w:pPr>
-      <w:bookmarkStart w:name="Sts_sec_6_7_6" w:id="137"/>
+      <w:bookmarkStart w:name="Sts_sec_6_7_6" w:id="141"/>
       <w:r>
         <w:rPr/>
         <w:t xml:space="preserve">Clear Method</w:t>
       </w:r>
-      <w:bookmarkEnd w:id="137"/>
+      <w:bookmarkEnd w:id="141"/>
     </w:p>
     <w:p>
       <w:pPr>
@@ -35853,7 +36533,7 @@
       <w:pPr>
         <w:pStyle w:val="TABLE-title"/>
       </w:pPr>
-      <w:bookmarkStart w:name="Sts_tbl_34" w:id="138"/>
+      <w:bookmarkStart w:name="Sts_tbl_34" w:id="142"/>
       <w:r>
         <w:t xml:space="preserve">Table </w:t>
       </w:r>
@@ -35873,7 +36553,7 @@
       <w:r>
         <w:fldChar w:fldCharType="end"/>
       </w:r>
-      <w:bookmarkEnd w:id="138"/>
+      <w:bookmarkEnd w:id="142"/>
       <w:r>
         <w:t xml:space="preserve"> – </w:t>
       </w:r>
@@ -36200,7 +36880,7 @@
       <w:pPr>
         <w:pStyle w:val="TABLE-title"/>
       </w:pPr>
-      <w:bookmarkStart w:name="Sts_tbl_35" w:id="139"/>
+      <w:bookmarkStart w:name="Sts_tbl_35" w:id="143"/>
       <w:r>
         <w:t xml:space="preserve">Table </w:t>
       </w:r>
@@ -36220,7 +36900,7 @@
       <w:r>
         <w:fldChar w:fldCharType="end"/>
       </w:r>
-      <w:bookmarkEnd w:id="139"/>
+      <w:bookmarkEnd w:id="143"/>
       <w:r>
         <w:t xml:space="preserve"> – </w:t>
       </w:r>
@@ -36430,12 +37110,12 @@
       <w:pPr>
         <w:pStyle w:val="Heading3"/>
       </w:pPr>
-      <w:bookmarkStart w:name="Sts_sec_6_7_7" w:id="140"/>
+      <w:bookmarkStart w:name="Sts_sec_6_7_7" w:id="144"/>
       <w:r>
         <w:rPr/>
         <w:t xml:space="preserve">Stop Method</w:t>
       </w:r>
-      <w:bookmarkEnd w:id="140"/>
+      <w:bookmarkEnd w:id="144"/>
     </w:p>
     <w:p>
       <w:pPr>
@@ -36522,7 +37202,7 @@
       <w:pPr>
         <w:pStyle w:val="TABLE-title"/>
       </w:pPr>
-      <w:bookmarkStart w:name="Sts_tbl_36" w:id="141"/>
+      <w:bookmarkStart w:name="Sts_tbl_36" w:id="145"/>
       <w:r>
         <w:t xml:space="preserve">Table </w:t>
       </w:r>
@@ -36542,7 +37222,7 @@
       <w:r>
         <w:fldChar w:fldCharType="end"/>
       </w:r>
-      <w:bookmarkEnd w:id="141"/>
+      <w:bookmarkEnd w:id="145"/>
       <w:r>
         <w:t xml:space="preserve"> – </w:t>
       </w:r>
@@ -36869,7 +37549,7 @@
       <w:pPr>
         <w:pStyle w:val="TABLE-title"/>
       </w:pPr>
-      <w:bookmarkStart w:name="Sts_tbl_37" w:id="142"/>
+      <w:bookmarkStart w:name="Sts_tbl_37" w:id="146"/>
       <w:r>
         <w:t xml:space="preserve">Table </w:t>
       </w:r>
@@ -36889,7 +37569,7 @@
       <w:r>
         <w:fldChar w:fldCharType="end"/>
       </w:r>
-      <w:bookmarkEnd w:id="142"/>
+      <w:bookmarkEnd w:id="146"/>
       <w:r>
         <w:t xml:space="preserve"> – </w:t>
       </w:r>
@@ -37099,12 +37779,12 @@
       <w:pPr>
         <w:pStyle w:val="Heading3"/>
       </w:pPr>
-      <w:bookmarkStart w:name="Sts_sec_6_7_8" w:id="143"/>
+      <w:bookmarkStart w:name="Sts_sec_6_7_8" w:id="147"/>
       <w:r>
         <w:rPr/>
         <w:t xml:space="preserve">Reset Method</w:t>
       </w:r>
-      <w:bookmarkEnd w:id="143"/>
+      <w:bookmarkEnd w:id="147"/>
     </w:p>
     <w:p>
       <w:pPr>
@@ -37191,7 +37871,7 @@
       <w:pPr>
         <w:pStyle w:val="TABLE-title"/>
       </w:pPr>
-      <w:bookmarkStart w:name="Sts_tbl_38" w:id="144"/>
+      <w:bookmarkStart w:name="Sts_tbl_38" w:id="148"/>
       <w:r>
         <w:t xml:space="preserve">Table </w:t>
       </w:r>
@@ -37211,7 +37891,7 @@
       <w:r>
         <w:fldChar w:fldCharType="end"/>
       </w:r>
-      <w:bookmarkEnd w:id="144"/>
+      <w:bookmarkEnd w:id="148"/>
       <w:r>
         <w:t xml:space="preserve"> – </w:t>
       </w:r>
@@ -37558,7 +38238,7 @@
       <w:pPr>
         <w:pStyle w:val="TABLE-title"/>
       </w:pPr>
-      <w:bookmarkStart w:name="Sts_tbl_39" w:id="145"/>
+      <w:bookmarkStart w:name="Sts_tbl_39" w:id="149"/>
       <w:r>
         <w:t xml:space="preserve">Table </w:t>
       </w:r>
@@ -37578,7 +38258,7 @@
       <w:r>
         <w:fldChar w:fldCharType="end"/>
       </w:r>
-      <w:bookmarkEnd w:id="145"/>
+      <w:bookmarkEnd w:id="149"/>
       <w:r>
         <w:t xml:space="preserve"> – </w:t>
       </w:r>
@@ -37788,12 +38468,12 @@
       <w:pPr>
         <w:pStyle w:val="Heading3"/>
       </w:pPr>
-      <w:bookmarkStart w:name="Sts_sec_6_7_9" w:id="146"/>
+      <w:bookmarkStart w:name="Sts_sec_6_7_9" w:id="150"/>
       <w:r>
         <w:rPr/>
         <w:t xml:space="preserve">ToComplete Method</w:t>
       </w:r>
-      <w:bookmarkEnd w:id="146"/>
+      <w:bookmarkEnd w:id="150"/>
     </w:p>
     <w:p>
       <w:pPr>
@@ -37880,7 +38560,7 @@
       <w:pPr>
         <w:pStyle w:val="TABLE-title"/>
       </w:pPr>
-      <w:bookmarkStart w:name="Sts_tbl_40" w:id="147"/>
+      <w:bookmarkStart w:name="Sts_tbl_40" w:id="151"/>
       <w:r>
         <w:t xml:space="preserve">Table </w:t>
       </w:r>
@@ -37900,7 +38580,7 @@
       <w:r>
         <w:fldChar w:fldCharType="end"/>
       </w:r>
-      <w:bookmarkEnd w:id="147"/>
+      <w:bookmarkEnd w:id="151"/>
       <w:r>
         <w:t xml:space="preserve"> – </w:t>
       </w:r>
@@ -38227,7 +38907,7 @@
       <w:pPr>
         <w:pStyle w:val="TABLE-title"/>
       </w:pPr>
-      <w:bookmarkStart w:name="Sts_tbl_41" w:id="148"/>
+      <w:bookmarkStart w:name="Sts_tbl_41" w:id="152"/>
       <w:r>
         <w:t xml:space="preserve">Table </w:t>
       </w:r>
@@ -38247,7 +38927,7 @@
       <w:r>
         <w:fldChar w:fldCharType="end"/>
       </w:r>
-      <w:bookmarkEnd w:id="148"/>
+      <w:bookmarkEnd w:id="152"/>
       <w:r>
         <w:t xml:space="preserve"> – </w:t>
       </w:r>
@@ -38457,12 +39137,12 @@
       <w:pPr>
         <w:pStyle w:val="Heading3"/>
       </w:pPr>
-      <w:bookmarkStart w:name="Sts_sec_6_7_10" w:id="149"/>
+      <w:bookmarkStart w:name="Sts_sec_6_7_10" w:id="153"/>
       <w:r>
         <w:rPr/>
         <w:t xml:space="preserve">Start Method</w:t>
       </w:r>
-      <w:bookmarkEnd w:id="149"/>
+      <w:bookmarkEnd w:id="153"/>
     </w:p>
     <w:p>
       <w:pPr>
@@ -38544,7 +39224,7 @@
       <w:pPr>
         <w:pStyle w:val="TABLE-title"/>
       </w:pPr>
-      <w:bookmarkStart w:name="Sts_tbl_42" w:id="150"/>
+      <w:bookmarkStart w:name="Sts_tbl_42" w:id="154"/>
       <w:r>
         <w:t xml:space="preserve">Table </w:t>
       </w:r>
@@ -38564,7 +39244,7 @@
       <w:r>
         <w:fldChar w:fldCharType="end"/>
       </w:r>
-      <w:bookmarkEnd w:id="150"/>
+      <w:bookmarkEnd w:id="154"/>
       <w:r>
         <w:t xml:space="preserve"> – </w:t>
       </w:r>
@@ -38677,7 +39357,7 @@
       <w:pPr>
         <w:pStyle w:val="TABLE-title"/>
       </w:pPr>
-      <w:bookmarkStart w:name="Sts_tbl_43" w:id="151"/>
+      <w:bookmarkStart w:name="Sts_tbl_43" w:id="155"/>
       <w:r>
         <w:t xml:space="preserve">Table </w:t>
       </w:r>
@@ -38697,7 +39377,7 @@
       <w:r>
         <w:fldChar w:fldCharType="end"/>
       </w:r>
-      <w:bookmarkEnd w:id="151"/>
+      <w:bookmarkEnd w:id="155"/>
       <w:r>
         <w:t xml:space="preserve"> – </w:t>
       </w:r>
@@ -39228,7 +39908,7 @@
       <w:pPr>
         <w:pStyle w:val="TABLE-title"/>
       </w:pPr>
-      <w:bookmarkStart w:name="Sts_tbl_44" w:id="152"/>
+      <w:bookmarkStart w:name="Sts_tbl_44" w:id="156"/>
       <w:r>
         <w:t xml:space="preserve">Table </w:t>
       </w:r>
@@ -39248,7 +39928,7 @@
       <w:r>
         <w:fldChar w:fldCharType="end"/>
       </w:r>
-      <w:bookmarkEnd w:id="152"/>
+      <w:bookmarkEnd w:id="156"/>
       <w:r>
         <w:t xml:space="preserve"> – </w:t>
       </w:r>
@@ -39536,12 +40216,12 @@
       <w:pPr>
         <w:pStyle w:val="Heading3"/>
       </w:pPr>
-      <w:bookmarkStart w:name="Sts_sec_6_7_11" w:id="153"/>
+      <w:bookmarkStart w:name="Sts_sec_6_7_11" w:id="157"/>
       <w:r>
         <w:rPr/>
         <w:t xml:space="preserve">Unhold Method</w:t>
       </w:r>
-      <w:bookmarkEnd w:id="153"/>
+      <w:bookmarkEnd w:id="157"/>
     </w:p>
     <w:p>
       <w:pPr>
@@ -39634,7 +40314,7 @@
       <w:pPr>
         <w:pStyle w:val="TABLE-title"/>
       </w:pPr>
-      <w:bookmarkStart w:name="Sts_tbl_45" w:id="154"/>
+      <w:bookmarkStart w:name="Sts_tbl_45" w:id="158"/>
       <w:r>
         <w:t xml:space="preserve">Table </w:t>
       </w:r>
@@ -39654,7 +40334,7 @@
       <w:r>
         <w:fldChar w:fldCharType="end"/>
       </w:r>
-      <w:bookmarkEnd w:id="154"/>
+      <w:bookmarkEnd w:id="158"/>
       <w:r>
         <w:t xml:space="preserve"> – </w:t>
       </w:r>
@@ -39981,7 +40661,7 @@
       <w:pPr>
         <w:pStyle w:val="TABLE-title"/>
       </w:pPr>
-      <w:bookmarkStart w:name="Sts_tbl_46" w:id="155"/>
+      <w:bookmarkStart w:name="Sts_tbl_46" w:id="159"/>
       <w:r>
         <w:t xml:space="preserve">Table </w:t>
       </w:r>
@@ -40001,7 +40681,7 @@
       <w:r>
         <w:fldChar w:fldCharType="end"/>
       </w:r>
-      <w:bookmarkEnd w:id="155"/>
+      <w:bookmarkEnd w:id="159"/>
       <w:r>
         <w:t xml:space="preserve"> – </w:t>
       </w:r>
@@ -40211,12 +40891,12 @@
       <w:pPr>
         <w:pStyle w:val="Heading3"/>
       </w:pPr>
-      <w:bookmarkStart w:name="Sts_sec_6_7_12" w:id="156"/>
+      <w:bookmarkStart w:name="Sts_sec_6_7_12" w:id="160"/>
       <w:r>
         <w:rPr/>
         <w:t xml:space="preserve">Suspend Method</w:t>
       </w:r>
-      <w:bookmarkEnd w:id="156"/>
+      <w:bookmarkEnd w:id="160"/>
     </w:p>
     <w:p>
       <w:pPr>
@@ -40305,7 +40985,7 @@
       <w:pPr>
         <w:pStyle w:val="TABLE-title"/>
       </w:pPr>
-      <w:bookmarkStart w:name="Sts_tbl_47" w:id="157"/>
+      <w:bookmarkStart w:name="Sts_tbl_47" w:id="161"/>
       <w:r>
         <w:t xml:space="preserve">Table </w:t>
       </w:r>
@@ -40325,7 +41005,7 @@
       <w:r>
         <w:fldChar w:fldCharType="end"/>
       </w:r>
-      <w:bookmarkEnd w:id="157"/>
+      <w:bookmarkEnd w:id="161"/>
       <w:r>
         <w:t xml:space="preserve"> – </w:t>
       </w:r>
@@ -40652,7 +41332,7 @@
       <w:pPr>
         <w:pStyle w:val="TABLE-title"/>
       </w:pPr>
-      <w:bookmarkStart w:name="Sts_tbl_48" w:id="158"/>
+      <w:bookmarkStart w:name="Sts_tbl_48" w:id="162"/>
       <w:r>
         <w:t xml:space="preserve">Table </w:t>
       </w:r>
@@ -40672,7 +41352,7 @@
       <w:r>
         <w:fldChar w:fldCharType="end"/>
       </w:r>
-      <w:bookmarkEnd w:id="158"/>
+      <w:bookmarkEnd w:id="162"/>
       <w:r>
         <w:t xml:space="preserve"> – </w:t>
       </w:r>
@@ -40882,12 +41562,12 @@
       <w:pPr>
         <w:pStyle w:val="Heading3"/>
       </w:pPr>
-      <w:bookmarkStart w:name="Sts_sec_6_7_13" w:id="159"/>
+      <w:bookmarkStart w:name="Sts_sec_6_7_13" w:id="163"/>
       <w:r>
         <w:rPr/>
         <w:t xml:space="preserve">Unsuspend Method</w:t>
       </w:r>
-      <w:bookmarkEnd w:id="159"/>
+      <w:bookmarkEnd w:id="163"/>
     </w:p>
     <w:p>
       <w:pPr>
@@ -40980,7 +41660,7 @@
       <w:pPr>
         <w:pStyle w:val="TABLE-title"/>
       </w:pPr>
-      <w:bookmarkStart w:name="Sts_tbl_49" w:id="160"/>
+      <w:bookmarkStart w:name="Sts_tbl_49" w:id="164"/>
       <w:r>
         <w:t xml:space="preserve">Table </w:t>
       </w:r>
@@ -41000,7 +41680,7 @@
       <w:r>
         <w:fldChar w:fldCharType="end"/>
       </w:r>
-      <w:bookmarkEnd w:id="160"/>
+      <w:bookmarkEnd w:id="164"/>
       <w:r>
         <w:t xml:space="preserve"> – </w:t>
       </w:r>
@@ -41347,7 +42027,7 @@
       <w:pPr>
         <w:pStyle w:val="TABLE-title"/>
       </w:pPr>
-      <w:bookmarkStart w:name="Sts_tbl_50" w:id="161"/>
+      <w:bookmarkStart w:name="Sts_tbl_50" w:id="165"/>
       <w:r>
         <w:t xml:space="preserve">Table </w:t>
       </w:r>
@@ -41367,7 +42047,7 @@
       <w:r>
         <w:fldChar w:fldCharType="end"/>
       </w:r>
-      <w:bookmarkEnd w:id="161"/>
+      <w:bookmarkEnd w:id="165"/>
       <w:r>
         <w:t xml:space="preserve"> – </w:t>
       </w:r>
@@ -41577,12 +42257,12 @@
       <w:pPr>
         <w:pStyle w:val="Heading3"/>
       </w:pPr>
-      <w:bookmarkStart w:name="Sts_sec_6_7_14" w:id="162"/>
+      <w:bookmarkStart w:name="Sts_sec_6_7_14" w:id="166"/>
       <w:r>
         <w:rPr/>
         <w:t xml:space="preserve">Hold Method</w:t>
       </w:r>
-      <w:bookmarkEnd w:id="162"/>
+      <w:bookmarkEnd w:id="166"/>
     </w:p>
     <w:p>
       <w:pPr>
@@ -41675,7 +42355,7 @@
       <w:pPr>
         <w:pStyle w:val="TABLE-title"/>
       </w:pPr>
-      <w:bookmarkStart w:name="Sts_tbl_51" w:id="163"/>
+      <w:bookmarkStart w:name="Sts_tbl_51" w:id="167"/>
       <w:r>
         <w:t xml:space="preserve">Table </w:t>
       </w:r>
@@ -41695,7 +42375,7 @@
       <w:r>
         <w:fldChar w:fldCharType="end"/>
       </w:r>
-      <w:bookmarkEnd w:id="163"/>
+      <w:bookmarkEnd w:id="167"/>
       <w:r>
         <w:t xml:space="preserve"> – </w:t>
       </w:r>
@@ -42022,7 +42702,7 @@
       <w:pPr>
         <w:pStyle w:val="TABLE-title"/>
       </w:pPr>
-      <w:bookmarkStart w:name="Sts_tbl_52" w:id="164"/>
+      <w:bookmarkStart w:name="Sts_tbl_52" w:id="168"/>
       <w:r>
         <w:t xml:space="preserve">Table </w:t>
       </w:r>
@@ -42042,7 +42722,7 @@
       <w:r>
         <w:fldChar w:fldCharType="end"/>
       </w:r>
-      <w:bookmarkEnd w:id="164"/>
+      <w:bookmarkEnd w:id="168"/>
       <w:r>
         <w:t xml:space="preserve"> – </w:t>
       </w:r>
@@ -42252,12 +42932,12 @@
       <w:pPr>
         <w:pStyle w:val="Heading3"/>
       </w:pPr>
-      <w:bookmarkStart w:name="Sts_sec_6_7_15" w:id="165"/>
+      <w:bookmarkStart w:name="Sts_sec_6_7_15" w:id="169"/>
       <w:r>
         <w:rPr/>
         <w:t xml:space="preserve">RemoteCommand Method</w:t>
       </w:r>
-      <w:bookmarkEnd w:id="165"/>
+      <w:bookmarkEnd w:id="169"/>
     </w:p>
     <w:p>
       <w:pPr>
@@ -42319,7 +42999,7 @@
                     <pic:cNvPicPr/>
                   </pic:nvPicPr>
                   <pic:blipFill>
-                    <a:blip r:embed="R624861b22c884a8e"/>
+                    <a:blip r:embed="Rf92edf6057574529"/>
                     <a:stretch>
                       <a:fillRect/>
                     </a:stretch>
@@ -42344,7 +43024,7 @@
       <w:pPr>
         <w:pStyle w:val="FIGURE-title"/>
       </w:pPr>
-      <w:bookmarkStart w:name="Sts_fig_19" w:id="166"/>
+      <w:bookmarkStart w:name="Sts_fig_19" w:id="170"/>
       <w:r>
         <w:t xml:space="preserve">Figure </w:t>
       </w:r>
@@ -42364,7 +43044,7 @@
       <w:r>
         <w:fldChar w:fldCharType="end"/>
       </w:r>
-      <w:bookmarkEnd w:id="166"/>
+      <w:bookmarkEnd w:id="170"/>
       <w:r>
         <w:t xml:space="preserve"> – </w:t>
       </w:r>
@@ -42394,7 +43074,7 @@
                     <pic:cNvPicPr/>
                   </pic:nvPicPr>
                   <pic:blipFill>
-                    <a:blip r:embed="R18d4483a94924f84"/>
+                    <a:blip r:embed="R3e7cef19d66d41d8"/>
                     <a:stretch>
                       <a:fillRect/>
                     </a:stretch>
@@ -42419,7 +43099,7 @@
       <w:pPr>
         <w:pStyle w:val="FIGURE-title"/>
       </w:pPr>
-      <w:bookmarkStart w:name="Sts_fig_20" w:id="167"/>
+      <w:bookmarkStart w:name="Sts_fig_20" w:id="171"/>
       <w:r>
         <w:t xml:space="preserve">Figure </w:t>
       </w:r>
@@ -42439,7 +43119,7 @@
       <w:r>
         <w:fldChar w:fldCharType="end"/>
       </w:r>
-      <w:bookmarkEnd w:id="167"/>
+      <w:bookmarkEnd w:id="171"/>
       <w:r>
         <w:t xml:space="preserve"> – </w:t>
       </w:r>
@@ -42498,7 +43178,7 @@
       <w:pPr>
         <w:pStyle w:val="TABLE-title"/>
       </w:pPr>
-      <w:bookmarkStart w:name="Sts_tbl_53" w:id="168"/>
+      <w:bookmarkStart w:name="Sts_tbl_53" w:id="172"/>
       <w:r>
         <w:t xml:space="preserve">Table </w:t>
       </w:r>
@@ -42518,7 +43198,7 @@
       <w:r>
         <w:fldChar w:fldCharType="end"/>
       </w:r>
-      <w:bookmarkEnd w:id="168"/>
+      <w:bookmarkEnd w:id="172"/>
       <w:r>
         <w:t xml:space="preserve"> – </w:t>
       </w:r>
@@ -42631,7 +43311,7 @@
       <w:pPr>
         <w:pStyle w:val="TABLE-title"/>
       </w:pPr>
-      <w:bookmarkStart w:name="Sts_tbl_54" w:id="169"/>
+      <w:bookmarkStart w:name="Sts_tbl_54" w:id="173"/>
       <w:r>
         <w:t xml:space="preserve">Table </w:t>
       </w:r>
@@ -42651,7 +43331,7 @@
       <w:r>
         <w:fldChar w:fldCharType="end"/>
       </w:r>
-      <w:bookmarkEnd w:id="169"/>
+      <w:bookmarkEnd w:id="173"/>
       <w:r>
         <w:t xml:space="preserve"> – </w:t>
       </w:r>
@@ -43234,7 +43914,7 @@
       <w:pPr>
         <w:pStyle w:val="TABLE-title"/>
       </w:pPr>
-      <w:bookmarkStart w:name="Sts_tbl_55" w:id="170"/>
+      <w:bookmarkStart w:name="Sts_tbl_55" w:id="174"/>
       <w:r>
         <w:t xml:space="preserve">Table </w:t>
       </w:r>
@@ -43254,7 +43934,7 @@
       <w:r>
         <w:fldChar w:fldCharType="end"/>
       </w:r>
-      <w:bookmarkEnd w:id="170"/>
+      <w:bookmarkEnd w:id="174"/>
       <w:r>
         <w:t xml:space="preserve"> – </w:t>
       </w:r>
@@ -43542,12 +44222,12 @@
       <w:pPr>
         <w:pStyle w:val="Heading3"/>
       </w:pPr>
-      <w:bookmarkStart w:name="Sts_sec_6_7_16" w:id="171"/>
+      <w:bookmarkStart w:name="Sts_sec_6_7_16" w:id="175"/>
       <w:r>
         <w:rPr/>
         <w:t xml:space="preserve">SetInterlock Method</w:t>
       </w:r>
-      <w:bookmarkEnd w:id="171"/>
+      <w:bookmarkEnd w:id="175"/>
     </w:p>
     <w:p>
       <w:pPr>
@@ -43633,7 +44313,7 @@
       <w:pPr>
         <w:pStyle w:val="TABLE-title"/>
       </w:pPr>
-      <w:bookmarkStart w:name="Sts_tbl_56" w:id="172"/>
+      <w:bookmarkStart w:name="Sts_tbl_56" w:id="176"/>
       <w:r>
         <w:t xml:space="preserve">Table </w:t>
       </w:r>
@@ -43653,7 +44333,7 @@
       <w:r>
         <w:fldChar w:fldCharType="end"/>
       </w:r>
-      <w:bookmarkEnd w:id="172"/>
+      <w:bookmarkEnd w:id="176"/>
       <w:r>
         <w:t xml:space="preserve"> – </w:t>
       </w:r>
@@ -43798,7 +44478,7 @@
       <w:pPr>
         <w:pStyle w:val="TABLE-title"/>
       </w:pPr>
-      <w:bookmarkStart w:name="Sts_tbl_57" w:id="173"/>
+      <w:bookmarkStart w:name="Sts_tbl_57" w:id="177"/>
       <w:r>
         <w:t xml:space="preserve">Table </w:t>
       </w:r>
@@ -43818,7 +44498,7 @@
       <w:r>
         <w:fldChar w:fldCharType="end"/>
       </w:r>
-      <w:bookmarkEnd w:id="173"/>
+      <w:bookmarkEnd w:id="177"/>
       <w:r>
         <w:t xml:space="preserve"> – </w:t>
       </w:r>
@@ -44401,7 +45081,7 @@
       <w:pPr>
         <w:pStyle w:val="TABLE-title"/>
       </w:pPr>
-      <w:bookmarkStart w:name="Sts_tbl_58" w:id="174"/>
+      <w:bookmarkStart w:name="Sts_tbl_58" w:id="178"/>
       <w:r>
         <w:t xml:space="preserve">Table </w:t>
       </w:r>
@@ -44421,7 +45101,7 @@
       <w:r>
         <w:fldChar w:fldCharType="end"/>
       </w:r>
-      <w:bookmarkEnd w:id="174"/>
+      <w:bookmarkEnd w:id="178"/>
       <w:r>
         <w:t xml:space="preserve"> – </w:t>
       </w:r>
@@ -44709,12 +45389,12 @@
       <w:pPr>
         <w:pStyle w:val="Heading3"/>
       </w:pPr>
-      <w:bookmarkStart w:name="Sts_sec_6_7_17" w:id="175"/>
+      <w:bookmarkStart w:name="Sts_sec_6_7_17" w:id="179"/>
       <w:r>
         <w:rPr/>
         <w:t xml:space="preserve">SetParameter Method</w:t>
       </w:r>
-      <w:bookmarkEnd w:id="175"/>
+      <w:bookmarkEnd w:id="179"/>
     </w:p>
     <w:p>
       <w:pPr>
@@ -44776,7 +45456,7 @@
       <w:pPr>
         <w:pStyle w:val="TABLE-title"/>
       </w:pPr>
-      <w:bookmarkStart w:name="Sts_tbl_59" w:id="176"/>
+      <w:bookmarkStart w:name="Sts_tbl_59" w:id="180"/>
       <w:r>
         <w:t xml:space="preserve">Table </w:t>
       </w:r>
@@ -44796,7 +45476,7 @@
       <w:r>
         <w:fldChar w:fldCharType="end"/>
       </w:r>
-      <w:bookmarkEnd w:id="176"/>
+      <w:bookmarkEnd w:id="180"/>
       <w:r>
         <w:t xml:space="preserve"> – </w:t>
       </w:r>
@@ -44909,7 +45589,7 @@
       <w:pPr>
         <w:pStyle w:val="TABLE-title"/>
       </w:pPr>
-      <w:bookmarkStart w:name="Sts_tbl_60" w:id="177"/>
+      <w:bookmarkStart w:name="Sts_tbl_60" w:id="181"/>
       <w:r>
         <w:t xml:space="preserve">Table </w:t>
       </w:r>
@@ -44929,7 +45609,7 @@
       <w:r>
         <w:fldChar w:fldCharType="end"/>
       </w:r>
-      <w:bookmarkEnd w:id="177"/>
+      <w:bookmarkEnd w:id="181"/>
       <w:r>
         <w:t xml:space="preserve"> – </w:t>
       </w:r>
@@ -45304,7 +45984,7 @@
       <w:pPr>
         <w:pStyle w:val="TABLE-title"/>
       </w:pPr>
-      <w:bookmarkStart w:name="Sts_tbl_61" w:id="178"/>
+      <w:bookmarkStart w:name="Sts_tbl_61" w:id="182"/>
       <w:r>
         <w:t xml:space="preserve">Table </w:t>
       </w:r>
@@ -45324,7 +46004,7 @@
       <w:r>
         <w:fldChar w:fldCharType="end"/>
       </w:r>
-      <w:bookmarkEnd w:id="178"/>
+      <w:bookmarkEnd w:id="182"/>
       <w:r>
         <w:t xml:space="preserve"> – </w:t>
       </w:r>
@@ -45612,23 +46292,23 @@
       <w:pPr>
         <w:pStyle w:val="Heading2"/>
       </w:pPr>
-      <w:bookmarkStart w:name="Sts_sec_6_8" w:id="179"/>
+      <w:bookmarkStart w:name="Sts_sec_6_8" w:id="183"/>
       <w:r>
         <w:rPr/>
         <w:t xml:space="preserve">Alarms</w:t>
       </w:r>
-      <w:bookmarkEnd w:id="179"/>
+      <w:bookmarkEnd w:id="183"/>
     </w:p>
     <w:p>
       <w:pPr>
         <w:pStyle w:val="Heading3"/>
       </w:pPr>
-      <w:bookmarkStart w:name="Sts_sec_6_8_1" w:id="180"/>
+      <w:bookmarkStart w:name="Sts_sec_6_8_1" w:id="184"/>
       <w:r>
         <w:rPr/>
         <w:t xml:space="preserve">Overview</w:t>
       </w:r>
-      <w:bookmarkEnd w:id="180"/>
+      <w:bookmarkEnd w:id="184"/>
     </w:p>
     <w:p>
       <w:pPr>
@@ -45683,23 +46363,23 @@
       <w:pPr>
         <w:pStyle w:val="Heading3"/>
       </w:pPr>
-      <w:bookmarkStart w:name="Sts_sec_6_8_2" w:id="181"/>
+      <w:bookmarkStart w:name="Sts_sec_6_8_2" w:id="185"/>
       <w:r>
         <w:rPr/>
         <w:t xml:space="preserve">Alarm Tags</w:t>
       </w:r>
-      <w:bookmarkEnd w:id="181"/>
+      <w:bookmarkEnd w:id="185"/>
     </w:p>
     <w:p>
       <w:pPr>
         <w:pStyle w:val="Heading4"/>
       </w:pPr>
-      <w:bookmarkStart w:name="Sts_sec_6_8_2_1" w:id="182"/>
+      <w:bookmarkStart w:name="Sts_sec_6_8_2_1" w:id="186"/>
       <w:r>
         <w:rPr/>
         <w:t xml:space="preserve">Overview</w:t>
       </w:r>
-      <w:bookmarkEnd w:id="182"/>
+      <w:bookmarkEnd w:id="186"/>
     </w:p>
     <w:p>
       <w:pPr>
@@ -45724,12 +46404,12 @@
       <w:pPr>
         <w:pStyle w:val="Heading4"/>
       </w:pPr>
-      <w:bookmarkStart w:name="Sts_sec_6_8_2_2" w:id="183"/>
+      <w:bookmarkStart w:name="Sts_sec_6_8_2_2" w:id="187"/>
       <w:r>
         <w:rPr/>
         <w:t xml:space="preserve">PackMLAlarmDataType</w:t>
       </w:r>
-      <w:bookmarkEnd w:id="183"/>
+      <w:bookmarkEnd w:id="187"/>
     </w:p>
     <w:p>
       <w:pPr>
@@ -45744,7 +46424,7 @@
       <w:pPr>
         <w:pStyle w:val="TABLE-title"/>
       </w:pPr>
-      <w:bookmarkStart w:name="Sts_tbl_62" w:id="184"/>
+      <w:bookmarkStart w:name="Sts_tbl_62" w:id="188"/>
       <w:r>
         <w:t xml:space="preserve">Table </w:t>
       </w:r>
@@ -45764,7 +46444,7 @@
       <w:r>
         <w:fldChar w:fldCharType="end"/>
       </w:r>
-      <w:bookmarkEnd w:id="184"/>
+      <w:bookmarkEnd w:id="188"/>
       <w:r>
         <w:t xml:space="preserve"> – </w:t>
       </w:r>
@@ -46209,12 +46889,12 @@
       <w:pPr>
         <w:pStyle w:val="Heading3"/>
       </w:pPr>
-      <w:bookmarkStart w:name="Sts_sec_6_8_3" w:id="185"/>
+      <w:bookmarkStart w:name="Sts_sec_6_8_3" w:id="189"/>
       <w:r>
         <w:rPr/>
         <w:t xml:space="preserve">Alarm Events</w:t>
       </w:r>
-      <w:bookmarkEnd w:id="185"/>
+      <w:bookmarkEnd w:id="189"/>
     </w:p>
     <w:p>
       <w:pPr>
@@ -46229,23 +46909,23 @@
       <w:pPr>
         <w:pStyle w:val="Heading1"/>
       </w:pPr>
-      <w:bookmarkStart w:name="Sts_sec_7" w:id="186"/>
+      <w:bookmarkStart w:name="Sts_sec_7" w:id="190"/>
       <w:r>
         <w:rPr/>
         <w:t xml:space="preserve">Profiles and Conformance Units</w:t>
       </w:r>
-      <w:bookmarkEnd w:id="186"/>
+      <w:bookmarkEnd w:id="190"/>
     </w:p>
     <w:p>
       <w:pPr>
         <w:pStyle w:val="Heading2"/>
       </w:pPr>
-      <w:bookmarkStart w:name="Sts_sec_7_1" w:id="187"/>
+      <w:bookmarkStart w:name="Sts_sec_7_1" w:id="191"/>
       <w:r>
         <w:rPr/>
         <w:t xml:space="preserve">Conformance Units</w:t>
       </w:r>
-      <w:bookmarkEnd w:id="187"/>
+      <w:bookmarkEnd w:id="191"/>
     </w:p>
     <w:p>
       <w:pPr>
@@ -46276,7 +46956,7 @@
       <w:pPr>
         <w:pStyle w:val="TABLE-title"/>
       </w:pPr>
-      <w:bookmarkStart w:name="Sts_tbl_63" w:id="188"/>
+      <w:bookmarkStart w:name="Sts_tbl_63" w:id="192"/>
       <w:r>
         <w:t xml:space="preserve">Table </w:t>
       </w:r>
@@ -46296,7 +46976,7 @@
       <w:r>
         <w:fldChar w:fldCharType="end"/>
       </w:r>
-      <w:bookmarkEnd w:id="188"/>
+      <w:bookmarkEnd w:id="192"/>
       <w:r>
         <w:t xml:space="preserve"> – </w:t>
       </w:r>
@@ -50186,23 +50866,23 @@
       <w:pPr>
         <w:pStyle w:val="Heading2"/>
       </w:pPr>
-      <w:bookmarkStart w:name="Sts_sec_7_2" w:id="189"/>
+      <w:bookmarkStart w:name="Sts_sec_7_2" w:id="193"/>
       <w:r>
         <w:rPr/>
         <w:t xml:space="preserve">Profiles</w:t>
       </w:r>
-      <w:bookmarkEnd w:id="189"/>
+      <w:bookmarkEnd w:id="193"/>
     </w:p>
     <w:p>
       <w:pPr>
         <w:pStyle w:val="Heading3"/>
       </w:pPr>
-      <w:bookmarkStart w:name="Sts_sec_7_2_1" w:id="190"/>
+      <w:bookmarkStart w:name="Sts_sec_7_2_1" w:id="194"/>
       <w:r>
         <w:rPr/>
         <w:t xml:space="preserve">Profile list</w:t>
       </w:r>
-      <w:bookmarkEnd w:id="190"/>
+      <w:bookmarkEnd w:id="194"/>
     </w:p>
     <w:p>
       <w:pPr>
@@ -50233,7 +50913,7 @@
       <w:pPr>
         <w:pStyle w:val="TABLE-title"/>
       </w:pPr>
-      <w:bookmarkStart w:name="Sts_tbl_64" w:id="191"/>
+      <w:bookmarkStart w:name="Sts_tbl_64" w:id="195"/>
       <w:r>
         <w:t xml:space="preserve">Table </w:t>
       </w:r>
@@ -50253,7 +50933,7 @@
       <w:r>
         <w:fldChar w:fldCharType="end"/>
       </w:r>
-      <w:bookmarkEnd w:id="191"/>
+      <w:bookmarkEnd w:id="195"/>
       <w:r>
         <w:t xml:space="preserve"> – </w:t>
       </w:r>
@@ -50334,7 +51014,7 @@
             <w:pPr>
               <w:pStyle w:val="TABLE-cell"/>
             </w:pPr>
-            <w:hyperlink r:id="Rec31a8d5f90b4aa4">
+            <w:hyperlink r:id="Rc11a532cd8b04d37">
               <w:r>
                 <w:rPr>
                   <w:rStyle w:val="Hyperlink"/>
@@ -50370,7 +51050,7 @@
             <w:pPr>
               <w:pStyle w:val="TABLE-cell"/>
             </w:pPr>
-            <w:hyperlink r:id="Re11a2eac5cab4067">
+            <w:hyperlink r:id="Rb23cd18b1e824d17">
               <w:r>
                 <w:rPr>
                   <w:rStyle w:val="Hyperlink"/>
@@ -50391,23 +51071,23 @@
       <w:pPr>
         <w:pStyle w:val="Heading3"/>
       </w:pPr>
-      <w:bookmarkStart w:name="Sts_sec_7_2_2" w:id="192"/>
+      <w:bookmarkStart w:name="Sts_sec_7_2_2" w:id="196"/>
       <w:r>
         <w:rPr/>
         <w:t xml:space="preserve">PackML Facets</w:t>
       </w:r>
-      <w:bookmarkEnd w:id="192"/>
+      <w:bookmarkEnd w:id="196"/>
     </w:p>
     <w:p>
       <w:pPr>
         <w:pStyle w:val="Heading4"/>
       </w:pPr>
-      <w:bookmarkStart w:name="Sts_sec_7_2_2_1" w:id="193"/>
+      <w:bookmarkStart w:name="Sts_sec_7_2_2_1" w:id="197"/>
       <w:r>
         <w:rPr/>
         <w:t xml:space="preserve">Overview</w:t>
       </w:r>
-      <w:bookmarkEnd w:id="193"/>
+      <w:bookmarkEnd w:id="197"/>
     </w:p>
     <w:p>
       <w:pPr>
@@ -50422,12 +51102,12 @@
       <w:pPr>
         <w:pStyle w:val="Heading4"/>
       </w:pPr>
-      <w:bookmarkStart w:name="Sts_sec_7_2_2_2" w:id="194"/>
+      <w:bookmarkStart w:name="Sts_sec_7_2_2_2" w:id="198"/>
       <w:r>
         <w:rPr/>
         <w:t xml:space="preserve">PackML Base Functionality Server Facet</w:t>
       </w:r>
-      <w:bookmarkEnd w:id="194"/>
+      <w:bookmarkEnd w:id="198"/>
     </w:p>
     <w:p>
       <w:pPr>
@@ -50442,7 +51122,7 @@
       <w:pPr>
         <w:pStyle w:val="TABLE-title"/>
       </w:pPr>
-      <w:bookmarkStart w:name="Sts_tbl_65" w:id="195"/>
+      <w:bookmarkStart w:name="Sts_tbl_65" w:id="199"/>
       <w:r>
         <w:t xml:space="preserve">Table </w:t>
       </w:r>
@@ -50462,7 +51142,7 @@
       <w:r>
         <w:fldChar w:fldCharType="end"/>
       </w:r>
-      <w:bookmarkEnd w:id="195"/>
+      <w:bookmarkEnd w:id="199"/>
       <w:r>
         <w:t xml:space="preserve"> – </w:t>
       </w:r>
@@ -52472,23 +53152,23 @@
       <w:pPr>
         <w:pStyle w:val="Heading3"/>
       </w:pPr>
-      <w:bookmarkStart w:name="Sts_sec_7_2_3" w:id="196"/>
+      <w:bookmarkStart w:name="Sts_sec_7_2_3" w:id="200"/>
       <w:r>
         <w:rPr/>
         <w:t xml:space="preserve">PackML Base</w:t>
       </w:r>
-      <w:bookmarkEnd w:id="196"/>
+      <w:bookmarkEnd w:id="200"/>
     </w:p>
     <w:p>
       <w:pPr>
         <w:pStyle w:val="Heading4"/>
       </w:pPr>
-      <w:bookmarkStart w:name="Sts_sec_7_2_3_1" w:id="197"/>
+      <w:bookmarkStart w:name="Sts_sec_7_2_3_1" w:id="201"/>
       <w:r>
         <w:rPr/>
         <w:t xml:space="preserve">Overview</w:t>
       </w:r>
-      <w:bookmarkEnd w:id="197"/>
+      <w:bookmarkEnd w:id="201"/>
     </w:p>
     <w:p>
       <w:pPr>
@@ -52503,12 +53183,12 @@
       <w:pPr>
         <w:pStyle w:val="Heading4"/>
       </w:pPr>
-      <w:bookmarkStart w:name="Sts_sec_7_2_3_2" w:id="198"/>
+      <w:bookmarkStart w:name="Sts_sec_7_2_3_2" w:id="202"/>
       <w:r>
         <w:rPr/>
         <w:t xml:space="preserve">PackML Base Functionality Client Facet</w:t>
       </w:r>
-      <w:bookmarkEnd w:id="198"/>
+      <w:bookmarkEnd w:id="202"/>
     </w:p>
     <w:p>
       <w:pPr>
@@ -52523,7 +53203,7 @@
       <w:pPr>
         <w:pStyle w:val="TABLE-title"/>
       </w:pPr>
-      <w:bookmarkStart w:name="Sts_tbl_66" w:id="199"/>
+      <w:bookmarkStart w:name="Sts_tbl_66" w:id="203"/>
       <w:r>
         <w:t xml:space="preserve">Table </w:t>
       </w:r>
@@ -52543,7 +53223,7 @@
       <w:r>
         <w:fldChar w:fldCharType="end"/>
       </w:r>
-      <w:bookmarkEnd w:id="199"/>
+      <w:bookmarkEnd w:id="203"/>
       <w:r>
         <w:t xml:space="preserve"> – </w:t>
       </w:r>
@@ -54553,23 +55233,23 @@
       <w:pPr>
         <w:pStyle w:val="Heading1"/>
       </w:pPr>
-      <w:bookmarkStart w:name="Sts_sec_8" w:id="200"/>
+      <w:bookmarkStart w:name="Sts_sec_8" w:id="204"/>
       <w:r>
         <w:rPr/>
         <w:t xml:space="preserve">Namespaces</w:t>
       </w:r>
-      <w:bookmarkEnd w:id="200"/>
+      <w:bookmarkEnd w:id="204"/>
     </w:p>
     <w:p>
       <w:pPr>
         <w:pStyle w:val="Heading2"/>
       </w:pPr>
-      <w:bookmarkStart w:name="Sts_sec_8_1" w:id="201"/>
+      <w:bookmarkStart w:name="Sts_sec_8_1" w:id="205"/>
       <w:r>
         <w:rPr/>
         <w:t xml:space="preserve">Namespace Metadata</w:t>
       </w:r>
-      <w:bookmarkEnd w:id="201"/>
+      <w:bookmarkEnd w:id="205"/>
     </w:p>
     <w:p>
       <w:pPr>
@@ -54698,7 +55378,7 @@
       <w:pPr>
         <w:pStyle w:val="TABLE-title"/>
       </w:pPr>
-      <w:bookmarkStart w:name="Sts_tbl_67" w:id="202"/>
+      <w:bookmarkStart w:name="Sts_tbl_67" w:id="206"/>
       <w:r>
         <w:t xml:space="preserve">Table </w:t>
       </w:r>
@@ -54718,7 +55398,7 @@
       <w:r>
         <w:fldChar w:fldCharType="end"/>
       </w:r>
-      <w:bookmarkEnd w:id="202"/>
+      <w:bookmarkEnd w:id="206"/>
       <w:r>
         <w:t xml:space="preserve"> – </w:t>
       </w:r>
@@ -55217,12 +55897,12 @@
       <w:pPr>
         <w:pStyle w:val="Heading2"/>
       </w:pPr>
-      <w:bookmarkStart w:name="Sts_sec_8_2" w:id="203"/>
+      <w:bookmarkStart w:name="Sts_sec_8_2" w:id="207"/>
       <w:r>
         <w:rPr/>
         <w:t xml:space="preserve">Handling of OPC UA Namespaces</w:t>
       </w:r>
-      <w:bookmarkEnd w:id="203"/>
+      <w:bookmarkEnd w:id="207"/>
     </w:p>
     <w:p>
       <w:pPr>
@@ -55302,7 +55982,7 @@
       <w:pPr>
         <w:pStyle w:val="TABLE-title"/>
       </w:pPr>
-      <w:bookmarkStart w:name="Sts_tbl_68" w:id="204"/>
+      <w:bookmarkStart w:name="Sts_tbl_68" w:id="208"/>
       <w:r>
         <w:t xml:space="preserve">Table </w:t>
       </w:r>
@@ -55322,7 +56002,7 @@
       <w:r>
         <w:fldChar w:fldCharType="end"/>
       </w:r>
-      <w:bookmarkEnd w:id="204"/>
+      <w:bookmarkEnd w:id="208"/>
       <w:r>
         <w:t xml:space="preserve"> – </w:t>
       </w:r>
@@ -55661,7 +56341,7 @@
       <w:pPr>
         <w:pStyle w:val="TABLE-title"/>
       </w:pPr>
-      <w:bookmarkStart w:name="Sts_tbl_69" w:id="205"/>
+      <w:bookmarkStart w:name="Sts_tbl_69" w:id="209"/>
       <w:r>
         <w:t xml:space="preserve">Table </w:t>
       </w:r>
@@ -55681,7 +56361,7 @@
       <w:r>
         <w:fldChar w:fldCharType="end"/>
       </w:r>
-      <w:bookmarkEnd w:id="205"/>
+      <w:bookmarkEnd w:id="209"/>
       <w:r>
         <w:t xml:space="preserve"> – </w:t>
       </w:r>
@@ -55953,18 +56633,18 @@
       <w:r>
         <w:br/>
       </w:r>
-      <w:bookmarkStart w:name="Sts_sec_A" w:id="206"/>
+      <w:bookmarkStart w:name="Sts_sec_A" w:id="210"/>
       <w:r>
         <w:rPr/>
         <w:t xml:space="preserve">Recommended localized names</w:t>
       </w:r>
-      <w:bookmarkEnd w:id="206"/>
+      <w:bookmarkEnd w:id="210"/>
     </w:p>
     <w:p>
       <w:pPr>
         <w:pStyle w:val="ANNEX-heading1"/>
       </w:pPr>
-      <w:bookmarkStart w:name="Sts_sec_A_1" w:id="207"/>
+      <w:bookmarkStart w:name="Sts_sec_A_1" w:id="211"/>
       <w:r>
         <w:rPr/>
         <w:t xml:space="preserve">Recommended state names for </w:t>
@@ -55985,18 +56665,18 @@
         </w:rPr>
         <w:t xml:space="preserve">Variables</w:t>
       </w:r>
-      <w:bookmarkEnd w:id="207"/>
+      <w:bookmarkEnd w:id="211"/>
     </w:p>
     <w:p>
       <w:pPr>
         <w:pStyle w:val="ANNEX-heading2"/>
       </w:pPr>
-      <w:bookmarkStart w:name="Sts_sec_A_1_1" w:id="208"/>
+      <w:bookmarkStart w:name="Sts_sec_A_1_1" w:id="212"/>
       <w:r>
         <w:rPr/>
         <w:t xml:space="preserve">LocaleID "en"</w:t>
       </w:r>
-      <w:bookmarkEnd w:id="208"/>
+      <w:bookmarkEnd w:id="212"/>
     </w:p>
     <w:p>
       <w:pPr>
@@ -56021,7 +56701,7 @@
       <w:pPr>
         <w:pStyle w:val="TABLE-title"/>
       </w:pPr>
-      <w:bookmarkStart w:name="Sts_tbl_70" w:id="209"/>
+      <w:bookmarkStart w:name="Sts_tbl_70" w:id="213"/>
       <w:r>
         <w:t xml:space="preserve">Table </w:t>
       </w:r>
@@ -56041,7 +56721,7 @@
       <w:r>
         <w:fldChar w:fldCharType="end"/>
       </w:r>
-      <w:bookmarkEnd w:id="209"/>
+      <w:bookmarkEnd w:id="213"/>
       <w:r>
         <w:t xml:space="preserve"> – </w:t>
       </w:r>
@@ -57255,12 +57935,12 @@
       <w:pPr>
         <w:pStyle w:val="ANNEX-heading2"/>
       </w:pPr>
-      <w:bookmarkStart w:name="Sts_sec_A_1_2" w:id="210"/>
+      <w:bookmarkStart w:name="Sts_sec_A_1_2" w:id="214"/>
       <w:r>
         <w:rPr/>
         <w:t xml:space="preserve">LocaleID "de"</w:t>
       </w:r>
-      <w:bookmarkEnd w:id="210"/>
+      <w:bookmarkEnd w:id="214"/>
     </w:p>
     <w:p>
       <w:pPr>
@@ -57275,7 +57955,7 @@
       <w:pPr>
         <w:pStyle w:val="TABLE-title"/>
       </w:pPr>
-      <w:bookmarkStart w:name="Sts_tbl_71" w:id="211"/>
+      <w:bookmarkStart w:name="Sts_tbl_71" w:id="215"/>
       <w:r>
         <w:t xml:space="preserve">Table </w:t>
       </w:r>
@@ -57295,7 +57975,7 @@
       <w:r>
         <w:fldChar w:fldCharType="end"/>
       </w:r>
-      <w:bookmarkEnd w:id="211"/>
+      <w:bookmarkEnd w:id="215"/>
       <w:r>
         <w:t xml:space="preserve"> – </w:t>
       </w:r>
@@ -58509,12 +59189,12 @@
       <w:pPr>
         <w:pStyle w:val="ANNEX-heading2"/>
       </w:pPr>
-      <w:bookmarkStart w:name="Sts_sec_A_1_3" w:id="212"/>
+      <w:bookmarkStart w:name="Sts_sec_A_1_3" w:id="216"/>
       <w:r>
         <w:rPr/>
         <w:t xml:space="preserve">LocaleID "fr"</w:t>
       </w:r>
-      <w:bookmarkEnd w:id="212"/>
+      <w:bookmarkEnd w:id="216"/>
     </w:p>
     <w:p>
       <w:pPr>
@@ -58529,7 +59209,7 @@
       <w:pPr>
         <w:pStyle w:val="TABLE-title"/>
       </w:pPr>
-      <w:bookmarkStart w:name="Sts_tbl_72" w:id="213"/>
+      <w:bookmarkStart w:name="Sts_tbl_72" w:id="217"/>
       <w:r>
         <w:t xml:space="preserve">Table </w:t>
       </w:r>
@@ -58549,7 +59229,7 @@
       <w:r>
         <w:fldChar w:fldCharType="end"/>
       </w:r>
-      <w:bookmarkEnd w:id="213"/>
+      <w:bookmarkEnd w:id="217"/>
       <w:r>
         <w:t xml:space="preserve"> – </w:t>
       </w:r>
@@ -59772,23 +60452,23 @@
       <w:r>
         <w:br/>
       </w:r>
-      <w:bookmarkStart w:name="Sts_sec_B" w:id="214"/>
+      <w:bookmarkStart w:name="Sts_sec_B" w:id="218"/>
       <w:r>
         <w:rPr/>
         <w:t xml:space="preserve">DataType</w:t>
       </w:r>
-      <w:bookmarkEnd w:id="214"/>
+      <w:bookmarkEnd w:id="218"/>
     </w:p>
     <w:p>
       <w:pPr>
         <w:pStyle w:val="ANNEX-heading1"/>
       </w:pPr>
-      <w:bookmarkStart w:name="Sts_sec_B_1" w:id="215"/>
+      <w:bookmarkStart w:name="Sts_sec_B_1" w:id="219"/>
       <w:r>
         <w:rPr/>
         <w:t xml:space="preserve">Mapping of elementary data types</w:t>
       </w:r>
-      <w:bookmarkEnd w:id="215"/>
+      <w:bookmarkEnd w:id="219"/>
     </w:p>
     <w:p>
       <w:pPr>
@@ -59843,7 +60523,7 @@
       <w:pPr>
         <w:pStyle w:val="TABLE-title"/>
       </w:pPr>
-      <w:bookmarkStart w:name="Sts_tbl_73" w:id="216"/>
+      <w:bookmarkStart w:name="Sts_tbl_73" w:id="220"/>
       <w:r>
         <w:t xml:space="preserve">Table </w:t>
       </w:r>
@@ -59863,7 +60543,7 @@
       <w:r>
         <w:fldChar w:fldCharType="end"/>
       </w:r>
-      <w:bookmarkEnd w:id="216"/>
+      <w:bookmarkEnd w:id="220"/>
       <w:r>
         <w:t xml:space="preserve"> – </w:t>
       </w:r>
@@ -61027,12 +61707,12 @@
       <w:pPr>
         <w:pStyle w:val="ANNEX-heading1"/>
       </w:pPr>
-      <w:bookmarkStart w:name="Sts_sec_B_2" w:id="217"/>
+      <w:bookmarkStart w:name="Sts_sec_B_2" w:id="221"/>
       <w:r>
         <w:rPr/>
         <w:t xml:space="preserve">Mapping of generic data types</w:t>
       </w:r>
-      <w:bookmarkEnd w:id="217"/>
+      <w:bookmarkEnd w:id="221"/>
     </w:p>
     <w:p>
       <w:pPr>
@@ -61107,7 +61787,7 @@
       <w:pPr>
         <w:pStyle w:val="TABLE-title"/>
       </w:pPr>
-      <w:bookmarkStart w:name="Sts_tbl_74" w:id="218"/>
+      <w:bookmarkStart w:name="Sts_tbl_74" w:id="222"/>
       <w:r>
         <w:t xml:space="preserve">Table </w:t>
       </w:r>
@@ -61127,7 +61807,7 @@
       <w:r>
         <w:fldChar w:fldCharType="end"/>
       </w:r>
-      <w:bookmarkEnd w:id="218"/>
+      <w:bookmarkEnd w:id="222"/>
       <w:r>
         <w:t xml:space="preserve"> – </w:t>
       </w:r>
@@ -61680,23 +62360,23 @@
       <w:pPr>
         <w:pStyle w:val="ANNEX-heading1"/>
       </w:pPr>
-      <w:bookmarkStart w:name="Sts_sec_B_3" w:id="219"/>
+      <w:bookmarkStart w:name="Sts_sec_B_3" w:id="223"/>
       <w:r>
         <w:rPr/>
         <w:t xml:space="preserve">Mapping of derived data types</w:t>
       </w:r>
-      <w:bookmarkEnd w:id="219"/>
+      <w:bookmarkEnd w:id="223"/>
     </w:p>
     <w:p>
       <w:pPr>
         <w:pStyle w:val="ANNEX-heading2"/>
       </w:pPr>
-      <w:bookmarkStart w:name="Sts_sec_B_3_1" w:id="220"/>
+      <w:bookmarkStart w:name="Sts_sec_B_3_1" w:id="224"/>
       <w:r>
         <w:rPr/>
         <w:t xml:space="preserve">Mapping of enumerated data types</w:t>
       </w:r>
-      <w:bookmarkEnd w:id="220"/>
+      <w:bookmarkEnd w:id="224"/>
     </w:p>
     <w:p>
       <w:pPr>
@@ -61889,12 +62569,12 @@
       <w:pPr>
         <w:pStyle w:val="ANNEX-heading2"/>
       </w:pPr>
-      <w:bookmarkStart w:name="Sts_sec_B_3_2" w:id="221"/>
+      <w:bookmarkStart w:name="Sts_sec_B_3_2" w:id="225"/>
       <w:r>
         <w:rPr/>
         <w:t xml:space="preserve">Mapping of array data types</w:t>
       </w:r>
-      <w:bookmarkEnd w:id="221"/>
+      <w:bookmarkEnd w:id="225"/>
     </w:p>
     <w:p>
       <w:pPr>
@@ -62076,23 +62756,23 @@
       <w:r>
         <w:br/>
       </w:r>
-      <w:bookmarkStart w:name="Sts_sec_C" w:id="222"/>
+      <w:bookmarkStart w:name="Sts_sec_C" w:id="226"/>
       <w:r>
         <w:rPr/>
         <w:t xml:space="preserve">Namespaces and Mappings</w:t>
       </w:r>
-      <w:bookmarkEnd w:id="222"/>
+      <w:bookmarkEnd w:id="226"/>
     </w:p>
     <w:p>
       <w:pPr>
         <w:pStyle w:val="ANNEX-heading1"/>
       </w:pPr>
-      <w:bookmarkStart w:name="Sts_sec_C_1" w:id="223"/>
+      <w:bookmarkStart w:name="Sts_sec_C_1" w:id="227"/>
       <w:r>
         <w:rPr/>
         <w:t xml:space="preserve">NodeSets and Supplementary Files</w:t>
       </w:r>
-      <w:bookmarkEnd w:id="223"/>
+      <w:bookmarkEnd w:id="227"/>
     </w:p>
     <w:p>
       <w:pPr>
@@ -62117,7 +62797,7 @@
       <w:pPr>
         <w:pStyle w:val="PARAGRAPH"/>
       </w:pPr>
-      <w:hyperlink r:id="R96036e7f0d7d4142">
+      <w:hyperlink r:id="R50021c98009b4e95">
         <w:r>
           <w:rPr>
             <w:rStyle w:val="Hyperlink"/>
@@ -62144,7 +62824,7 @@
         <w:rPr/>
         <w:t xml:space="preserve"> can be found </w:t>
       </w:r>
-      <w:hyperlink r:id="R3646ea39346e4a45">
+      <w:hyperlink r:id="R60ce4a3d730b4d58">
         <w:r>
           <w:rPr>
             <w:rStyle w:val="Hyperlink"/>
@@ -62170,7 +62850,7 @@
       <w:pPr>
         <w:pStyle w:val="PARAGRAPH"/>
       </w:pPr>
-      <w:hyperlink r:id="R01ce9b03bba94191">
+      <w:hyperlink r:id="R66db76d0b2464219">
         <w:r>
           <w:rPr>
             <w:rStyle w:val="Hyperlink"/>
@@ -62192,7 +62872,7 @@
       <w:pPr>
         <w:pStyle w:val="PARAGRAPH"/>
       </w:pPr>
-      <w:hyperlink r:id="R72221ab49af440bd">
+      <w:hyperlink r:id="R03c3d81c965844eb">
         <w:r>
           <w:rPr>
             <w:rStyle w:val="Hyperlink"/>
@@ -62214,7 +62894,7 @@
       <w:pPr>
         <w:pStyle w:val="PARAGRAPH"/>
       </w:pPr>
-      <w:hyperlink r:id="R5a6f40deda3f427d">
+      <w:hyperlink r:id="R0de0d18d965941ab">
         <w:r>
           <w:rPr>
             <w:rStyle w:val="Hyperlink"/>
@@ -62236,7 +62916,7 @@
       <w:pPr>
         <w:pStyle w:val="PARAGRAPH"/>
       </w:pPr>
-      <w:hyperlink r:id="Rd9691a341f574dd2">
+      <w:hyperlink r:id="R2fb134bf99634270">
         <w:r>
           <w:rPr>
             <w:rStyle w:val="Hyperlink"/>

</xml_diff>

<commit_message>
Rebuild STS and the browsable specification from ea0b9a4f
Generated by .github/workflows/publish.yml. Edit source/, model/ or
manifest.json — never artifacts/ or docs/, which the next build discards.
</commit_message>
<xml_diff>
--- a/artifacts/OPC-30050.docx
+++ b/artifacts/OPC-30050.docx
@@ -80,7 +80,7 @@
                                 <pic:cNvPicPr/>
                               </pic:nvPicPr>
                               <pic:blipFill>
-                                <a:blip r:embed="Rdd3cde08a3184f97"/>
+                                <a:blip r:embed="Ra01e0f0105d340b2"/>
                                 <a:stretch>
                                   <a:fillRect/>
                                 </a:stretch>
@@ -183,7 +183,7 @@
                                 <pic:cNvPicPr/>
                               </pic:nvPicPr>
                               <pic:blipFill>
-                                <a:blip r:embed="R7c0fe716db3840c9"/>
+                                <a:blip r:embed="R6a376528dfa44222"/>
                                 <a:stretch>
                                   <a:fillRect/>
                                 </a:stretch>
@@ -1485,7 +1485,7 @@
         <w:spacing w:before="60"/>
         <w:ind w:left="340"/>
       </w:pPr>
-      <w:hyperlink r:id="R47c0451baf7a424c">
+      <w:hyperlink r:id="R4388d552fcc44163">
         <w:r>
           <w:rPr>
             <w:rStyle w:val="Hyperlink"/>
@@ -1520,7 +1520,7 @@
         <w:spacing w:before="60"/>
         <w:ind w:left="340"/>
       </w:pPr>
-      <w:hyperlink r:id="R6cf64c4c6d6f4343">
+      <w:hyperlink r:id="R70dd215fb880470d">
         <w:r>
           <w:rPr>
             <w:rStyle w:val="Hyperlink"/>
@@ -1555,7 +1555,7 @@
         <w:spacing w:before="60"/>
         <w:ind w:left="340"/>
       </w:pPr>
-      <w:hyperlink r:id="R1ff765550c27473d">
+      <w:hyperlink r:id="Rbdfcc7a3b3694cd7">
         <w:r>
           <w:rPr>
             <w:rStyle w:val="Hyperlink"/>
@@ -1590,7 +1590,7 @@
         <w:spacing w:before="60"/>
         <w:ind w:left="340"/>
       </w:pPr>
-      <w:hyperlink r:id="R3c1c39d755ab40da">
+      <w:hyperlink r:id="R6ae8b06f2ed94149">
         <w:r>
           <w:rPr>
             <w:rStyle w:val="Hyperlink"/>
@@ -1625,7 +1625,7 @@
         <w:spacing w:before="60"/>
         <w:ind w:left="340"/>
       </w:pPr>
-      <w:hyperlink r:id="Rdf93671197634043">
+      <w:hyperlink r:id="R75d33752e725472c">
         <w:r>
           <w:rPr>
             <w:rStyle w:val="Hyperlink"/>
@@ -1660,7 +1660,7 @@
         <w:spacing w:before="60"/>
         <w:ind w:left="340"/>
       </w:pPr>
-      <w:hyperlink r:id="R037a68d500674c41">
+      <w:hyperlink r:id="R5e3eecafff484cd8">
         <w:r>
           <w:rPr>
             <w:rStyle w:val="Hyperlink"/>
@@ -1695,7 +1695,7 @@
         <w:spacing w:before="60"/>
         <w:ind w:left="340"/>
       </w:pPr>
-      <w:hyperlink r:id="Rd7b4a0af96e0447d">
+      <w:hyperlink r:id="Rfab901df6e7b4b59">
         <w:r>
           <w:rPr>
             <w:rStyle w:val="Hyperlink"/>
@@ -1730,7 +1730,7 @@
         <w:spacing w:before="60"/>
         <w:ind w:left="340"/>
       </w:pPr>
-      <w:hyperlink r:id="Rd7269c46fd34411d">
+      <w:hyperlink r:id="R4f31b96fc5874ebd">
         <w:r>
           <w:rPr>
             <w:rStyle w:val="Hyperlink"/>
@@ -1765,7 +1765,7 @@
         <w:spacing w:before="60"/>
         <w:ind w:left="340"/>
       </w:pPr>
-      <w:hyperlink r:id="R3364dfd13c8e4958">
+      <w:hyperlink r:id="Ra820312116324891">
         <w:r>
           <w:rPr>
             <w:rStyle w:val="Hyperlink"/>
@@ -1800,7 +1800,7 @@
         <w:spacing w:before="60"/>
         <w:ind w:left="340"/>
       </w:pPr>
-      <w:hyperlink r:id="Rd363f4fe68b24f76">
+      <w:hyperlink r:id="R0cf9bec5481c4f0e">
         <w:r>
           <w:rPr>
             <w:rStyle w:val="Hyperlink"/>
@@ -1835,7 +1835,7 @@
         <w:spacing w:before="60"/>
         <w:ind w:left="340"/>
       </w:pPr>
-      <w:hyperlink r:id="Rf528f24c0f3d4f88">
+      <w:hyperlink r:id="R3d5e529a27f74b6d">
         <w:r>
           <w:rPr>
             <w:rStyle w:val="Hyperlink"/>
@@ -1870,7 +1870,7 @@
         <w:spacing w:before="60"/>
         <w:ind w:left="340"/>
       </w:pPr>
-      <w:hyperlink r:id="Rb717ff56cdf94933">
+      <w:hyperlink r:id="R8771ea4acf2c4eea">
         <w:r>
           <w:rPr>
             <w:rStyle w:val="Hyperlink"/>
@@ -1905,7 +1905,7 @@
         <w:spacing w:before="60"/>
         <w:ind w:left="340"/>
       </w:pPr>
-      <w:hyperlink r:id="Rcff3ebc5800342c1">
+      <w:hyperlink r:id="Rcc0a7a90a1ab4348">
         <w:r>
           <w:rPr>
             <w:rStyle w:val="Hyperlink"/>
@@ -1940,7 +1940,7 @@
         <w:spacing w:before="60"/>
         <w:ind w:left="340"/>
       </w:pPr>
-      <w:hyperlink r:id="R2fc173864f4e4693">
+      <w:hyperlink r:id="Rf22ee0b6fc2f412c">
         <w:r>
           <w:rPr>
             <w:rStyle w:val="Hyperlink"/>
@@ -1975,7 +1975,7 @@
         <w:spacing w:before="60"/>
         <w:ind w:left="340"/>
       </w:pPr>
-      <w:hyperlink r:id="R39e32215f56d4786">
+      <w:hyperlink r:id="R321edb555bb44044">
         <w:r>
           <w:rPr>
             <w:rStyle w:val="Hyperlink"/>
@@ -2010,7 +2010,7 @@
         <w:spacing w:before="60"/>
         <w:ind w:left="340"/>
       </w:pPr>
-      <w:hyperlink r:id="R095c55773da54b4b">
+      <w:hyperlink r:id="R4f9b104f4bb34ef9">
         <w:r>
           <w:rPr>
             <w:rStyle w:val="Hyperlink"/>
@@ -2045,7 +2045,7 @@
         <w:spacing w:before="60"/>
         <w:ind w:left="340"/>
       </w:pPr>
-      <w:hyperlink r:id="R483a19e402fe40e6">
+      <w:hyperlink r:id="Rf0761bbff55a4021">
         <w:r>
           <w:rPr>
             <w:rStyle w:val="Hyperlink"/>
@@ -2080,7 +2080,7 @@
         <w:spacing w:before="60"/>
         <w:ind w:left="340"/>
       </w:pPr>
-      <w:hyperlink r:id="R20ed0db71c7b46ea">
+      <w:hyperlink r:id="R2bbfff73fa004e1d">
         <w:r>
           <w:rPr>
             <w:rStyle w:val="Hyperlink"/>
@@ -3323,7 +3323,7 @@
                     <pic:cNvPicPr/>
                   </pic:nvPicPr>
                   <pic:blipFill>
-                    <a:blip r:embed="R1c32c1432f954897"/>
+                    <a:blip r:embed="R7fcb0047437e4af8"/>
                     <a:stretch>
                       <a:fillRect/>
                     </a:stretch>
@@ -3626,7 +3626,7 @@
                     <pic:cNvPicPr/>
                   </pic:nvPicPr>
                   <pic:blipFill>
-                    <a:blip r:embed="R8cea0bae4c8f4bb5"/>
+                    <a:blip r:embed="R8efe19e247174443"/>
                     <a:stretch>
                       <a:fillRect/>
                     </a:stretch>
@@ -4867,7 +4867,7 @@
                     <pic:cNvPicPr/>
                   </pic:nvPicPr>
                   <pic:blipFill>
-                    <a:blip r:embed="R7876f7a4db1444be"/>
+                    <a:blip r:embed="R2beb5b2f2a21403f"/>
                     <a:stretch>
                       <a:fillRect/>
                     </a:stretch>
@@ -5172,7 +5172,7 @@
                     <pic:cNvPicPr/>
                   </pic:nvPicPr>
                   <pic:blipFill>
-                    <a:blip r:embed="R054614ae790b44cf"/>
+                    <a:blip r:embed="Rb41ee27259e34d5c"/>
                     <a:stretch>
                       <a:fillRect/>
                     </a:stretch>
@@ -5580,7 +5580,7 @@
                     <pic:cNvPicPr/>
                   </pic:nvPicPr>
                   <pic:blipFill>
-                    <a:blip r:embed="R59063647250e44a2"/>
+                    <a:blip r:embed="R8195ec889477442b"/>
                     <a:stretch>
                       <a:fillRect/>
                     </a:stretch>
@@ -5810,7 +5810,7 @@
                     <pic:cNvPicPr/>
                   </pic:nvPicPr>
                   <pic:blipFill>
-                    <a:blip r:embed="Ra51f5aac4c804cc1"/>
+                    <a:blip r:embed="R127acc32a4264389"/>
                     <a:stretch>
                       <a:fillRect/>
                     </a:stretch>
@@ -5914,7 +5914,7 @@
                     <pic:cNvPicPr/>
                   </pic:nvPicPr>
                   <pic:blipFill>
-                    <a:blip r:embed="Rb9d8d171435147b4"/>
+                    <a:blip r:embed="R02e1892b2c8f44a6"/>
                     <a:stretch>
                       <a:fillRect/>
                     </a:stretch>
@@ -7525,7 +7525,7 @@
                     <pic:cNvPicPr/>
                   </pic:nvPicPr>
                   <pic:blipFill>
-                    <a:blip r:embed="R17de109c8e8c4877"/>
+                    <a:blip r:embed="Ra9c805a040124a44"/>
                     <a:stretch>
                       <a:fillRect/>
                     </a:stretch>
@@ -8085,7 +8085,7 @@
       </w:r>
       <w:r>
         <w:rPr/>
-        <w:t xml:space="preserve"> (int32, float, …) used in the OPC UA server will be those defined in OPC UA, see &lt;xref ref-type="other" rid="ref_uapart6"&gt;</w:t>
+        <w:t xml:space="preserve"> (int32, float, …) used in the OPC UA server will be those defined in OPC UA, see </w:t>
       </w:r>
       <w:r>
         <w:fldChar w:fldCharType="begin"/>
@@ -8105,7 +8105,27 @@
       </w:r>
       <w:r>
         <w:rPr/>
-        <w:t xml:space="preserve">&lt;/xref&gt; for more detail on the representation of the datatypes. This specification is typically implemented in a PLC, &lt;xref ref-type="sec" rid="annex_c_datatype-non-normative"&gt;Annex C&lt;/xref&gt; provides a non-normative copy of the DataType mapping described in PLC Open</w:t>
+        <w:t xml:space="preserve"> for more detail on the representation of the datatypes. This specification is typically implemented in a PLC, </w:t>
+      </w:r>
+      <w:r>
+        <w:fldChar w:fldCharType="begin"/>
+      </w:r>
+      <w:r>
+        <w:instrText xml:space="preserve"> REF Sts_sec_B \r \h \* MERGEFORMAT </w:instrText>
+      </w:r>
+      <w:r>
+        <w:fldChar w:fldCharType="separate"/>
+      </w:r>
+      <w:r>
+        <w:rPr/>
+        <w:t xml:space="preserve">Annex B</w:t>
+      </w:r>
+      <w:r>
+        <w:fldChar w:fldCharType="end"/>
+      </w:r>
+      <w:r>
+        <w:rPr/>
+        <w:t xml:space="preserve"> provides a non-normative copy of the DataType mapping described in PLC Open</w:t>
       </w:r>
     </w:p>
     <w:p>
@@ -8129,7 +8149,7 @@
                     <pic:cNvPicPr/>
                   </pic:nvPicPr>
                   <pic:blipFill>
-                    <a:blip r:embed="R212b53170f78462b"/>
+                    <a:blip r:embed="R2d1916983a084f7d"/>
                     <a:stretch>
                       <a:fillRect/>
                     </a:stretch>
@@ -8257,8 +8277,24 @@
         <w:pStyle w:val="PARAGRAPH"/>
       </w:pPr>
       <w:r>
-        <w:rPr/>
-        <w:t xml:space="preserve">&lt;xref ref-type="fig" rid="fig_10_packml-object-instance-overview"&gt;Figure 10&lt;/xref&gt; provides an overview of the instance object model for PackML</w:t>
+        <w:fldChar w:fldCharType="begin"/>
+      </w:r>
+      <w:r>
+        <w:instrText xml:space="preserve"> REF Sts_fig_10 \h \* MERGEFORMAT </w:instrText>
+      </w:r>
+      <w:r>
+        <w:fldChar w:fldCharType="separate"/>
+      </w:r>
+      <w:r>
+        <w:rPr/>
+        <w:t xml:space="preserve">Figure 10</w:t>
+      </w:r>
+      <w:r>
+        <w:fldChar w:fldCharType="end"/>
+      </w:r>
+      <w:r>
+        <w:rPr/>
+        <w:t xml:space="preserve"> provides an overview of the instance object model for PackML</w:t>
       </w:r>
     </w:p>
     <w:p>
@@ -8282,7 +8318,7 @@
                     <pic:cNvPicPr/>
                   </pic:nvPicPr>
                   <pic:blipFill>
-                    <a:blip r:embed="Rb180b7bca97f43bc"/>
+                    <a:blip r:embed="R62932c998c8f4b7c"/>
                     <a:stretch>
                       <a:fillRect/>
                     </a:stretch>
@@ -8372,7 +8408,27 @@
       </w:r>
       <w:r>
         <w:rPr/>
-        <w:t xml:space="preserve"> (see &lt;xref ref-type="sec" rid="sec_6-3-2_packmlbaseobjecttype"&gt;6.3.2&lt;/xref&gt; for definition of </w:t>
+        <w:t xml:space="preserve"> (see </w:t>
+      </w:r>
+      <w:r>
+        <w:fldChar w:fldCharType="begin"/>
+      </w:r>
+      <w:r>
+        <w:instrText xml:space="preserve"> REF Sts_sec_6_3_2 \r \h \* MERGEFORMAT </w:instrText>
+      </w:r>
+      <w:r>
+        <w:fldChar w:fldCharType="separate"/>
+      </w:r>
+      <w:r>
+        <w:rPr/>
+        <w:t xml:space="preserve">6.3.2</w:t>
+      </w:r>
+      <w:r>
+        <w:fldChar w:fldCharType="end"/>
+      </w:r>
+      <w:r>
+        <w:rPr/>
+        <w:t xml:space="preserve"> for definition of </w:t>
       </w:r>
       <w:r>
         <w:rPr>
@@ -8411,7 +8467,27 @@
       </w:r>
       <w:r>
         <w:rPr/>
-        <w:t xml:space="preserve"> node is formally defined in &lt;xref ref-type="table" rid="tbl_2_packmlobjects-definition"&gt;Table 2&lt;/xref&gt;.</w:t>
+        <w:t xml:space="preserve"> node is formally defined in </w:t>
+      </w:r>
+      <w:r>
+        <w:fldChar w:fldCharType="begin"/>
+      </w:r>
+      <w:r>
+        <w:instrText xml:space="preserve"> REF Sts_tbl_2 \h \* MERGEFORMAT </w:instrText>
+      </w:r>
+      <w:r>
+        <w:fldChar w:fldCharType="separate"/>
+      </w:r>
+      <w:r>
+        <w:rPr/>
+        <w:t xml:space="preserve">Table 2</w:t>
+      </w:r>
+      <w:r>
+        <w:fldChar w:fldCharType="end"/>
+      </w:r>
+      <w:r>
+        <w:rPr/>
+        <w:t xml:space="preserve">.</w:t>
       </w:r>
     </w:p>
     <w:p>
@@ -8730,7 +8806,27 @@
       </w:r>
       <w:r>
         <w:rPr/>
-        <w:t xml:space="preserve"> (see section &lt;xref ref-type="sec" rid="sec_6-3-5_statemachines-overview"&gt;6.3.5&lt;/xref&gt; for a definition). Instances of these </w:t>
+        <w:t xml:space="preserve"> (see section </w:t>
+      </w:r>
+      <w:r>
+        <w:fldChar w:fldCharType="begin"/>
+      </w:r>
+      <w:r>
+        <w:instrText xml:space="preserve"> REF Sts_sec_6_3_5 \r \h \* MERGEFORMAT </w:instrText>
+      </w:r>
+      <w:r>
+        <w:fldChar w:fldCharType="separate"/>
+      </w:r>
+      <w:r>
+        <w:rPr/>
+        <w:t xml:space="preserve">6.3.5</w:t>
+      </w:r>
+      <w:r>
+        <w:fldChar w:fldCharType="end"/>
+      </w:r>
+      <w:r>
+        <w:rPr/>
+        <w:t xml:space="preserve"> for a definition). Instances of these </w:t>
       </w:r>
       <w:r>
         <w:rPr>
@@ -8760,7 +8856,27 @@
       </w:r>
       <w:r>
         <w:rPr/>
-        <w:t xml:space="preserve"> are configured and each instance would be defined by either the end user or the machine builder. The PackML model also includes other meta data such as available mode, current mode, see section &lt;xref ref-type="sec" rid="sec_6-3-2_packmlbaseobjecttype"&gt;6.3.2&lt;/xref&gt; for a complete list</w:t>
+        <w:t xml:space="preserve"> are configured and each instance would be defined by either the end user or the machine builder. The PackML model also includes other meta data such as available mode, current mode, see section </w:t>
+      </w:r>
+      <w:r>
+        <w:fldChar w:fldCharType="begin"/>
+      </w:r>
+      <w:r>
+        <w:instrText xml:space="preserve"> REF Sts_sec_6_3_2 \r \h \* MERGEFORMAT </w:instrText>
+      </w:r>
+      <w:r>
+        <w:fldChar w:fldCharType="separate"/>
+      </w:r>
+      <w:r>
+        <w:rPr/>
+        <w:t xml:space="preserve">6.3.2</w:t>
+      </w:r>
+      <w:r>
+        <w:fldChar w:fldCharType="end"/>
+      </w:r>
+      <w:r>
+        <w:rPr/>
+        <w:t xml:space="preserve"> for a complete list</w:t>
       </w:r>
     </w:p>
     <w:p>
@@ -8814,7 +8930,7 @@
                     <pic:cNvPicPr/>
                   </pic:nvPicPr>
                   <pic:blipFill>
-                    <a:blip r:embed="Rbcd5b41e5af446b8"/>
+                    <a:blip r:embed="Rd8adc4cffd654d14"/>
                     <a:stretch>
                       <a:fillRect/>
                     </a:stretch>
@@ -8873,8 +8989,24 @@
         <w:pStyle w:val="PARAGRAPH"/>
       </w:pPr>
       <w:r>
-        <w:rPr/>
-        <w:t xml:space="preserve">&lt;xref ref-type="table" rid="tbl_3_packmlbaseobjecttype-definition"&gt;Table 3&lt;/xref&gt; formally defines the </w:t>
+        <w:fldChar w:fldCharType="begin"/>
+      </w:r>
+      <w:r>
+        <w:instrText xml:space="preserve"> REF Sts_tbl_3 \h \* MERGEFORMAT </w:instrText>
+      </w:r>
+      <w:r>
+        <w:fldChar w:fldCharType="separate"/>
+      </w:r>
+      <w:r>
+        <w:rPr/>
+        <w:t xml:space="preserve">Table 3</w:t>
+      </w:r>
+      <w:r>
+        <w:fldChar w:fldCharType="end"/>
+      </w:r>
+      <w:r>
+        <w:rPr/>
+        <w:t xml:space="preserve"> formally defines the </w:t>
       </w:r>
       <w:r>
         <w:rPr>
@@ -10241,7 +10373,27 @@
       </w:r>
       <w:r>
         <w:rPr/>
-        <w:t xml:space="preserve"> provides administrative functionality required for the PackML OPC UA server. It is defined in section &lt;xref ref-type="sec" rid="sec_6-3-4_packmladminobjecttype"&gt;6.3.4&lt;/xref&gt;. The administrative functionality exposed by this </w:t>
+        <w:t xml:space="preserve"> provides administrative functionality required for the PackML OPC UA server. It is defined in section </w:t>
+      </w:r>
+      <w:r>
+        <w:fldChar w:fldCharType="begin"/>
+      </w:r>
+      <w:r>
+        <w:instrText xml:space="preserve"> REF Sts_sec_6_3_4 \r \h \* MERGEFORMAT </w:instrText>
+      </w:r>
+      <w:r>
+        <w:fldChar w:fldCharType="separate"/>
+      </w:r>
+      <w:r>
+        <w:rPr/>
+        <w:t xml:space="preserve">6.3.4</w:t>
+      </w:r>
+      <w:r>
+        <w:fldChar w:fldCharType="end"/>
+      </w:r>
+      <w:r>
+        <w:rPr/>
+        <w:t xml:space="preserve">. The administrative functionality exposed by this </w:t>
       </w:r>
       <w:r>
         <w:rPr>
@@ -10276,7 +10428,27 @@
       </w:r>
       <w:r>
         <w:rPr/>
-        <w:t xml:space="preserve">. It is defined in section &lt;xref ref-type="sec" rid="sec_6-3-3_packmlstatusobjecttype"&gt;6.3.3&lt;/xref&gt;.</w:t>
+        <w:t xml:space="preserve">. It is defined in section </w:t>
+      </w:r>
+      <w:r>
+        <w:fldChar w:fldCharType="begin"/>
+      </w:r>
+      <w:r>
+        <w:instrText xml:space="preserve"> REF Sts_sec_6_3_3 \r \h \* MERGEFORMAT </w:instrText>
+      </w:r>
+      <w:r>
+        <w:fldChar w:fldCharType="separate"/>
+      </w:r>
+      <w:r>
+        <w:rPr/>
+        <w:t xml:space="preserve">6.3.3</w:t>
+      </w:r>
+      <w:r>
+        <w:fldChar w:fldCharType="end"/>
+      </w:r>
+      <w:r>
+        <w:rPr/>
+        <w:t xml:space="preserve">.</w:t>
       </w:r>
     </w:p>
     <w:p>
@@ -10341,7 +10513,23 @@
       </w:r>
       <w:r>
         <w:rPr/>
-        <w:t xml:space="preserve"> in &lt;xref ref-type="sec" rid="sec_6-7-2_setunitmode-method"&gt;6.7.2&lt;/xref&gt;</w:t>
+        <w:t xml:space="preserve"> in </w:t>
+      </w:r>
+      <w:r>
+        <w:fldChar w:fldCharType="begin"/>
+      </w:r>
+      <w:r>
+        <w:instrText xml:space="preserve"> REF Sts_sec_6_7_2 \r \h \* MERGEFORMAT </w:instrText>
+      </w:r>
+      <w:r>
+        <w:fldChar w:fldCharType="separate"/>
+      </w:r>
+      <w:r>
+        <w:rPr/>
+        <w:t xml:space="preserve">6.7.2</w:t>
+      </w:r>
+      <w:r>
+        <w:fldChar w:fldCharType="end"/>
       </w:r>
     </w:p>
     <w:p>
@@ -10441,7 +10629,27 @@
       </w:r>
       <w:r>
         <w:rPr/>
-        <w:t xml:space="preserve"> in &lt;xref ref-type="sec" rid="sec_6-7-4_setproduct-method"&gt;6.7.4&lt;/xref&gt;.</w:t>
+        <w:t xml:space="preserve"> in </w:t>
+      </w:r>
+      <w:r>
+        <w:fldChar w:fldCharType="begin"/>
+      </w:r>
+      <w:r>
+        <w:instrText xml:space="preserve"> REF Sts_sec_6_7_4 \r \h \* MERGEFORMAT </w:instrText>
+      </w:r>
+      <w:r>
+        <w:fldChar w:fldCharType="separate"/>
+      </w:r>
+      <w:r>
+        <w:rPr/>
+        <w:t xml:space="preserve">6.7.4</w:t>
+      </w:r>
+      <w:r>
+        <w:fldChar w:fldCharType="end"/>
+      </w:r>
+      <w:r>
+        <w:rPr/>
+        <w:t xml:space="preserve">.</w:t>
       </w:r>
     </w:p>
     <w:p>
@@ -10486,7 +10694,27 @@
       </w:r>
       <w:r>
         <w:rPr/>
-        <w:t xml:space="preserve"> in &lt;xref ref-type="sec" rid="sec_6-7-17_setparameter-method"&gt;6.7.17&lt;/xref&gt;.</w:t>
+        <w:t xml:space="preserve"> in </w:t>
+      </w:r>
+      <w:r>
+        <w:fldChar w:fldCharType="begin"/>
+      </w:r>
+      <w:r>
+        <w:instrText xml:space="preserve"> REF Sts_sec_6_7_17 \r \h \* MERGEFORMAT </w:instrText>
+      </w:r>
+      <w:r>
+        <w:fldChar w:fldCharType="separate"/>
+      </w:r>
+      <w:r>
+        <w:rPr/>
+        <w:t xml:space="preserve">6.7.17</w:t>
+      </w:r>
+      <w:r>
+        <w:fldChar w:fldCharType="end"/>
+      </w:r>
+      <w:r>
+        <w:rPr/>
+        <w:t xml:space="preserve">.</w:t>
       </w:r>
     </w:p>
     <w:p>
@@ -10581,7 +10809,23 @@
       </w:r>
       <w:r>
         <w:rPr/>
-        <w:t xml:space="preserve"> in &lt;xref ref-type="sec" rid="sec_6-7-15_remotecommand-method"&gt;6.7.15&lt;/xref&gt;</w:t>
+        <w:t xml:space="preserve"> in </w:t>
+      </w:r>
+      <w:r>
+        <w:fldChar w:fldCharType="begin"/>
+      </w:r>
+      <w:r>
+        <w:instrText xml:space="preserve"> REF Sts_sec_6_7_15 \r \h \* MERGEFORMAT </w:instrText>
+      </w:r>
+      <w:r>
+        <w:fldChar w:fldCharType="separate"/>
+      </w:r>
+      <w:r>
+        <w:rPr/>
+        <w:t xml:space="preserve">6.7.15</w:t>
+      </w:r>
+      <w:r>
+        <w:fldChar w:fldCharType="end"/>
       </w:r>
     </w:p>
     <w:p>
@@ -10610,7 +10854,23 @@
       </w:r>
       <w:r>
         <w:rPr/>
-        <w:t xml:space="preserve"> in &lt;xref ref-type="sec" rid="sec_6-7-16_setinterlock-method"&gt;6.7.16&lt;/xref&gt;</w:t>
+        <w:t xml:space="preserve"> in </w:t>
+      </w:r>
+      <w:r>
+        <w:fldChar w:fldCharType="begin"/>
+      </w:r>
+      <w:r>
+        <w:instrText xml:space="preserve"> REF Sts_sec_6_7_16 \r \h \* MERGEFORMAT </w:instrText>
+      </w:r>
+      <w:r>
+        <w:fldChar w:fldCharType="separate"/>
+      </w:r>
+      <w:r>
+        <w:rPr/>
+        <w:t xml:space="preserve">6.7.16</w:t>
+      </w:r>
+      <w:r>
+        <w:fldChar w:fldCharType="end"/>
       </w:r>
     </w:p>
     <w:p>
@@ -10650,7 +10910,23 @@
       </w:r>
       <w:r>
         <w:rPr/>
-        <w:t xml:space="preserve"> that is used to group all of the status information that is part of the PackML information model. It is illustrated in &lt;xref ref-type="fig" rid="fig_12_packmlstatusobjecttype-overview"&gt;Figure 12&lt;/xref&gt;</w:t>
+        <w:t xml:space="preserve"> that is used to group all of the status information that is part of the PackML information model. It is illustrated in </w:t>
+      </w:r>
+      <w:r>
+        <w:fldChar w:fldCharType="begin"/>
+      </w:r>
+      <w:r>
+        <w:instrText xml:space="preserve"> REF Sts_fig_12 \h \* MERGEFORMAT </w:instrText>
+      </w:r>
+      <w:r>
+        <w:fldChar w:fldCharType="separate"/>
+      </w:r>
+      <w:r>
+        <w:rPr/>
+        <w:t xml:space="preserve">Figure 12</w:t>
+      </w:r>
+      <w:r>
+        <w:fldChar w:fldCharType="end"/>
       </w:r>
     </w:p>
     <w:p>
@@ -10674,7 +10950,7 @@
                     <pic:cNvPicPr/>
                   </pic:nvPicPr>
                   <pic:blipFill>
-                    <a:blip r:embed="Rfd7b9b14c71a49f2"/>
+                    <a:blip r:embed="R9a013927d728470b"/>
                     <a:stretch>
                       <a:fillRect/>
                     </a:stretch>
@@ -10733,8 +11009,24 @@
         <w:pStyle w:val="PARAGRAPH"/>
       </w:pPr>
       <w:r>
-        <w:rPr/>
-        <w:t xml:space="preserve">&lt;xref ref-type="table" rid="tbl_4_packmlstatusobjecttype-definition"&gt;Table 4&lt;/xref&gt; formally defines the </w:t>
+        <w:fldChar w:fldCharType="begin"/>
+      </w:r>
+      <w:r>
+        <w:instrText xml:space="preserve"> REF Sts_tbl_4 \h \* MERGEFORMAT </w:instrText>
+      </w:r>
+      <w:r>
+        <w:fldChar w:fldCharType="separate"/>
+      </w:r>
+      <w:r>
+        <w:rPr/>
+        <w:t xml:space="preserve">Table 4</w:t>
+      </w:r>
+      <w:r>
+        <w:fldChar w:fldCharType="end"/>
+      </w:r>
+      <w:r>
+        <w:rPr/>
+        <w:t xml:space="preserve"> formally defines the </w:t>
       </w:r>
       <w:r>
         <w:rPr>
@@ -12711,7 +13003,7 @@
       </w:r>
       <w:r>
         <w:rPr/>
-        <w:t xml:space="preserve"> is defined in &lt;xref ref-type="other" rid="ref_uapart5"&gt;</w:t>
+        <w:t xml:space="preserve"> is defined in </w:t>
       </w:r>
       <w:r>
         <w:fldChar w:fldCharType="begin"/>
@@ -12731,7 +13023,7 @@
       </w:r>
       <w:r>
         <w:rPr/>
-        <w:t xml:space="preserve">&lt;/xref&gt;.</w:t>
+        <w:t xml:space="preserve">.</w:t>
       </w:r>
     </w:p>
     <w:p>
@@ -13071,7 +13363,27 @@
       </w:r>
       <w:r>
         <w:rPr/>
-        <w:t xml:space="preserve"> definition in &lt;xref ref-type="sec" rid="sec_6-7-15_remotecommand-method"&gt;6.7.15&lt;/xref&gt;.</w:t>
+        <w:t xml:space="preserve"> definition in </w:t>
+      </w:r>
+      <w:r>
+        <w:fldChar w:fldCharType="begin"/>
+      </w:r>
+      <w:r>
+        <w:instrText xml:space="preserve"> REF Sts_sec_6_7_15 \r \h \* MERGEFORMAT </w:instrText>
+      </w:r>
+      <w:r>
+        <w:fldChar w:fldCharType="separate"/>
+      </w:r>
+      <w:r>
+        <w:rPr/>
+        <w:t xml:space="preserve">6.7.15</w:t>
+      </w:r>
+      <w:r>
+        <w:fldChar w:fldCharType="end"/>
+      </w:r>
+      <w:r>
+        <w:rPr/>
+        <w:t xml:space="preserve">.</w:t>
       </w:r>
     </w:p>
     <w:p>
@@ -13126,7 +13438,27 @@
       </w:r>
       <w:r>
         <w:rPr/>
-        <w:t xml:space="preserve"> that is used to group all of the Admin information that is part of the PackML information model. It is illustrated in &lt;xref ref-type="fig" rid="fig_13_packmladminobjecttype-overview"&gt;Figure 13&lt;/xref&gt;.</w:t>
+        <w:t xml:space="preserve"> that is used to group all of the Admin information that is part of the PackML information model. It is illustrated in </w:t>
+      </w:r>
+      <w:r>
+        <w:fldChar w:fldCharType="begin"/>
+      </w:r>
+      <w:r>
+        <w:instrText xml:space="preserve"> REF Sts_fig_13 \h \* MERGEFORMAT </w:instrText>
+      </w:r>
+      <w:r>
+        <w:fldChar w:fldCharType="separate"/>
+      </w:r>
+      <w:r>
+        <w:rPr/>
+        <w:t xml:space="preserve">Figure 13</w:t>
+      </w:r>
+      <w:r>
+        <w:fldChar w:fldCharType="end"/>
+      </w:r>
+      <w:r>
+        <w:rPr/>
+        <w:t xml:space="preserve">.</w:t>
       </w:r>
     </w:p>
     <w:p>
@@ -13150,7 +13482,7 @@
                     <pic:cNvPicPr/>
                   </pic:nvPicPr>
                   <pic:blipFill>
-                    <a:blip r:embed="R5ee044c1ab8348b0"/>
+                    <a:blip r:embed="Rbf55a40ef88a47a2"/>
                     <a:stretch>
                       <a:fillRect/>
                     </a:stretch>
@@ -13209,8 +13541,24 @@
         <w:pStyle w:val="PARAGRAPH"/>
       </w:pPr>
       <w:r>
-        <w:rPr/>
-        <w:t xml:space="preserve">&lt;xref ref-type="table" rid="tbl_5_packmladminobjecttype-definition"&gt;Table 5&lt;/xref&gt; formally defines the PackMLAdminObjectType.</w:t>
+        <w:fldChar w:fldCharType="begin"/>
+      </w:r>
+      <w:r>
+        <w:instrText xml:space="preserve"> REF Sts_tbl_5 \h \* MERGEFORMAT </w:instrText>
+      </w:r>
+      <w:r>
+        <w:fldChar w:fldCharType="separate"/>
+      </w:r>
+      <w:r>
+        <w:rPr/>
+        <w:t xml:space="preserve">Table 5</w:t>
+      </w:r>
+      <w:r>
+        <w:fldChar w:fldCharType="end"/>
+      </w:r>
+      <w:r>
+        <w:rPr/>
+        <w:t xml:space="preserve"> formally defines the PackMLAdminObjectType.</w:t>
       </w:r>
     </w:p>
     <w:p>
@@ -15842,8 +16190,24 @@
         <w:pStyle w:val="PARAGRAPH"/>
       </w:pPr>
       <w:r>
-        <w:rPr/>
-        <w:t xml:space="preserve">The &lt;xref ref-type="fig" rid="fig_14_packml-statemachines-overview"&gt;Figure 14&lt;/xref&gt; provides an overview of the </w:t>
+        <w:fldChar w:fldCharType="begin"/>
+      </w:r>
+      <w:r>
+        <w:instrText xml:space="preserve"> REF Sts_fig_14 \h \* MERGEFORMAT </w:instrText>
+      </w:r>
+      <w:r>
+        <w:fldChar w:fldCharType="separate"/>
+      </w:r>
+      <w:r>
+        <w:rPr/>
+        <w:t xml:space="preserve">Figure 14</w:t>
+      </w:r>
+      <w:r>
+        <w:fldChar w:fldCharType="end"/>
+      </w:r>
+      <w:r>
+        <w:rPr/>
+        <w:t xml:space="preserve"> provides an overview of the </w:t>
       </w:r>
       <w:r>
         <w:rPr>
@@ -15877,7 +16241,7 @@
                     <pic:cNvPicPr/>
                   </pic:nvPicPr>
                   <pic:blipFill>
-                    <a:blip r:embed="R7134aa90fb244243"/>
+                    <a:blip r:embed="R24762306429c45b2"/>
                     <a:stretch>
                       <a:fillRect/>
                     </a:stretch>
@@ -16207,7 +16571,27 @@
       </w:r>
       <w:r>
         <w:rPr/>
-        <w:t xml:space="preserve"> dependant. The initial state for the system is Aborted. Alternative it could be Cleared as parent state with the proposal of Stopped as initial sub state. &lt;xref ref-type="fig" rid="fig_15_packml-states"&gt;Figure 15 - PackML States&lt;/xref&gt; provide an overview of the states and transitions in the </w:t>
+        <w:t xml:space="preserve"> dependant. The initial state for the system is Aborted. Alternative it could be Cleared as parent state with the proposal of Stopped as initial sub state. </w:t>
+      </w:r>
+      <w:r>
+        <w:fldChar w:fldCharType="begin"/>
+      </w:r>
+      <w:r>
+        <w:instrText xml:space="preserve"> REF Sts_fig_15 \h \* MERGEFORMAT </w:instrText>
+      </w:r>
+      <w:r>
+        <w:fldChar w:fldCharType="separate"/>
+      </w:r>
+      <w:r>
+        <w:rPr/>
+        <w:t xml:space="preserve">Figure 15</w:t>
+      </w:r>
+      <w:r>
+        <w:fldChar w:fldCharType="end"/>
+      </w:r>
+      <w:r>
+        <w:rPr/>
+        <w:t xml:space="preserve"> provide an overview of the states and transitions in the </w:t>
       </w:r>
       <w:r>
         <w:rPr>
@@ -16237,7 +16621,7 @@
                     <pic:cNvPicPr/>
                   </pic:nvPicPr>
                   <pic:blipFill>
-                    <a:blip r:embed="R040ed20906844676"/>
+                    <a:blip r:embed="R9a7d2feaa3d0435c"/>
                     <a:stretch>
                       <a:fillRect/>
                     </a:stretch>
@@ -16328,7 +16712,27 @@
       </w:r>
       <w:r>
         <w:rPr/>
-        <w:t xml:space="preserve"> for PackML. It is illustrated in &lt;xref ref-type="fig" rid="fig_16_packmlbasestatemachinetype-illustration"&gt;Figure 16&lt;/xref&gt;. The TR-88 specification does not define an initial </w:t>
+        <w:t xml:space="preserve"> for PackML. It is illustrated in </w:t>
+      </w:r>
+      <w:r>
+        <w:fldChar w:fldCharType="begin"/>
+      </w:r>
+      <w:r>
+        <w:instrText xml:space="preserve"> REF Sts_fig_16 \h \* MERGEFORMAT </w:instrText>
+      </w:r>
+      <w:r>
+        <w:fldChar w:fldCharType="separate"/>
+      </w:r>
+      <w:r>
+        <w:rPr/>
+        <w:t xml:space="preserve">Figure 16</w:t>
+      </w:r>
+      <w:r>
+        <w:fldChar w:fldCharType="end"/>
+      </w:r>
+      <w:r>
+        <w:rPr/>
+        <w:t xml:space="preserve">. The TR-88 specification does not define an initial </w:t>
       </w:r>
       <w:r>
         <w:rPr>
@@ -16378,7 +16782,27 @@
       </w:r>
       <w:r>
         <w:rPr/>
-        <w:t xml:space="preserve">. &lt;xref ref-type="sec" rid="annex_b_informative-recommended-localized-names"&gt;Annex B&lt;/xref&gt; provide recommended display names for the various states.</w:t>
+        <w:t xml:space="preserve">. </w:t>
+      </w:r>
+      <w:r>
+        <w:fldChar w:fldCharType="begin"/>
+      </w:r>
+      <w:r>
+        <w:instrText xml:space="preserve"> REF Sts_sec_A \r \h \* MERGEFORMAT </w:instrText>
+      </w:r>
+      <w:r>
+        <w:fldChar w:fldCharType="separate"/>
+      </w:r>
+      <w:r>
+        <w:rPr/>
+        <w:t xml:space="preserve">Annex A</w:t>
+      </w:r>
+      <w:r>
+        <w:fldChar w:fldCharType="end"/>
+      </w:r>
+      <w:r>
+        <w:rPr/>
+        <w:t xml:space="preserve"> provide recommended display names for the various states.</w:t>
       </w:r>
     </w:p>
     <w:p>
@@ -16402,7 +16826,7 @@
                     <pic:cNvPicPr/>
                   </pic:nvPicPr>
                   <pic:blipFill>
-                    <a:blip r:embed="R2151a7cd47994147"/>
+                    <a:blip r:embed="R31847fd4ff1249d1"/>
                     <a:stretch>
                       <a:fillRect/>
                     </a:stretch>
@@ -16472,7 +16896,27 @@
       </w:r>
       <w:r>
         <w:rPr/>
-        <w:t xml:space="preserve"> defines the available states in a PackML system. The type is defined in &lt;xref ref-type="table" rid="tbl_6_packmlbasestatemachinetype-definition"&gt;Table 6&lt;/xref&gt;.* StateTypes* and </w:t>
+        <w:t xml:space="preserve"> defines the available states in a PackML system. The type is defined in </w:t>
+      </w:r>
+      <w:r>
+        <w:fldChar w:fldCharType="begin"/>
+      </w:r>
+      <w:r>
+        <w:instrText xml:space="preserve"> REF Sts_tbl_6 \h \* MERGEFORMAT </w:instrText>
+      </w:r>
+      <w:r>
+        <w:fldChar w:fldCharType="separate"/>
+      </w:r>
+      <w:r>
+        <w:rPr/>
+        <w:t xml:space="preserve">Table 6</w:t>
+      </w:r>
+      <w:r>
+        <w:fldChar w:fldCharType="end"/>
+      </w:r>
+      <w:r>
+        <w:rPr/>
+        <w:t xml:space="preserve">.* StateTypes* and </w:t>
       </w:r>
       <w:r>
         <w:rPr>
@@ -17846,7 +18290,27 @@
       </w:r>
       <w:r>
         <w:rPr/>
-        <w:t xml:space="preserve"> - A PackMLMachineStateMachineType defined in section &lt;xref ref-type="sec" rid="sec_6-3-7_packmlmachinestatemachinetype"&gt;6.3.7&lt;/xref&gt;.</w:t>
+        <w:t xml:space="preserve"> - A PackMLMachineStateMachineType defined in section </w:t>
+      </w:r>
+      <w:r>
+        <w:fldChar w:fldCharType="begin"/>
+      </w:r>
+      <w:r>
+        <w:instrText xml:space="preserve"> REF Sts_sec_6_3_7 \r \h \* MERGEFORMAT </w:instrText>
+      </w:r>
+      <w:r>
+        <w:fldChar w:fldCharType="separate"/>
+      </w:r>
+      <w:r>
+        <w:rPr/>
+        <w:t xml:space="preserve">6.3.7</w:t>
+      </w:r>
+      <w:r>
+        <w:fldChar w:fldCharType="end"/>
+      </w:r>
+      <w:r>
+        <w:rPr/>
+        <w:t xml:space="preserve">.</w:t>
       </w:r>
     </w:p>
     <w:p>
@@ -17881,7 +18345,27 @@
       </w:r>
       <w:r>
         <w:rPr/>
-        <w:t xml:space="preserve">. This will affect all sub-states in cleared state. Defined in &lt;xref ref-type="sec" rid="sec_6-7-5_abort-method"&gt;6.7.5&lt;/xref&gt;.</w:t>
+        <w:t xml:space="preserve">. This will affect all sub-states in cleared state. Defined in </w:t>
+      </w:r>
+      <w:r>
+        <w:fldChar w:fldCharType="begin"/>
+      </w:r>
+      <w:r>
+        <w:instrText xml:space="preserve"> REF Sts_sec_6_7_5 \r \h \* MERGEFORMAT </w:instrText>
+      </w:r>
+      <w:r>
+        <w:fldChar w:fldCharType="separate"/>
+      </w:r>
+      <w:r>
+        <w:rPr/>
+        <w:t xml:space="preserve">6.7.5</w:t>
+      </w:r>
+      <w:r>
+        <w:fldChar w:fldCharType="end"/>
+      </w:r>
+      <w:r>
+        <w:rPr/>
+        <w:t xml:space="preserve">.</w:t>
       </w:r>
     </w:p>
     <w:p>
@@ -17912,31 +18396,27 @@
         <w:rPr>
           <w:i/>
         </w:rPr>
-        <w:t xml:space="preserve">Cleared. *Defined in</w:t>
-      </w:r>
-      <w:r>
-        <w:rPr/>
-        <w:t xml:space="preserve"> </w:t>
-      </w:r>
-      <w:r>
-        <w:rPr>
-          <w:i/>
-        </w:rPr>
-        <w:t xml:space="preserve">&lt;xref ref-type="sec" rid="sec_6-7-6_clear-method"&gt;</w:t>
+        <w:t xml:space="preserve">Cleared. Defined in </w:t>
+      </w:r>
+      <w:r>
+        <w:fldChar w:fldCharType="begin"/>
+      </w:r>
+      <w:r>
+        <w:instrText xml:space="preserve"> REF Sts_sec_6_7_6 \r \h \* MERGEFORMAT </w:instrText>
+      </w:r>
+      <w:r>
+        <w:fldChar w:fldCharType="separate"/>
       </w:r>
       <w:r>
         <w:rPr/>
         <w:t xml:space="preserve">6.7.6</w:t>
       </w:r>
       <w:r>
-        <w:rPr>
-          <w:i/>
-        </w:rPr>
-        <w:t xml:space="preserve">&lt;/xref&gt;</w:t>
-      </w:r>
-      <w:r>
-        <w:rPr/>
-        <w:t xml:space="preserve">.*</w:t>
+        <w:fldChar w:fldCharType="end"/>
+      </w:r>
+      <w:r>
+        <w:rPr/>
+        <w:t xml:space="preserve">.</w:t>
       </w:r>
     </w:p>
     <w:p>
@@ -17944,8 +18424,24 @@
         <w:pStyle w:val="PARAGRAPH"/>
       </w:pPr>
       <w:r>
-        <w:rPr/>
-        <w:t xml:space="preserve">&lt;xref ref-type="table" rid="tbl_7_packmlbasestatemachinetype-additional-references"&gt;Table 7&lt;/xref&gt; defines the available </w:t>
+        <w:fldChar w:fldCharType="begin"/>
+      </w:r>
+      <w:r>
+        <w:instrText xml:space="preserve"> REF Sts_tbl_7 \h \* MERGEFORMAT </w:instrText>
+      </w:r>
+      <w:r>
+        <w:fldChar w:fldCharType="separate"/>
+      </w:r>
+      <w:r>
+        <w:rPr/>
+        <w:t xml:space="preserve">Table 7</w:t>
+      </w:r>
+      <w:r>
+        <w:fldChar w:fldCharType="end"/>
+      </w:r>
+      <w:r>
+        <w:rPr/>
+        <w:t xml:space="preserve"> defines the available </w:t>
       </w:r>
       <w:r>
         <w:rPr>
@@ -18581,7 +19077,27 @@
       </w:r>
       <w:r>
         <w:rPr/>
-        <w:t xml:space="preserve"> defines the machine level state machine. It is illustrated in &lt;xref ref-type="fig" rid="fig_17_packmlmachinestatemachinetype-illustration"&gt;Figure 17&lt;/xref&gt;.</w:t>
+        <w:t xml:space="preserve"> defines the machine level state machine. It is illustrated in </w:t>
+      </w:r>
+      <w:r>
+        <w:fldChar w:fldCharType="begin"/>
+      </w:r>
+      <w:r>
+        <w:instrText xml:space="preserve"> REF Sts_fig_17 \h \* MERGEFORMAT </w:instrText>
+      </w:r>
+      <w:r>
+        <w:fldChar w:fldCharType="separate"/>
+      </w:r>
+      <w:r>
+        <w:rPr/>
+        <w:t xml:space="preserve">Figure 17</w:t>
+      </w:r>
+      <w:r>
+        <w:fldChar w:fldCharType="end"/>
+      </w:r>
+      <w:r>
+        <w:rPr/>
+        <w:t xml:space="preserve">.</w:t>
       </w:r>
     </w:p>
     <w:p>
@@ -18640,7 +19156,27 @@
       </w:r>
       <w:r>
         <w:rPr/>
-        <w:t xml:space="preserve">. &lt;xref ref-type="sec" rid="annex_b_informative-recommended-localized-names"&gt;Annex B&lt;/xref&gt; provides recommended display names for the various states.</w:t>
+        <w:t xml:space="preserve">. </w:t>
+      </w:r>
+      <w:r>
+        <w:fldChar w:fldCharType="begin"/>
+      </w:r>
+      <w:r>
+        <w:instrText xml:space="preserve"> REF Sts_sec_A \r \h \* MERGEFORMAT </w:instrText>
+      </w:r>
+      <w:r>
+        <w:fldChar w:fldCharType="separate"/>
+      </w:r>
+      <w:r>
+        <w:rPr/>
+        <w:t xml:space="preserve">Annex A</w:t>
+      </w:r>
+      <w:r>
+        <w:fldChar w:fldCharType="end"/>
+      </w:r>
+      <w:r>
+        <w:rPr/>
+        <w:t xml:space="preserve"> provides recommended display names for the various states.</w:t>
       </w:r>
     </w:p>
     <w:p>
@@ -18664,7 +19200,7 @@
                     <pic:cNvPicPr/>
                   </pic:nvPicPr>
                   <pic:blipFill>
-                    <a:blip r:embed="R358d96a410104dd9"/>
+                    <a:blip r:embed="Rc12fc497a2754e59"/>
                     <a:stretch>
                       <a:fillRect/>
                     </a:stretch>
@@ -18723,8 +19259,24 @@
         <w:pStyle w:val="PARAGRAPH"/>
       </w:pPr>
       <w:r>
-        <w:rPr/>
-        <w:t xml:space="preserve">&lt;xref ref-type="table" rid="tbl_8_packmlmachinestatemachinetype-definition"&gt;Table 8&lt;/xref&gt; defines the </w:t>
+        <w:fldChar w:fldCharType="begin"/>
+      </w:r>
+      <w:r>
+        <w:instrText xml:space="preserve"> REF Sts_tbl_8 \h \* MERGEFORMAT </w:instrText>
+      </w:r>
+      <w:r>
+        <w:fldChar w:fldCharType="separate"/>
+      </w:r>
+      <w:r>
+        <w:rPr/>
+        <w:t xml:space="preserve">Table 8</w:t>
+      </w:r>
+      <w:r>
+        <w:fldChar w:fldCharType="end"/>
+      </w:r>
+      <w:r>
+        <w:rPr/>
+        <w:t xml:space="preserve"> defines the </w:t>
       </w:r>
       <w:r>
         <w:rPr>
@@ -20310,7 +20862,23 @@
       </w:r>
       <w:r>
         <w:rPr/>
-        <w:t xml:space="preserve"> state. Defined in &lt;xref ref-type="sec" rid="sec_6-7-7_stop-method"&gt;6.7.7&lt;/xref&gt;</w:t>
+        <w:t xml:space="preserve"> state. Defined in </w:t>
+      </w:r>
+      <w:r>
+        <w:fldChar w:fldCharType="begin"/>
+      </w:r>
+      <w:r>
+        <w:instrText xml:space="preserve"> REF Sts_sec_6_7_7 \r \h \* MERGEFORMAT </w:instrText>
+      </w:r>
+      <w:r>
+        <w:fldChar w:fldCharType="separate"/>
+      </w:r>
+      <w:r>
+        <w:rPr/>
+        <w:t xml:space="preserve">6.7.7</w:t>
+      </w:r>
+      <w:r>
+        <w:fldChar w:fldCharType="end"/>
       </w:r>
     </w:p>
     <w:p>
@@ -20355,7 +20923,23 @@
       </w:r>
       <w:r>
         <w:rPr/>
-        <w:t xml:space="preserve"> that they expose. Defined in &lt;xref ref-type="sec" rid="sec_6-7-8_reset-method"&gt;6.7.8&lt;/xref&gt;</w:t>
+        <w:t xml:space="preserve"> that they expose. Defined in </w:t>
+      </w:r>
+      <w:r>
+        <w:fldChar w:fldCharType="begin"/>
+      </w:r>
+      <w:r>
+        <w:instrText xml:space="preserve"> REF Sts_sec_6_7_8 \r \h \* MERGEFORMAT </w:instrText>
+      </w:r>
+      <w:r>
+        <w:fldChar w:fldCharType="separate"/>
+      </w:r>
+      <w:r>
+        <w:rPr/>
+        <w:t xml:space="preserve">6.7.8</w:t>
+      </w:r>
+      <w:r>
+        <w:fldChar w:fldCharType="end"/>
       </w:r>
     </w:p>
     <w:p>
@@ -20364,7 +20948,27 @@
       </w:pPr>
       <w:r>
         <w:rPr/>
-        <w:t xml:space="preserve">The transitions are defined in &lt;xref ref-type="table" rid="tbl_9_packmlmachinestatemachinetype-additional-references"&gt;Table 9&lt;/xref&gt;.</w:t>
+        <w:t xml:space="preserve">The transitions are defined in </w:t>
+      </w:r>
+      <w:r>
+        <w:fldChar w:fldCharType="begin"/>
+      </w:r>
+      <w:r>
+        <w:instrText xml:space="preserve"> REF Sts_tbl_9 \h \* MERGEFORMAT </w:instrText>
+      </w:r>
+      <w:r>
+        <w:fldChar w:fldCharType="separate"/>
+      </w:r>
+      <w:r>
+        <w:rPr/>
+        <w:t xml:space="preserve">Table 9</w:t>
+      </w:r>
+      <w:r>
+        <w:fldChar w:fldCharType="end"/>
+      </w:r>
+      <w:r>
+        <w:rPr/>
+        <w:t xml:space="preserve">.</w:t>
       </w:r>
     </w:p>
     <w:p>
@@ -21110,7 +21714,27 @@
       </w:r>
       <w:r>
         <w:rPr/>
-        <w:t xml:space="preserve"> provides all of the base states defined in PackML. It is illustrated in &lt;xref ref-type="fig" rid="fig_18_packmlexecutestatemachinetype-illustration"&gt;Figure 18&lt;/xref&gt;. The TR-88 specification does not define an initial State for this StateMachine, but typically the state machine use either the </w:t>
+        <w:t xml:space="preserve"> provides all of the base states defined in PackML. It is illustrated in </w:t>
+      </w:r>
+      <w:r>
+        <w:fldChar w:fldCharType="begin"/>
+      </w:r>
+      <w:r>
+        <w:instrText xml:space="preserve"> REF Sts_fig_18 \h \* MERGEFORMAT </w:instrText>
+      </w:r>
+      <w:r>
+        <w:fldChar w:fldCharType="separate"/>
+      </w:r>
+      <w:r>
+        <w:rPr/>
+        <w:t xml:space="preserve">Figure 18</w:t>
+      </w:r>
+      <w:r>
+        <w:fldChar w:fldCharType="end"/>
+      </w:r>
+      <w:r>
+        <w:rPr/>
+        <w:t xml:space="preserve">. The TR-88 specification does not define an initial State for this StateMachine, but typically the state machine use either the </w:t>
       </w:r>
       <w:r>
         <w:rPr>
@@ -21150,7 +21774,27 @@
       </w:r>
       <w:r>
         <w:rPr/>
-        <w:t xml:space="preserve">. &lt;xref ref-type="sec" rid="annex_b_informative-recommended-localized-names"&gt;Annex B&lt;/xref&gt; provide recommended display names for the various states.</w:t>
+        <w:t xml:space="preserve">. </w:t>
+      </w:r>
+      <w:r>
+        <w:fldChar w:fldCharType="begin"/>
+      </w:r>
+      <w:r>
+        <w:instrText xml:space="preserve"> REF Sts_sec_A \r \h \* MERGEFORMAT </w:instrText>
+      </w:r>
+      <w:r>
+        <w:fldChar w:fldCharType="separate"/>
+      </w:r>
+      <w:r>
+        <w:rPr/>
+        <w:t xml:space="preserve">Annex A</w:t>
+      </w:r>
+      <w:r>
+        <w:fldChar w:fldCharType="end"/>
+      </w:r>
+      <w:r>
+        <w:rPr/>
+        <w:t xml:space="preserve"> provide recommended display names for the various states.</w:t>
       </w:r>
     </w:p>
     <w:p>
@@ -21174,7 +21818,7 @@
                     <pic:cNvPicPr/>
                   </pic:nvPicPr>
                   <pic:blipFill>
-                    <a:blip r:embed="R5c0506c2df264de2"/>
+                    <a:blip r:embed="R724872192bcb4c1e"/>
                     <a:stretch>
                       <a:fillRect/>
                     </a:stretch>
@@ -21244,7 +21888,27 @@
       </w:r>
       <w:r>
         <w:rPr/>
-        <w:t xml:space="preserve"> is defined in &lt;xref ref-type="table" rid="tbl_10_packmlexecutestatemachinetype-definition"&gt;Table 10&lt;/xref&gt;. </w:t>
+        <w:t xml:space="preserve"> is defined in </w:t>
+      </w:r>
+      <w:r>
+        <w:fldChar w:fldCharType="begin"/>
+      </w:r>
+      <w:r>
+        <w:instrText xml:space="preserve"> REF Sts_tbl_10 \h \* MERGEFORMAT </w:instrText>
+      </w:r>
+      <w:r>
+        <w:fldChar w:fldCharType="separate"/>
+      </w:r>
+      <w:r>
+        <w:rPr/>
+        <w:t xml:space="preserve">Table 10</w:t>
+      </w:r>
+      <w:r>
+        <w:fldChar w:fldCharType="end"/>
+      </w:r>
+      <w:r>
+        <w:rPr/>
+        <w:t xml:space="preserve">. </w:t>
       </w:r>
       <w:r>
         <w:rPr>
@@ -25368,7 +26032,27 @@
       </w:r>
       <w:r>
         <w:rPr/>
-        <w:t xml:space="preserve"> are described in &lt;xref ref-type="table" rid="tbl_11_packmlexecutestatemachinetype-additional-references"&gt;Table 11&lt;/xref&gt;. This </w:t>
+        <w:t xml:space="preserve"> are described in </w:t>
+      </w:r>
+      <w:r>
+        <w:fldChar w:fldCharType="begin"/>
+      </w:r>
+      <w:r>
+        <w:instrText xml:space="preserve"> REF Sts_tbl_11 \h \* MERGEFORMAT </w:instrText>
+      </w:r>
+      <w:r>
+        <w:fldChar w:fldCharType="separate"/>
+      </w:r>
+      <w:r>
+        <w:rPr/>
+        <w:t xml:space="preserve">Table 11</w:t>
+      </w:r>
+      <w:r>
+        <w:fldChar w:fldCharType="end"/>
+      </w:r>
+      <w:r>
+        <w:rPr/>
+        <w:t xml:space="preserve">. This </w:t>
       </w:r>
       <w:r>
         <w:rPr>
@@ -25438,7 +26122,27 @@
       </w:r>
       <w:r>
         <w:rPr/>
-        <w:t xml:space="preserve">, all of which are extension to the &lt;xref ref-type="other" rid="ref_isapart2"&gt;ISA-TR88.00.02-2015&lt;/xref&gt; specification.</w:t>
+        <w:t xml:space="preserve">, all of which are extension to the </w:t>
+      </w:r>
+      <w:r>
+        <w:fldChar w:fldCharType="begin"/>
+      </w:r>
+      <w:r>
+        <w:instrText xml:space="preserve"> REF Sts_ref_tr88 \h \* MERGEFORMAT </w:instrText>
+      </w:r>
+      <w:r>
+        <w:fldChar w:fldCharType="separate"/>
+      </w:r>
+      <w:r>
+        <w:rPr/>
+        <w:t xml:space="preserve">ISA-TR88.00.02-2022</w:t>
+      </w:r>
+      <w:r>
+        <w:fldChar w:fldCharType="end"/>
+      </w:r>
+      <w:r>
+        <w:rPr/>
+        <w:t xml:space="preserve"> specification.</w:t>
       </w:r>
     </w:p>
     <w:p>
@@ -28644,7 +29348,27 @@
       </w:r>
       <w:r>
         <w:rPr/>
-        <w:t xml:space="preserve"> is defined in &lt;xref ref-type="table" rid="tbl_12_productionmaintenancemodeenum-values"&gt;Table 12&lt;/xref&gt;.</w:t>
+        <w:t xml:space="preserve"> is defined in </w:t>
+      </w:r>
+      <w:r>
+        <w:fldChar w:fldCharType="begin"/>
+      </w:r>
+      <w:r>
+        <w:instrText xml:space="preserve"> REF Sts_tbl_12 \h \* MERGEFORMAT </w:instrText>
+      </w:r>
+      <w:r>
+        <w:fldChar w:fldCharType="separate"/>
+      </w:r>
+      <w:r>
+        <w:rPr/>
+        <w:t xml:space="preserve">Table 12</w:t>
+      </w:r>
+      <w:r>
+        <w:fldChar w:fldCharType="end"/>
+      </w:r>
+      <w:r>
+        <w:rPr/>
+        <w:t xml:space="preserve">.</w:t>
       </w:r>
     </w:p>
     <w:p>
@@ -29001,7 +29725,23 @@
       </w:r>
       <w:r>
         <w:rPr/>
-        <w:t xml:space="preserve"> is used to generate summary information about the system.  The information depending on the use might be related to produced product, defective materials or any other information that needs to be tracked. It is formally defined in &lt;xref ref-type="table" rid="tbl_13_packmlcountdatatype-structure"&gt;Table 13&lt;/xref&gt;</w:t>
+        <w:t xml:space="preserve"> is used to generate summary information about the system.  The information depending on the use might be related to produced product, defective materials or any other information that needs to be tracked. It is formally defined in </w:t>
+      </w:r>
+      <w:r>
+        <w:fldChar w:fldCharType="begin"/>
+      </w:r>
+      <w:r>
+        <w:instrText xml:space="preserve"> REF Sts_tbl_13 \h \* MERGEFORMAT </w:instrText>
+      </w:r>
+      <w:r>
+        <w:fldChar w:fldCharType="separate"/>
+      </w:r>
+      <w:r>
+        <w:rPr/>
+        <w:t xml:space="preserve">Table 13</w:t>
+      </w:r>
+      <w:r>
+        <w:fldChar w:fldCharType="end"/>
       </w:r>
     </w:p>
     <w:p>
@@ -29412,7 +30152,23 @@
       </w:r>
       <w:r>
         <w:rPr/>
-        <w:t xml:space="preserve"> is formally defined in &lt;xref ref-type="table" rid="tbl_14_packmldescriptordatatype-structure"&gt;Table 14&lt;/xref&gt;</w:t>
+        <w:t xml:space="preserve"> is formally defined in </w:t>
+      </w:r>
+      <w:r>
+        <w:fldChar w:fldCharType="begin"/>
+      </w:r>
+      <w:r>
+        <w:instrText xml:space="preserve"> REF Sts_tbl_14 \h \* MERGEFORMAT </w:instrText>
+      </w:r>
+      <w:r>
+        <w:fldChar w:fldCharType="separate"/>
+      </w:r>
+      <w:r>
+        <w:rPr/>
+        <w:t xml:space="preserve">Table 14</w:t>
+      </w:r>
+      <w:r>
+        <w:fldChar w:fldCharType="end"/>
       </w:r>
     </w:p>
     <w:p>
@@ -29776,7 +30532,27 @@
       </w:r>
       <w:r>
         <w:rPr/>
-        <w:t xml:space="preserve"> is formally defined in &lt;xref ref-type="table" rid="tbl_15_packmlingredientsdatatype-structure"&gt;Table 15&lt;/xref&gt;.</w:t>
+        <w:t xml:space="preserve"> is formally defined in </w:t>
+      </w:r>
+      <w:r>
+        <w:fldChar w:fldCharType="begin"/>
+      </w:r>
+      <w:r>
+        <w:instrText xml:space="preserve"> REF Sts_tbl_15 \h \* MERGEFORMAT </w:instrText>
+      </w:r>
+      <w:r>
+        <w:fldChar w:fldCharType="separate"/>
+      </w:r>
+      <w:r>
+        <w:rPr/>
+        <w:t xml:space="preserve">Table 15</w:t>
+      </w:r>
+      <w:r>
+        <w:fldChar w:fldCharType="end"/>
+      </w:r>
+      <w:r>
+        <w:rPr/>
+        <w:t xml:space="preserve">.</w:t>
       </w:r>
     </w:p>
     <w:p>
@@ -30046,7 +30822,27 @@
       </w:r>
       <w:r>
         <w:rPr/>
-        <w:t xml:space="preserve"> is formally defined in &lt;xref ref-type="table" rid="tbl_16_packmlproductdatatype-structure"&gt;Table 16&lt;/xref&gt;.</w:t>
+        <w:t xml:space="preserve"> is formally defined in </w:t>
+      </w:r>
+      <w:r>
+        <w:fldChar w:fldCharType="begin"/>
+      </w:r>
+      <w:r>
+        <w:instrText xml:space="preserve"> REF Sts_tbl_16 \h \* MERGEFORMAT </w:instrText>
+      </w:r>
+      <w:r>
+        <w:fldChar w:fldCharType="separate"/>
+      </w:r>
+      <w:r>
+        <w:rPr/>
+        <w:t xml:space="preserve">Table 16</w:t>
+      </w:r>
+      <w:r>
+        <w:fldChar w:fldCharType="end"/>
+      </w:r>
+      <w:r>
+        <w:rPr/>
+        <w:t xml:space="preserve">.</w:t>
       </w:r>
     </w:p>
     <w:p>
@@ -30363,7 +31159,27 @@
       </w:r>
       <w:r>
         <w:rPr/>
-        <w:t xml:space="preserve"> is formally defined in &lt;xref ref-type="table" rid="tbl_17_packmlremoteinterfacedatatype-structure"&gt;Table 17&lt;/xref&gt;.</w:t>
+        <w:t xml:space="preserve"> is formally defined in </w:t>
+      </w:r>
+      <w:r>
+        <w:fldChar w:fldCharType="begin"/>
+      </w:r>
+      <w:r>
+        <w:instrText xml:space="preserve"> REF Sts_tbl_17 \h \* MERGEFORMAT </w:instrText>
+      </w:r>
+      <w:r>
+        <w:fldChar w:fldCharType="separate"/>
+      </w:r>
+      <w:r>
+        <w:rPr/>
+        <w:t xml:space="preserve">Table 17</w:t>
+      </w:r>
+      <w:r>
+        <w:fldChar w:fldCharType="end"/>
+      </w:r>
+      <w:r>
+        <w:rPr/>
+        <w:t xml:space="preserve">.</w:t>
       </w:r>
     </w:p>
     <w:p>
@@ -30782,7 +31598,23 @@
       </w:pPr>
       <w:r>
         <w:rPr/>
-        <w:t xml:space="preserve">This reference type is used to point to an Interlock. It is defined in &lt;xref ref-type="table" rid="tbl_18_hasinterlock-reference-type"&gt;Table 18&lt;/xref&gt;</w:t>
+        <w:t xml:space="preserve">This reference type is used to point to an Interlock. It is defined in </w:t>
+      </w:r>
+      <w:r>
+        <w:fldChar w:fldCharType="begin"/>
+      </w:r>
+      <w:r>
+        <w:instrText xml:space="preserve"> REF Sts_tbl_18 \h \* MERGEFORMAT </w:instrText>
+      </w:r>
+      <w:r>
+        <w:fldChar w:fldCharType="separate"/>
+      </w:r>
+      <w:r>
+        <w:rPr/>
+        <w:t xml:space="preserve">Table 18</w:t>
+      </w:r>
+      <w:r>
+        <w:fldChar w:fldCharType="end"/>
       </w:r>
     </w:p>
     <w:p>
@@ -31133,7 +31965,27 @@
       </w:pPr>
       <w:r>
         <w:rPr/>
-        <w:t xml:space="preserve">This reference type is used to point to an Alarm. It is defined in &lt;xref ref-type="table" rid="tbl_19_hasalarm-reference-type"&gt;Table 19&lt;/xref&gt;.</w:t>
+        <w:t xml:space="preserve">This reference type is used to point to an Alarm. It is defined in </w:t>
+      </w:r>
+      <w:r>
+        <w:fldChar w:fldCharType="begin"/>
+      </w:r>
+      <w:r>
+        <w:instrText xml:space="preserve"> REF Sts_tbl_19 \h \* MERGEFORMAT </w:instrText>
+      </w:r>
+      <w:r>
+        <w:fldChar w:fldCharType="separate"/>
+      </w:r>
+      <w:r>
+        <w:rPr/>
+        <w:t xml:space="preserve">Table 19</w:t>
+      </w:r>
+      <w:r>
+        <w:fldChar w:fldCharType="end"/>
+      </w:r>
+      <w:r>
+        <w:rPr/>
+        <w:t xml:space="preserve">.</w:t>
       </w:r>
     </w:p>
     <w:p>
@@ -31484,7 +32336,23 @@
       </w:pPr>
       <w:r>
         <w:rPr/>
-        <w:t xml:space="preserve">This reference type is used to point to an Alarm History. It is defined in &lt;xref ref-type="table" rid="tbl_20_hasalarmhistory-reference-type"&gt;Table 20&lt;/xref&gt;</w:t>
+        <w:t xml:space="preserve">This reference type is used to point to an Alarm History. It is defined in </w:t>
+      </w:r>
+      <w:r>
+        <w:fldChar w:fldCharType="begin"/>
+      </w:r>
+      <w:r>
+        <w:instrText xml:space="preserve"> REF Sts_tbl_20 \h \* MERGEFORMAT </w:instrText>
+      </w:r>
+      <w:r>
+        <w:fldChar w:fldCharType="separate"/>
+      </w:r>
+      <w:r>
+        <w:rPr/>
+        <w:t xml:space="preserve">Table 20</w:t>
+      </w:r>
+      <w:r>
+        <w:fldChar w:fldCharType="end"/>
       </w:r>
     </w:p>
     <w:p>
@@ -31835,7 +32703,27 @@
       </w:pPr>
       <w:r>
         <w:rPr/>
-        <w:t xml:space="preserve">This reference type is used to point to a Warning. It is defined in &lt;xref ref-type="table" rid="tbl_19_hasalarm-reference-type"&gt;Table 19&lt;/xref&gt;.</w:t>
+        <w:t xml:space="preserve">This reference type is used to point to a Warning. It is defined in </w:t>
+      </w:r>
+      <w:r>
+        <w:fldChar w:fldCharType="begin"/>
+      </w:r>
+      <w:r>
+        <w:instrText xml:space="preserve"> REF Sts_tbl_21 \h \* MERGEFORMAT </w:instrText>
+      </w:r>
+      <w:r>
+        <w:fldChar w:fldCharType="separate"/>
+      </w:r>
+      <w:r>
+        <w:rPr/>
+        <w:t xml:space="preserve">Table 21</w:t>
+      </w:r>
+      <w:r>
+        <w:fldChar w:fldCharType="end"/>
+      </w:r>
+      <w:r>
+        <w:rPr/>
+        <w:t xml:space="preserve">.</w:t>
       </w:r>
     </w:p>
     <w:p>
@@ -32186,7 +33074,27 @@
       </w:pPr>
       <w:r>
         <w:rPr/>
-        <w:t xml:space="preserve">This reference type is used to point to a StopReason. It is defined in &lt;xref ref-type="table" rid="tbl_19_hasalarm-reference-type"&gt;Table 19&lt;/xref&gt;.</w:t>
+        <w:t xml:space="preserve">This reference type is used to point to a StopReason. It is defined in </w:t>
+      </w:r>
+      <w:r>
+        <w:fldChar w:fldCharType="begin"/>
+      </w:r>
+      <w:r>
+        <w:instrText xml:space="preserve"> REF Sts_tbl_22 \h \* MERGEFORMAT </w:instrText>
+      </w:r>
+      <w:r>
+        <w:fldChar w:fldCharType="separate"/>
+      </w:r>
+      <w:r>
+        <w:rPr/>
+        <w:t xml:space="preserve">Table 22</w:t>
+      </w:r>
+      <w:r>
+        <w:fldChar w:fldCharType="end"/>
+      </w:r>
+      <w:r>
+        <w:rPr/>
+        <w:t xml:space="preserve">.</w:t>
       </w:r>
     </w:p>
     <w:p>
@@ -32598,7 +33506,23 @@
       </w:r>
       <w:r>
         <w:rPr/>
-        <w:t xml:space="preserve"> are defined in &lt;xref ref-type="table" rid="tbl_23_setunitmode-method-parameters"&gt;Table 23&lt;/xref&gt;</w:t>
+        <w:t xml:space="preserve"> are defined in </w:t>
+      </w:r>
+      <w:r>
+        <w:fldChar w:fldCharType="begin"/>
+      </w:r>
+      <w:r>
+        <w:instrText xml:space="preserve"> REF Sts_tbl_23 \h \* MERGEFORMAT </w:instrText>
+      </w:r>
+      <w:r>
+        <w:fldChar w:fldCharType="separate"/>
+      </w:r>
+      <w:r>
+        <w:rPr/>
+        <w:t xml:space="preserve">Table 23</w:t>
+      </w:r>
+      <w:r>
+        <w:fldChar w:fldCharType="end"/>
       </w:r>
     </w:p>
     <w:p>
@@ -32752,7 +33676,23 @@
       </w:pPr>
       <w:r>
         <w:rPr/>
-        <w:t xml:space="preserve">Method result codes are defined in &lt;xref ref-type="table" rid="tbl_24_setunitmode-method-result-codes"&gt;Table 24&lt;/xref&gt;</w:t>
+        <w:t xml:space="preserve">Method result codes are defined in </w:t>
+      </w:r>
+      <w:r>
+        <w:fldChar w:fldCharType="begin"/>
+      </w:r>
+      <w:r>
+        <w:instrText xml:space="preserve"> REF Sts_tbl_24 \h \* MERGEFORMAT </w:instrText>
+      </w:r>
+      <w:r>
+        <w:fldChar w:fldCharType="separate"/>
+      </w:r>
+      <w:r>
+        <w:rPr/>
+        <w:t xml:space="preserve">Table 24</w:t>
+      </w:r>
+      <w:r>
+        <w:fldChar w:fldCharType="end"/>
       </w:r>
     </w:p>
     <w:p>
@@ -33262,8 +34202,24 @@
         <w:pStyle w:val="PARAGRAPH"/>
       </w:pPr>
       <w:r>
-        <w:rPr/>
-        <w:t xml:space="preserve">Table 25 specifies the </w:t>
+        <w:fldChar w:fldCharType="begin"/>
+      </w:r>
+      <w:r>
+        <w:instrText xml:space="preserve"> REF Sts_tbl_25 \h \* MERGEFORMAT </w:instrText>
+      </w:r>
+      <w:r>
+        <w:fldChar w:fldCharType="separate"/>
+      </w:r>
+      <w:r>
+        <w:rPr/>
+        <w:t xml:space="preserve">Table 25</w:t>
+      </w:r>
+      <w:r>
+        <w:fldChar w:fldCharType="end"/>
+      </w:r>
+      <w:r>
+        <w:rPr/>
+        <w:t xml:space="preserve"> specifies the </w:t>
       </w:r>
       <w:r>
         <w:rPr>
@@ -33303,7 +34259,27 @@
       </w:r>
       <w:r>
         <w:rPr/>
-        <w:t xml:space="preserve">, where the input argument details are provided in &lt;xref ref-type="table" rid="tbl_23_setunitmode-method-parameters"&gt;Table 23&lt;/xref&gt;.</w:t>
+        <w:t xml:space="preserve">, where the input argument details are provided in </w:t>
+      </w:r>
+      <w:r>
+        <w:fldChar w:fldCharType="begin"/>
+      </w:r>
+      <w:r>
+        <w:instrText xml:space="preserve"> REF Sts_tbl_23 \h \* MERGEFORMAT </w:instrText>
+      </w:r>
+      <w:r>
+        <w:fldChar w:fldCharType="separate"/>
+      </w:r>
+      <w:r>
+        <w:rPr/>
+        <w:t xml:space="preserve">Table 23</w:t>
+      </w:r>
+      <w:r>
+        <w:fldChar w:fldCharType="end"/>
+      </w:r>
+      <w:r>
+        <w:rPr/>
+        <w:t xml:space="preserve">.</w:t>
       </w:r>
     </w:p>
     <w:p>
@@ -33661,7 +34637,23 @@
       </w:r>
       <w:r>
         <w:rPr/>
-        <w:t xml:space="preserve"> are defined in &lt;xref ref-type="table" rid="tbl_26_setmachspeed-method-parameters"&gt;Table 26&lt;/xref&gt;</w:t>
+        <w:t xml:space="preserve"> are defined in </w:t>
+      </w:r>
+      <w:r>
+        <w:fldChar w:fldCharType="begin"/>
+      </w:r>
+      <w:r>
+        <w:instrText xml:space="preserve"> REF Sts_tbl_26 \h \* MERGEFORMAT </w:instrText>
+      </w:r>
+      <w:r>
+        <w:fldChar w:fldCharType="separate"/>
+      </w:r>
+      <w:r>
+        <w:rPr/>
+        <w:t xml:space="preserve">Table 26</w:t>
+      </w:r>
+      <w:r>
+        <w:fldChar w:fldCharType="end"/>
       </w:r>
     </w:p>
     <w:p>
@@ -33829,7 +34821,23 @@
       </w:pPr>
       <w:r>
         <w:rPr/>
-        <w:t xml:space="preserve">Method result codes are defined in &lt;xref ref-type="table" rid="tbl_27_setmachspeed-method-resultcodes"&gt;Table 27&lt;/xref&gt;</w:t>
+        <w:t xml:space="preserve">Method result codes are defined in </w:t>
+      </w:r>
+      <w:r>
+        <w:fldChar w:fldCharType="begin"/>
+      </w:r>
+      <w:r>
+        <w:instrText xml:space="preserve"> REF Sts_tbl_27 \h \* MERGEFORMAT </w:instrText>
+      </w:r>
+      <w:r>
+        <w:fldChar w:fldCharType="separate"/>
+      </w:r>
+      <w:r>
+        <w:rPr/>
+        <w:t xml:space="preserve">Table 27</w:t>
+      </w:r>
+      <w:r>
+        <w:fldChar w:fldCharType="end"/>
       </w:r>
     </w:p>
     <w:p>
@@ -34339,8 +35347,24 @@
         <w:pStyle w:val="PARAGRAPH"/>
       </w:pPr>
       <w:r>
-        <w:rPr/>
-        <w:t xml:space="preserve">Table 28 specifies the </w:t>
+        <w:fldChar w:fldCharType="begin"/>
+      </w:r>
+      <w:r>
+        <w:instrText xml:space="preserve"> REF Sts_tbl_28 \h \* MERGEFORMAT </w:instrText>
+      </w:r>
+      <w:r>
+        <w:fldChar w:fldCharType="separate"/>
+      </w:r>
+      <w:r>
+        <w:rPr/>
+        <w:t xml:space="preserve">Table 28</w:t>
+      </w:r>
+      <w:r>
+        <w:fldChar w:fldCharType="end"/>
+      </w:r>
+      <w:r>
+        <w:rPr/>
+        <w:t xml:space="preserve"> specifies the </w:t>
       </w:r>
       <w:r>
         <w:rPr>
@@ -34380,7 +35404,27 @@
       </w:r>
       <w:r>
         <w:rPr/>
-        <w:t xml:space="preserve">, where the input argument details are provided in &lt;xref ref-type="table" rid="tbl_26_setmachspeed-method-parameters"&gt;Table 26&lt;/xref&gt;.</w:t>
+        <w:t xml:space="preserve">, where the input argument details are provided in </w:t>
+      </w:r>
+      <w:r>
+        <w:fldChar w:fldCharType="begin"/>
+      </w:r>
+      <w:r>
+        <w:instrText xml:space="preserve"> REF Sts_tbl_26 \h \* MERGEFORMAT </w:instrText>
+      </w:r>
+      <w:r>
+        <w:fldChar w:fldCharType="separate"/>
+      </w:r>
+      <w:r>
+        <w:rPr/>
+        <w:t xml:space="preserve">Table 26</w:t>
+      </w:r>
+      <w:r>
+        <w:fldChar w:fldCharType="end"/>
+      </w:r>
+      <w:r>
+        <w:rPr/>
+        <w:t xml:space="preserve">.</w:t>
       </w:r>
     </w:p>
     <w:p>
@@ -34738,7 +35782,27 @@
       </w:r>
       <w:r>
         <w:rPr/>
-        <w:t xml:space="preserve"> are defined in &lt;xref ref-type="table" rid="tbl_29_setproduct-method-parameters"&gt;Table 29&lt;/xref&gt;.</w:t>
+        <w:t xml:space="preserve"> are defined in </w:t>
+      </w:r>
+      <w:r>
+        <w:fldChar w:fldCharType="begin"/>
+      </w:r>
+      <w:r>
+        <w:instrText xml:space="preserve"> REF Sts_tbl_29 \h \* MERGEFORMAT </w:instrText>
+      </w:r>
+      <w:r>
+        <w:fldChar w:fldCharType="separate"/>
+      </w:r>
+      <w:r>
+        <w:rPr/>
+        <w:t xml:space="preserve">Table 29</w:t>
+      </w:r>
+      <w:r>
+        <w:fldChar w:fldCharType="end"/>
+      </w:r>
+      <w:r>
+        <w:rPr/>
+        <w:t xml:space="preserve">.</w:t>
       </w:r>
     </w:p>
     <w:p>
@@ -34906,7 +35970,23 @@
       </w:pPr>
       <w:r>
         <w:rPr/>
-        <w:t xml:space="preserve">Method result codes are defined in &lt;xref ref-type="table" rid="tbl_30_setproduct-method-result-codes"&gt;Table 30&lt;/xref&gt;</w:t>
+        <w:t xml:space="preserve">Method result codes are defined in </w:t>
+      </w:r>
+      <w:r>
+        <w:fldChar w:fldCharType="begin"/>
+      </w:r>
+      <w:r>
+        <w:instrText xml:space="preserve"> REF Sts_tbl_30 \h \* MERGEFORMAT </w:instrText>
+      </w:r>
+      <w:r>
+        <w:fldChar w:fldCharType="separate"/>
+      </w:r>
+      <w:r>
+        <w:rPr/>
+        <w:t xml:space="preserve">Table 30</w:t>
+      </w:r>
+      <w:r>
+        <w:fldChar w:fldCharType="end"/>
       </w:r>
     </w:p>
     <w:p>
@@ -35416,8 +36496,24 @@
         <w:pStyle w:val="PARAGRAPH"/>
       </w:pPr>
       <w:r>
-        <w:rPr/>
-        <w:t xml:space="preserve">Table 31 specifies the </w:t>
+        <w:fldChar w:fldCharType="begin"/>
+      </w:r>
+      <w:r>
+        <w:instrText xml:space="preserve"> REF Sts_tbl_31 \h \* MERGEFORMAT </w:instrText>
+      </w:r>
+      <w:r>
+        <w:fldChar w:fldCharType="separate"/>
+      </w:r>
+      <w:r>
+        <w:rPr/>
+        <w:t xml:space="preserve">Table 31</w:t>
+      </w:r>
+      <w:r>
+        <w:fldChar w:fldCharType="end"/>
+      </w:r>
+      <w:r>
+        <w:rPr/>
+        <w:t xml:space="preserve"> specifies the </w:t>
       </w:r>
       <w:r>
         <w:rPr>
@@ -35457,7 +36553,27 @@
       </w:r>
       <w:r>
         <w:rPr/>
-        <w:t xml:space="preserve">, where the input argument details are provided in &lt;xref ref-type="table" rid="tbl_29_setproduct-method-parameters"&gt;Table 29&lt;/xref&gt;.</w:t>
+        <w:t xml:space="preserve">, where the input argument details are provided in </w:t>
+      </w:r>
+      <w:r>
+        <w:fldChar w:fldCharType="begin"/>
+      </w:r>
+      <w:r>
+        <w:instrText xml:space="preserve"> REF Sts_tbl_29 \h \* MERGEFORMAT </w:instrText>
+      </w:r>
+      <w:r>
+        <w:fldChar w:fldCharType="separate"/>
+      </w:r>
+      <w:r>
+        <w:rPr/>
+        <w:t xml:space="preserve">Table 29</w:t>
+      </w:r>
+      <w:r>
+        <w:fldChar w:fldCharType="end"/>
+      </w:r>
+      <w:r>
+        <w:rPr/>
+        <w:t xml:space="preserve">.</w:t>
       </w:r>
     </w:p>
     <w:p>
@@ -35857,7 +36973,27 @@
       </w:pPr>
       <w:r>
         <w:rPr/>
-        <w:t xml:space="preserve">Method result codes are defined in &lt;xref ref-type="table" rid="tbl_32_abort-method-result-codes"&gt;Table 32&lt;/xref&gt;.</w:t>
+        <w:t xml:space="preserve">Method result codes are defined in </w:t>
+      </w:r>
+      <w:r>
+        <w:fldChar w:fldCharType="begin"/>
+      </w:r>
+      <w:r>
+        <w:instrText xml:space="preserve"> REF Sts_tbl_32 \h \* MERGEFORMAT </w:instrText>
+      </w:r>
+      <w:r>
+        <w:fldChar w:fldCharType="separate"/>
+      </w:r>
+      <w:r>
+        <w:rPr/>
+        <w:t xml:space="preserve">Table 32</w:t>
+      </w:r>
+      <w:r>
+        <w:fldChar w:fldCharType="end"/>
+      </w:r>
+      <w:r>
+        <w:rPr/>
+        <w:t xml:space="preserve">.</w:t>
       </w:r>
     </w:p>
     <w:p>
@@ -36173,8 +37309,24 @@
         <w:pStyle w:val="PARAGRAPH"/>
       </w:pPr>
       <w:r>
-        <w:rPr/>
-        <w:t xml:space="preserve">Table 33 specifies the </w:t>
+        <w:fldChar w:fldCharType="begin"/>
+      </w:r>
+      <w:r>
+        <w:instrText xml:space="preserve"> REF Sts_tbl_33 \h \* MERGEFORMAT </w:instrText>
+      </w:r>
+      <w:r>
+        <w:fldChar w:fldCharType="separate"/>
+      </w:r>
+      <w:r>
+        <w:rPr/>
+        <w:t xml:space="preserve">Table 33</w:t>
+      </w:r>
+      <w:r>
+        <w:fldChar w:fldCharType="end"/>
+      </w:r>
+      <w:r>
+        <w:rPr/>
+        <w:t xml:space="preserve"> specifies the </w:t>
       </w:r>
       <w:r>
         <w:rPr>
@@ -36526,7 +37678,27 @@
       </w:pPr>
       <w:r>
         <w:rPr/>
-        <w:t xml:space="preserve">Method result codes are defined in &lt;xref ref-type="table" rid="tbl_34_clear-method-result-codes"&gt;Table 34&lt;/xref&gt;.&lt;/p&gt;</w:t>
+        <w:t xml:space="preserve">Method result codes are defined in </w:t>
+      </w:r>
+      <w:r>
+        <w:fldChar w:fldCharType="begin"/>
+      </w:r>
+      <w:r>
+        <w:instrText xml:space="preserve"> REF Sts_tbl_34 \h \* MERGEFORMAT </w:instrText>
+      </w:r>
+      <w:r>
+        <w:fldChar w:fldCharType="separate"/>
+      </w:r>
+      <w:r>
+        <w:rPr/>
+        <w:t xml:space="preserve">Table 34</w:t>
+      </w:r>
+      <w:r>
+        <w:fldChar w:fldCharType="end"/>
+      </w:r>
+      <w:r>
+        <w:rPr/>
+        <w:t xml:space="preserve">.</w:t>
       </w:r>
     </w:p>
     <w:p>
@@ -36842,8 +38014,24 @@
         <w:pStyle w:val="PARAGRAPH"/>
       </w:pPr>
       <w:r>
-        <w:rPr/>
-        <w:t xml:space="preserve">Table 35 specifies the </w:t>
+        <w:fldChar w:fldCharType="begin"/>
+      </w:r>
+      <w:r>
+        <w:instrText xml:space="preserve"> REF Sts_tbl_35 \h \* MERGEFORMAT </w:instrText>
+      </w:r>
+      <w:r>
+        <w:fldChar w:fldCharType="separate"/>
+      </w:r>
+      <w:r>
+        <w:rPr/>
+        <w:t xml:space="preserve">Table 35</w:t>
+      </w:r>
+      <w:r>
+        <w:fldChar w:fldCharType="end"/>
+      </w:r>
+      <w:r>
+        <w:rPr/>
+        <w:t xml:space="preserve"> specifies the </w:t>
       </w:r>
       <w:r>
         <w:rPr>
@@ -37195,7 +38383,23 @@
       </w:pPr>
       <w:r>
         <w:rPr/>
-        <w:t xml:space="preserve">Method result codes are defined in &lt;xref ref-type="table" rid="tbl_36_stop-method-result-codes"&gt;Table 36&lt;/xref&gt;</w:t>
+        <w:t xml:space="preserve">Method result codes are defined in </w:t>
+      </w:r>
+      <w:r>
+        <w:fldChar w:fldCharType="begin"/>
+      </w:r>
+      <w:r>
+        <w:instrText xml:space="preserve"> REF Sts_tbl_36 \h \* MERGEFORMAT </w:instrText>
+      </w:r>
+      <w:r>
+        <w:fldChar w:fldCharType="separate"/>
+      </w:r>
+      <w:r>
+        <w:rPr/>
+        <w:t xml:space="preserve">Table 36</w:t>
+      </w:r>
+      <w:r>
+        <w:fldChar w:fldCharType="end"/>
       </w:r>
     </w:p>
     <w:p>
@@ -37511,8 +38715,24 @@
         <w:pStyle w:val="PARAGRAPH"/>
       </w:pPr>
       <w:r>
-        <w:rPr/>
-        <w:t xml:space="preserve">Table 37 specifies the </w:t>
+        <w:fldChar w:fldCharType="begin"/>
+      </w:r>
+      <w:r>
+        <w:instrText xml:space="preserve"> REF Sts_tbl_37 \h \* MERGEFORMAT </w:instrText>
+      </w:r>
+      <w:r>
+        <w:fldChar w:fldCharType="separate"/>
+      </w:r>
+      <w:r>
+        <w:rPr/>
+        <w:t xml:space="preserve">Table 37</w:t>
+      </w:r>
+      <w:r>
+        <w:fldChar w:fldCharType="end"/>
+      </w:r>
+      <w:r>
+        <w:rPr/>
+        <w:t xml:space="preserve"> specifies the </w:t>
       </w:r>
       <w:r>
         <w:rPr>
@@ -37864,7 +39084,27 @@
       </w:pPr>
       <w:r>
         <w:rPr/>
-        <w:t xml:space="preserve">Method result codes are defined in &lt;xref ref-type="table" rid="tbl_38_reset-method-result-codes"&gt;Table 38&lt;/xref&gt;.</w:t>
+        <w:t xml:space="preserve">Method result codes are defined in </w:t>
+      </w:r>
+      <w:r>
+        <w:fldChar w:fldCharType="begin"/>
+      </w:r>
+      <w:r>
+        <w:instrText xml:space="preserve"> REF Sts_tbl_38 \h \* MERGEFORMAT </w:instrText>
+      </w:r>
+      <w:r>
+        <w:fldChar w:fldCharType="separate"/>
+      </w:r>
+      <w:r>
+        <w:rPr/>
+        <w:t xml:space="preserve">Table 38</w:t>
+      </w:r>
+      <w:r>
+        <w:fldChar w:fldCharType="end"/>
+      </w:r>
+      <w:r>
+        <w:rPr/>
+        <w:t xml:space="preserve">.</w:t>
       </w:r>
     </w:p>
     <w:p>
@@ -38180,8 +39420,24 @@
         <w:pStyle w:val="PARAGRAPH"/>
       </w:pPr>
       <w:r>
-        <w:rPr/>
-        <w:t xml:space="preserve">Table 39 specifies the </w:t>
+        <w:fldChar w:fldCharType="begin"/>
+      </w:r>
+      <w:r>
+        <w:instrText xml:space="preserve"> REF Sts_tbl_39 \h \* MERGEFORMAT </w:instrText>
+      </w:r>
+      <w:r>
+        <w:fldChar w:fldCharType="separate"/>
+      </w:r>
+      <w:r>
+        <w:rPr/>
+        <w:t xml:space="preserve">Table 39</w:t>
+      </w:r>
+      <w:r>
+        <w:fldChar w:fldCharType="end"/>
+      </w:r>
+      <w:r>
+        <w:rPr/>
+        <w:t xml:space="preserve"> specifies the </w:t>
       </w:r>
       <w:r>
         <w:rPr>
@@ -38553,7 +39809,27 @@
       </w:pPr>
       <w:r>
         <w:rPr/>
-        <w:t xml:space="preserve">Method result codes are defined in &lt;xref ref-type="table" rid="tbl_40_tocomplete-method-result-codes"&gt;Table 40&lt;/xref&gt;.</w:t>
+        <w:t xml:space="preserve">Method result codes are defined in </w:t>
+      </w:r>
+      <w:r>
+        <w:fldChar w:fldCharType="begin"/>
+      </w:r>
+      <w:r>
+        <w:instrText xml:space="preserve"> REF Sts_tbl_40 \h \* MERGEFORMAT </w:instrText>
+      </w:r>
+      <w:r>
+        <w:fldChar w:fldCharType="separate"/>
+      </w:r>
+      <w:r>
+        <w:rPr/>
+        <w:t xml:space="preserve">Table 40</w:t>
+      </w:r>
+      <w:r>
+        <w:fldChar w:fldCharType="end"/>
+      </w:r>
+      <w:r>
+        <w:rPr/>
+        <w:t xml:space="preserve">.</w:t>
       </w:r>
     </w:p>
     <w:p>
@@ -38869,8 +40145,24 @@
         <w:pStyle w:val="PARAGRAPH"/>
       </w:pPr>
       <w:r>
-        <w:rPr/>
-        <w:t xml:space="preserve">Table 41 specifies the </w:t>
+        <w:fldChar w:fldCharType="begin"/>
+      </w:r>
+      <w:r>
+        <w:instrText xml:space="preserve"> REF Sts_tbl_41 \h \* MERGEFORMAT </w:instrText>
+      </w:r>
+      <w:r>
+        <w:fldChar w:fldCharType="separate"/>
+      </w:r>
+      <w:r>
+        <w:rPr/>
+        <w:t xml:space="preserve">Table 41</w:t>
+      </w:r>
+      <w:r>
+        <w:fldChar w:fldCharType="end"/>
+      </w:r>
+      <w:r>
+        <w:rPr/>
+        <w:t xml:space="preserve"> specifies the </w:t>
       </w:r>
       <w:r>
         <w:rPr>
@@ -39190,7 +40482,43 @@
       </w:r>
       <w:r>
         <w:rPr/>
-        <w:t xml:space="preserve"> State and send parameters at the same time. Which is an extension to the &lt;xref ref-type="other" rid="ref_isapart2"&gt;ISA-TR88.00.02-2015&lt;/xref&gt; specification. The parameter is defined in &lt;xref ref-type="table" rid="tbl_42_start-method-parameters"&gt;Table 42&lt;/xref&gt;</w:t>
+        <w:t xml:space="preserve"> State and send parameters at the same time. Which is an extension to the </w:t>
+      </w:r>
+      <w:r>
+        <w:fldChar w:fldCharType="begin"/>
+      </w:r>
+      <w:r>
+        <w:instrText xml:space="preserve"> REF Sts_ref_tr88 \h \* MERGEFORMAT </w:instrText>
+      </w:r>
+      <w:r>
+        <w:fldChar w:fldCharType="separate"/>
+      </w:r>
+      <w:r>
+        <w:rPr/>
+        <w:t xml:space="preserve">ISA-TR88.00.02-2022</w:t>
+      </w:r>
+      <w:r>
+        <w:fldChar w:fldCharType="end"/>
+      </w:r>
+      <w:r>
+        <w:rPr/>
+        <w:t xml:space="preserve"> specification. The parameter is defined in </w:t>
+      </w:r>
+      <w:r>
+        <w:fldChar w:fldCharType="begin"/>
+      </w:r>
+      <w:r>
+        <w:instrText xml:space="preserve"> REF Sts_tbl_42 \h \* MERGEFORMAT </w:instrText>
+      </w:r>
+      <w:r>
+        <w:fldChar w:fldCharType="separate"/>
+      </w:r>
+      <w:r>
+        <w:rPr/>
+        <w:t xml:space="preserve">Table 42</w:t>
+      </w:r>
+      <w:r>
+        <w:fldChar w:fldCharType="end"/>
       </w:r>
     </w:p>
     <w:p>
@@ -39350,7 +40678,27 @@
       </w:r>
       <w:r>
         <w:rPr/>
-        <w:t xml:space="preserve"> result codes are defined in &lt;xref ref-type="table" rid="tbl_43_start-method-result-codes"&gt;Table 43&lt;/xref&gt;.</w:t>
+        <w:t xml:space="preserve"> result codes are defined in </w:t>
+      </w:r>
+      <w:r>
+        <w:fldChar w:fldCharType="begin"/>
+      </w:r>
+      <w:r>
+        <w:instrText xml:space="preserve"> REF Sts_tbl_43 \h \* MERGEFORMAT </w:instrText>
+      </w:r>
+      <w:r>
+        <w:fldChar w:fldCharType="separate"/>
+      </w:r>
+      <w:r>
+        <w:rPr/>
+        <w:t xml:space="preserve">Table 43</w:t>
+      </w:r>
+      <w:r>
+        <w:fldChar w:fldCharType="end"/>
+      </w:r>
+      <w:r>
+        <w:rPr/>
+        <w:t xml:space="preserve">.</w:t>
       </w:r>
     </w:p>
     <w:p>
@@ -39860,8 +41208,24 @@
         <w:pStyle w:val="PARAGRAPH"/>
       </w:pPr>
       <w:r>
-        <w:rPr/>
-        <w:t xml:space="preserve">&lt;xref ref-type="table" rid="tbl_44_start-method-addressspace-definition"&gt;Table 44&lt;/xref&gt; specifies the </w:t>
+        <w:fldChar w:fldCharType="begin"/>
+      </w:r>
+      <w:r>
+        <w:instrText xml:space="preserve"> REF Sts_tbl_44 \h \* MERGEFORMAT </w:instrText>
+      </w:r>
+      <w:r>
+        <w:fldChar w:fldCharType="separate"/>
+      </w:r>
+      <w:r>
+        <w:rPr/>
+        <w:t xml:space="preserve">Table 44</w:t>
+      </w:r>
+      <w:r>
+        <w:fldChar w:fldCharType="end"/>
+      </w:r>
+      <w:r>
+        <w:rPr/>
+        <w:t xml:space="preserve"> specifies the </w:t>
       </w:r>
       <w:r>
         <w:rPr>
@@ -39901,7 +41265,27 @@
       </w:r>
       <w:r>
         <w:rPr/>
-        <w:t xml:space="preserve">, where the input argument details are provided in &lt;xref ref-type="table" rid="tbl_42_start-method-parameters"&gt;Table 42&lt;/xref&gt;.</w:t>
+        <w:t xml:space="preserve">, where the input argument details are provided in </w:t>
+      </w:r>
+      <w:r>
+        <w:fldChar w:fldCharType="begin"/>
+      </w:r>
+      <w:r>
+        <w:instrText xml:space="preserve"> REF Sts_tbl_42 \h \* MERGEFORMAT </w:instrText>
+      </w:r>
+      <w:r>
+        <w:fldChar w:fldCharType="separate"/>
+      </w:r>
+      <w:r>
+        <w:rPr/>
+        <w:t xml:space="preserve">Table 42</w:t>
+      </w:r>
+      <w:r>
+        <w:fldChar w:fldCharType="end"/>
+      </w:r>
+      <w:r>
+        <w:rPr/>
+        <w:t xml:space="preserve">.</w:t>
       </w:r>
     </w:p>
     <w:p>
@@ -40307,7 +41691,23 @@
       </w:r>
       <w:r>
         <w:rPr/>
-        <w:t xml:space="preserve"> result codes are defined in &lt;xref ref-type="table" rid="tbl_45_unhold-method-result-codes"&gt;Table 45&lt;/xref&gt;</w:t>
+        <w:t xml:space="preserve"> result codes are defined in </w:t>
+      </w:r>
+      <w:r>
+        <w:fldChar w:fldCharType="begin"/>
+      </w:r>
+      <w:r>
+        <w:instrText xml:space="preserve"> REF Sts_tbl_45 \h \* MERGEFORMAT </w:instrText>
+      </w:r>
+      <w:r>
+        <w:fldChar w:fldCharType="separate"/>
+      </w:r>
+      <w:r>
+        <w:rPr/>
+        <w:t xml:space="preserve">Table 45</w:t>
+      </w:r>
+      <w:r>
+        <w:fldChar w:fldCharType="end"/>
       </w:r>
     </w:p>
     <w:p>
@@ -40623,8 +42023,24 @@
         <w:pStyle w:val="PARAGRAPH"/>
       </w:pPr>
       <w:r>
-        <w:rPr/>
-        <w:t xml:space="preserve">&lt;xref ref-type="table" rid="tbl_46_unhold-method-addressspace-definition"&gt;Table 46&lt;/xref&gt; specifies the </w:t>
+        <w:fldChar w:fldCharType="begin"/>
+      </w:r>
+      <w:r>
+        <w:instrText xml:space="preserve"> REF Sts_tbl_46 \h \* MERGEFORMAT </w:instrText>
+      </w:r>
+      <w:r>
+        <w:fldChar w:fldCharType="separate"/>
+      </w:r>
+      <w:r>
+        <w:rPr/>
+        <w:t xml:space="preserve">Table 46</w:t>
+      </w:r>
+      <w:r>
+        <w:fldChar w:fldCharType="end"/>
+      </w:r>
+      <w:r>
+        <w:rPr/>
+        <w:t xml:space="preserve"> specifies the </w:t>
       </w:r>
       <w:r>
         <w:rPr>
@@ -40978,7 +42394,23 @@
       </w:r>
       <w:r>
         <w:rPr/>
-        <w:t xml:space="preserve"> result codes are defined in &lt;xref ref-type="table" rid="tbl_47_suspend-method-result-codes"&gt;Table 47&lt;/xref&gt;</w:t>
+        <w:t xml:space="preserve"> result codes are defined in </w:t>
+      </w:r>
+      <w:r>
+        <w:fldChar w:fldCharType="begin"/>
+      </w:r>
+      <w:r>
+        <w:instrText xml:space="preserve"> REF Sts_tbl_47 \h \* MERGEFORMAT </w:instrText>
+      </w:r>
+      <w:r>
+        <w:fldChar w:fldCharType="separate"/>
+      </w:r>
+      <w:r>
+        <w:rPr/>
+        <w:t xml:space="preserve">Table 47</w:t>
+      </w:r>
+      <w:r>
+        <w:fldChar w:fldCharType="end"/>
       </w:r>
     </w:p>
     <w:p>
@@ -41294,8 +42726,24 @@
         <w:pStyle w:val="PARAGRAPH"/>
       </w:pPr>
       <w:r>
-        <w:rPr/>
-        <w:t xml:space="preserve">&lt;xref ref-type="table" rid="tbl_48_suspend-method-addressspace-definition"&gt;Table 48&lt;/xref&gt; specifies the </w:t>
+        <w:fldChar w:fldCharType="begin"/>
+      </w:r>
+      <w:r>
+        <w:instrText xml:space="preserve"> REF Sts_tbl_48 \h \* MERGEFORMAT </w:instrText>
+      </w:r>
+      <w:r>
+        <w:fldChar w:fldCharType="separate"/>
+      </w:r>
+      <w:r>
+        <w:rPr/>
+        <w:t xml:space="preserve">Table 48</w:t>
+      </w:r>
+      <w:r>
+        <w:fldChar w:fldCharType="end"/>
+      </w:r>
+      <w:r>
+        <w:rPr/>
+        <w:t xml:space="preserve"> specifies the </w:t>
       </w:r>
       <w:r>
         <w:rPr>
@@ -41653,7 +43101,23 @@
       </w:r>
       <w:r>
         <w:rPr/>
-        <w:t xml:space="preserve"> result codes are defined in &lt;xref ref-type="table" rid="tbl_49_unsuspend-method-result-codes"&gt;Table 49&lt;/xref&gt;</w:t>
+        <w:t xml:space="preserve"> result codes are defined in </w:t>
+      </w:r>
+      <w:r>
+        <w:fldChar w:fldCharType="begin"/>
+      </w:r>
+      <w:r>
+        <w:instrText xml:space="preserve"> REF Sts_tbl_49 \h \* MERGEFORMAT </w:instrText>
+      </w:r>
+      <w:r>
+        <w:fldChar w:fldCharType="separate"/>
+      </w:r>
+      <w:r>
+        <w:rPr/>
+        <w:t xml:space="preserve">Table 49</w:t>
+      </w:r>
+      <w:r>
+        <w:fldChar w:fldCharType="end"/>
       </w:r>
     </w:p>
     <w:p>
@@ -41969,8 +43433,24 @@
         <w:pStyle w:val="PARAGRAPH"/>
       </w:pPr>
       <w:r>
-        <w:rPr/>
-        <w:t xml:space="preserve">&lt;xref ref-type="table" rid="tbl_50_unsuspend-method-addressspace-definition"&gt;Table 50&lt;/xref&gt; specifies the </w:t>
+        <w:fldChar w:fldCharType="begin"/>
+      </w:r>
+      <w:r>
+        <w:instrText xml:space="preserve"> REF Sts_tbl_50 \h \* MERGEFORMAT </w:instrText>
+      </w:r>
+      <w:r>
+        <w:fldChar w:fldCharType="separate"/>
+      </w:r>
+      <w:r>
+        <w:rPr/>
+        <w:t xml:space="preserve">Table 50</w:t>
+      </w:r>
+      <w:r>
+        <w:fldChar w:fldCharType="end"/>
+      </w:r>
+      <w:r>
+        <w:rPr/>
+        <w:t xml:space="preserve"> specifies the </w:t>
       </w:r>
       <w:r>
         <w:rPr>
@@ -42348,7 +43828,23 @@
       </w:r>
       <w:r>
         <w:rPr/>
-        <w:t xml:space="preserve"> result codes are defined in &lt;xref ref-type="table" rid="tbl_51_hold-method-result-codes"&gt;Table 51&lt;/xref&gt;</w:t>
+        <w:t xml:space="preserve"> result codes are defined in </w:t>
+      </w:r>
+      <w:r>
+        <w:fldChar w:fldCharType="begin"/>
+      </w:r>
+      <w:r>
+        <w:instrText xml:space="preserve"> REF Sts_tbl_51 \h \* MERGEFORMAT </w:instrText>
+      </w:r>
+      <w:r>
+        <w:fldChar w:fldCharType="separate"/>
+      </w:r>
+      <w:r>
+        <w:rPr/>
+        <w:t xml:space="preserve">Table 51</w:t>
+      </w:r>
+      <w:r>
+        <w:fldChar w:fldCharType="end"/>
       </w:r>
     </w:p>
     <w:p>
@@ -42664,8 +44160,24 @@
         <w:pStyle w:val="PARAGRAPH"/>
       </w:pPr>
       <w:r>
-        <w:rPr/>
-        <w:t xml:space="preserve">&lt;xref ref-type="table" rid="tbl_52_hold-method-addressspace-definition"&gt;Table 52&lt;/xref&gt; specifies the </w:t>
+        <w:fldChar w:fldCharType="begin"/>
+      </w:r>
+      <w:r>
+        <w:instrText xml:space="preserve"> REF Sts_tbl_52 \h \* MERGEFORMAT </w:instrText>
+      </w:r>
+      <w:r>
+        <w:fldChar w:fldCharType="separate"/>
+      </w:r>
+      <w:r>
+        <w:rPr/>
+        <w:t xml:space="preserve">Table 52</w:t>
+      </w:r>
+      <w:r>
+        <w:fldChar w:fldCharType="end"/>
+      </w:r>
+      <w:r>
+        <w:rPr/>
+        <w:t xml:space="preserve"> specifies the </w:t>
       </w:r>
       <w:r>
         <w:rPr>
@@ -42965,7 +44477,47 @@
       </w:r>
       <w:r>
         <w:rPr/>
-        <w:t xml:space="preserve"> that can then be passed on to any other internal system as illustrated in &lt;xref ref-type="fig" rid="fig_19_remote-command-and-internal-systems"&gt;Figure 19&lt;/xref&gt; or it can be used to pass information on to an upstream or downstream system as illustrated in &lt;xref ref-type="fig" rid="fig_20_remote-command-line-and-upstreamdownstream-systems"&gt;Figure 20&lt;/xref&gt;. In both cases, it is up to the UA </w:t>
+        <w:t xml:space="preserve"> that can then be passed on to any other internal system as illustrated in </w:t>
+      </w:r>
+      <w:r>
+        <w:fldChar w:fldCharType="begin"/>
+      </w:r>
+      <w:r>
+        <w:instrText xml:space="preserve"> REF Sts_fig_19 \h \* MERGEFORMAT </w:instrText>
+      </w:r>
+      <w:r>
+        <w:fldChar w:fldCharType="separate"/>
+      </w:r>
+      <w:r>
+        <w:rPr/>
+        <w:t xml:space="preserve">Figure 19</w:t>
+      </w:r>
+      <w:r>
+        <w:fldChar w:fldCharType="end"/>
+      </w:r>
+      <w:r>
+        <w:rPr/>
+        <w:t xml:space="preserve"> or it can be used to pass information on to an upstream or downstream system as illustrated in </w:t>
+      </w:r>
+      <w:r>
+        <w:fldChar w:fldCharType="begin"/>
+      </w:r>
+      <w:r>
+        <w:instrText xml:space="preserve"> REF Sts_fig_20 \h \* MERGEFORMAT </w:instrText>
+      </w:r>
+      <w:r>
+        <w:fldChar w:fldCharType="separate"/>
+      </w:r>
+      <w:r>
+        <w:rPr/>
+        <w:t xml:space="preserve">Figure 20</w:t>
+      </w:r>
+      <w:r>
+        <w:fldChar w:fldCharType="end"/>
+      </w:r>
+      <w:r>
+        <w:rPr/>
+        <w:t xml:space="preserve">. In both cases, it is up to the UA </w:t>
       </w:r>
       <w:r>
         <w:rPr>
@@ -42999,7 +44551,7 @@
                     <pic:cNvPicPr/>
                   </pic:nvPicPr>
                   <pic:blipFill>
-                    <a:blip r:embed="Rf92edf6057574529"/>
+                    <a:blip r:embed="R3316b9f77aeb4db9"/>
                     <a:stretch>
                       <a:fillRect/>
                     </a:stretch>
@@ -43074,7 +44626,7 @@
                     <pic:cNvPicPr/>
                   </pic:nvPicPr>
                   <pic:blipFill>
-                    <a:blip r:embed="R3e7cef19d66d41d8"/>
+                    <a:blip r:embed="Rb090c39ac1a048d8"/>
                     <a:stretch>
                       <a:fillRect/>
                     </a:stretch>
@@ -43144,7 +44696,23 @@
       </w:r>
       <w:r>
         <w:rPr/>
-        <w:t xml:space="preserve"> Method parameters are defined in&lt;bold&gt; &lt;/bold&gt;&lt;xref ref-type="table" rid="tbl_53_remotecommand-method-parameters"&gt;Table 53&lt;/xref&gt;</w:t>
+        <w:t xml:space="preserve"> Method parameters are defined in </w:t>
+      </w:r>
+      <w:r>
+        <w:fldChar w:fldCharType="begin"/>
+      </w:r>
+      <w:r>
+        <w:instrText xml:space="preserve"> REF Sts_tbl_53 \h \* MERGEFORMAT </w:instrText>
+      </w:r>
+      <w:r>
+        <w:fldChar w:fldCharType="separate"/>
+      </w:r>
+      <w:r>
+        <w:rPr/>
+        <w:t xml:space="preserve">Table 53</w:t>
+      </w:r>
+      <w:r>
+        <w:fldChar w:fldCharType="end"/>
       </w:r>
     </w:p>
     <w:p>
@@ -43281,7 +44849,43 @@
             </w:pPr>
             <w:r>
               <w:rPr/>
-              <w:t xml:space="preserve">This structure is an array of remote interface information which include Number, ControlCmdNumber, CmdValue and Parameter. Parameter itself is a structure formally defined in &lt;xref ref-type="sec" rid="sec_6-5-4_packmldescriptordatatype"&gt;6.5.4&lt;/xref&gt;. The PackMLRemoteInterfaceDataType is formally defined in &lt;xref ref-type="sec" rid="sec_6-5-7_packmlremoteinterfacedatatype"&gt;6.5.7&lt;/xref&gt;</w:t>
+              <w:t xml:space="preserve">This structure is an array of remote interface information which include Number, ControlCmdNumber, CmdValue and Parameter. Parameter itself is a structure formally defined in </w:t>
+            </w:r>
+            <w:r>
+              <w:fldChar w:fldCharType="begin"/>
+            </w:r>
+            <w:r>
+              <w:instrText xml:space="preserve"> REF Sts_sec_6_5_4 \r \h \* MERGEFORMAT </w:instrText>
+            </w:r>
+            <w:r>
+              <w:fldChar w:fldCharType="separate"/>
+            </w:r>
+            <w:r>
+              <w:rPr/>
+              <w:t xml:space="preserve">6.5.4</w:t>
+            </w:r>
+            <w:r>
+              <w:fldChar w:fldCharType="end"/>
+            </w:r>
+            <w:r>
+              <w:rPr/>
+              <w:t xml:space="preserve">. The PackMLRemoteInterfaceDataType is formally defined in </w:t>
+            </w:r>
+            <w:r>
+              <w:fldChar w:fldCharType="begin"/>
+            </w:r>
+            <w:r>
+              <w:instrText xml:space="preserve"> REF Sts_sec_6_5_7 \r \h \* MERGEFORMAT </w:instrText>
+            </w:r>
+            <w:r>
+              <w:fldChar w:fldCharType="separate"/>
+            </w:r>
+            <w:r>
+              <w:rPr/>
+              <w:t xml:space="preserve">6.5.7</w:t>
+            </w:r>
+            <w:r>
+              <w:fldChar w:fldCharType="end"/>
             </w:r>
           </w:p>
         </w:tc>
@@ -43304,7 +44908,27 @@
       </w:r>
       <w:r>
         <w:rPr/>
-        <w:t xml:space="preserve"> result codes are defined in &lt;xref ref-type="table" rid="tbl_54_remotecommand-method-result-codes"&gt;Table 54&lt;/xref&gt;.</w:t>
+        <w:t xml:space="preserve"> result codes are defined in </w:t>
+      </w:r>
+      <w:r>
+        <w:fldChar w:fldCharType="begin"/>
+      </w:r>
+      <w:r>
+        <w:instrText xml:space="preserve"> REF Sts_tbl_54 \h \* MERGEFORMAT </w:instrText>
+      </w:r>
+      <w:r>
+        <w:fldChar w:fldCharType="separate"/>
+      </w:r>
+      <w:r>
+        <w:rPr/>
+        <w:t xml:space="preserve">Table 54</w:t>
+      </w:r>
+      <w:r>
+        <w:fldChar w:fldCharType="end"/>
+      </w:r>
+      <w:r>
+        <w:rPr/>
+        <w:t xml:space="preserve">.</w:t>
       </w:r>
     </w:p>
     <w:p>
@@ -43866,8 +45490,24 @@
         <w:pStyle w:val="PARAGRAPH"/>
       </w:pPr>
       <w:r>
-        <w:rPr/>
-        <w:t xml:space="preserve">&lt;xref ref-type="table" rid="tbl_55_remotecommand-method-addressspace-definition"&gt;Table 55&lt;/xref&gt; specifies the </w:t>
+        <w:fldChar w:fldCharType="begin"/>
+      </w:r>
+      <w:r>
+        <w:instrText xml:space="preserve"> REF Sts_tbl_55 \h \* MERGEFORMAT </w:instrText>
+      </w:r>
+      <w:r>
+        <w:fldChar w:fldCharType="separate"/>
+      </w:r>
+      <w:r>
+        <w:rPr/>
+        <w:t xml:space="preserve">Table 55</w:t>
+      </w:r>
+      <w:r>
+        <w:fldChar w:fldCharType="end"/>
+      </w:r>
+      <w:r>
+        <w:rPr/>
+        <w:t xml:space="preserve"> specifies the </w:t>
       </w:r>
       <w:r>
         <w:rPr>
@@ -43907,7 +45547,27 @@
       </w:r>
       <w:r>
         <w:rPr/>
-        <w:t xml:space="preserve">, where the input argument details are provided in &lt;xref ref-type="table" rid="tbl_53_remotecommand-method-parameters"&gt;Table 53&lt;/xref&gt;.</w:t>
+        <w:t xml:space="preserve">, where the input argument details are provided in </w:t>
+      </w:r>
+      <w:r>
+        <w:fldChar w:fldCharType="begin"/>
+      </w:r>
+      <w:r>
+        <w:instrText xml:space="preserve"> REF Sts_tbl_53 \h \* MERGEFORMAT </w:instrText>
+      </w:r>
+      <w:r>
+        <w:fldChar w:fldCharType="separate"/>
+      </w:r>
+      <w:r>
+        <w:rPr/>
+        <w:t xml:space="preserve">Table 53</w:t>
+      </w:r>
+      <w:r>
+        <w:fldChar w:fldCharType="end"/>
+      </w:r>
+      <w:r>
+        <w:rPr/>
+        <w:t xml:space="preserve">.</w:t>
       </w:r>
     </w:p>
     <w:p>
@@ -44275,7 +45935,27 @@
       </w:r>
       <w:r>
         <w:rPr/>
-        <w:t xml:space="preserve"> are defined in &lt;xref ref-type="table" rid="tbl_56_setinterlock-method-parameters"&gt;Table 56&lt;/xref&gt;.</w:t>
+        <w:t xml:space="preserve"> are defined in </w:t>
+      </w:r>
+      <w:r>
+        <w:fldChar w:fldCharType="begin"/>
+      </w:r>
+      <w:r>
+        <w:instrText xml:space="preserve"> REF Sts_tbl_56 \h \* MERGEFORMAT </w:instrText>
+      </w:r>
+      <w:r>
+        <w:fldChar w:fldCharType="separate"/>
+      </w:r>
+      <w:r>
+        <w:rPr/>
+        <w:t xml:space="preserve">Table 56</w:t>
+      </w:r>
+      <w:r>
+        <w:fldChar w:fldCharType="end"/>
+      </w:r>
+      <w:r>
+        <w:rPr/>
+        <w:t xml:space="preserve">.</w:t>
       </w:r>
     </w:p>
     <w:p>
@@ -44471,7 +46151,23 @@
       </w:r>
       <w:r>
         <w:rPr/>
-        <w:t xml:space="preserve"> result codes are defined in &lt;xref ref-type="table" rid="tbl_57_setinterlock-method-result-codes"&gt;Table 57&lt;/xref&gt;</w:t>
+        <w:t xml:space="preserve"> result codes are defined in </w:t>
+      </w:r>
+      <w:r>
+        <w:fldChar w:fldCharType="begin"/>
+      </w:r>
+      <w:r>
+        <w:instrText xml:space="preserve"> REF Sts_tbl_57 \h \* MERGEFORMAT </w:instrText>
+      </w:r>
+      <w:r>
+        <w:fldChar w:fldCharType="separate"/>
+      </w:r>
+      <w:r>
+        <w:rPr/>
+        <w:t xml:space="preserve">Table 57</w:t>
+      </w:r>
+      <w:r>
+        <w:fldChar w:fldCharType="end"/>
       </w:r>
     </w:p>
     <w:p>
@@ -45033,8 +46729,24 @@
         <w:pStyle w:val="PARAGRAPH"/>
       </w:pPr>
       <w:r>
-        <w:rPr/>
-        <w:t xml:space="preserve">&lt;xref ref-type="table" rid="tbl_58_setinterlock-method-addressspace-definition"&gt;Table 58&lt;/xref&gt; specifies the </w:t>
+        <w:fldChar w:fldCharType="begin"/>
+      </w:r>
+      <w:r>
+        <w:instrText xml:space="preserve"> REF Sts_tbl_58 \h \* MERGEFORMAT </w:instrText>
+      </w:r>
+      <w:r>
+        <w:fldChar w:fldCharType="separate"/>
+      </w:r>
+      <w:r>
+        <w:rPr/>
+        <w:t xml:space="preserve">Table 58</w:t>
+      </w:r>
+      <w:r>
+        <w:fldChar w:fldCharType="end"/>
+      </w:r>
+      <w:r>
+        <w:rPr/>
+        <w:t xml:space="preserve"> specifies the </w:t>
       </w:r>
       <w:r>
         <w:rPr>
@@ -45074,7 +46786,27 @@
       </w:r>
       <w:r>
         <w:rPr/>
-        <w:t xml:space="preserve">, where the input argument details are provided in &lt;xref ref-type="table" rid="tbl_56_setinterlock-method-parameters"&gt;Table 56&lt;/xref&gt;.</w:t>
+        <w:t xml:space="preserve">, where the input argument details are provided in </w:t>
+      </w:r>
+      <w:r>
+        <w:fldChar w:fldCharType="begin"/>
+      </w:r>
+      <w:r>
+        <w:instrText xml:space="preserve"> REF Sts_tbl_56 \h \* MERGEFORMAT </w:instrText>
+      </w:r>
+      <w:r>
+        <w:fldChar w:fldCharType="separate"/>
+      </w:r>
+      <w:r>
+        <w:rPr/>
+        <w:t xml:space="preserve">Table 56</w:t>
+      </w:r>
+      <w:r>
+        <w:fldChar w:fldCharType="end"/>
+      </w:r>
+      <w:r>
+        <w:rPr/>
+        <w:t xml:space="preserve">.</w:t>
       </w:r>
     </w:p>
     <w:p>
@@ -45582,7 +47314,23 @@
       </w:r>
       <w:r>
         <w:rPr/>
-        <w:t xml:space="preserve"> result codes are defined in &lt;xref ref-type="table" rid="tbl_60_setparameter-method-result-codes"&gt;Table 60&lt;/xref&gt;</w:t>
+        <w:t xml:space="preserve"> result codes are defined in </w:t>
+      </w:r>
+      <w:r>
+        <w:fldChar w:fldCharType="begin"/>
+      </w:r>
+      <w:r>
+        <w:instrText xml:space="preserve"> REF Sts_tbl_60 \h \* MERGEFORMAT </w:instrText>
+      </w:r>
+      <w:r>
+        <w:fldChar w:fldCharType="separate"/>
+      </w:r>
+      <w:r>
+        <w:rPr/>
+        <w:t xml:space="preserve">Table 60</w:t>
+      </w:r>
+      <w:r>
+        <w:fldChar w:fldCharType="end"/>
       </w:r>
     </w:p>
     <w:p>
@@ -45936,8 +47684,24 @@
         <w:pStyle w:val="PARAGRAPH"/>
       </w:pPr>
       <w:r>
-        <w:rPr/>
-        <w:t xml:space="preserve">&lt;xref ref-type="table" rid="tbl_61_setparameter-method-addressspace-definition"&gt;Table 61&lt;/xref&gt; specifies the </w:t>
+        <w:fldChar w:fldCharType="begin"/>
+      </w:r>
+      <w:r>
+        <w:instrText xml:space="preserve"> REF Sts_tbl_61 \h \* MERGEFORMAT </w:instrText>
+      </w:r>
+      <w:r>
+        <w:fldChar w:fldCharType="separate"/>
+      </w:r>
+      <w:r>
+        <w:rPr/>
+        <w:t xml:space="preserve">Table 61</w:t>
+      </w:r>
+      <w:r>
+        <w:fldChar w:fldCharType="end"/>
+      </w:r>
+      <w:r>
+        <w:rPr/>
+        <w:t xml:space="preserve"> specifies the </w:t>
       </w:r>
       <w:r>
         <w:rPr>
@@ -45977,7 +47741,27 @@
       </w:r>
       <w:r>
         <w:rPr/>
-        <w:t xml:space="preserve">, where the input argument details are provided in &lt;xref ref-type="table" rid="tbl_59_setparameter-method-parameters"&gt;Table 59&lt;/xref&gt;.</w:t>
+        <w:t xml:space="preserve">, where the input argument details are provided in </w:t>
+      </w:r>
+      <w:r>
+        <w:fldChar w:fldCharType="begin"/>
+      </w:r>
+      <w:r>
+        <w:instrText xml:space="preserve"> REF Sts_tbl_59 \h \* MERGEFORMAT </w:instrText>
+      </w:r>
+      <w:r>
+        <w:fldChar w:fldCharType="separate"/>
+      </w:r>
+      <w:r>
+        <w:rPr/>
+        <w:t xml:space="preserve">Table 59</w:t>
+      </w:r>
+      <w:r>
+        <w:fldChar w:fldCharType="end"/>
+      </w:r>
+      <w:r>
+        <w:rPr/>
+        <w:t xml:space="preserve">.</w:t>
       </w:r>
     </w:p>
     <w:p>
@@ -46417,7 +48201,27 @@
       </w:pPr>
       <w:r>
         <w:rPr/>
-        <w:t xml:space="preserve">The PackMLAlarmDataType provides the PackML tag alarm structure. It is formally defined in &lt;xref ref-type="table" rid="tbl_62_packmlalarmdatatype-structure"&gt;Table 62&lt;/xref&gt;.</w:t>
+        <w:t xml:space="preserve">The PackMLAlarmDataType provides the PackML tag alarm structure. It is formally defined in </w:t>
+      </w:r>
+      <w:r>
+        <w:fldChar w:fldCharType="begin"/>
+      </w:r>
+      <w:r>
+        <w:instrText xml:space="preserve"> REF Sts_tbl_62 \h \* MERGEFORMAT </w:instrText>
+      </w:r>
+      <w:r>
+        <w:fldChar w:fldCharType="separate"/>
+      </w:r>
+      <w:r>
+        <w:rPr/>
+        <w:t xml:space="preserve">Table 62</w:t>
+      </w:r>
+      <w:r>
+        <w:fldChar w:fldCharType="end"/>
+      </w:r>
+      <w:r>
+        <w:rPr/>
+        <w:t xml:space="preserve">.</w:t>
       </w:r>
     </w:p>
     <w:p>
@@ -51014,7 +52818,7 @@
             <w:pPr>
               <w:pStyle w:val="TABLE-cell"/>
             </w:pPr>
-            <w:hyperlink r:id="Rc11a532cd8b04d37">
+            <w:hyperlink r:id="Rf1727f4b5c534e18">
               <w:r>
                 <w:rPr>
                   <w:rStyle w:val="Hyperlink"/>
@@ -51050,7 +52854,7 @@
             <w:pPr>
               <w:pStyle w:val="TABLE-cell"/>
             </w:pPr>
-            <w:hyperlink r:id="Rb23cd18b1e824d17">
+            <w:hyperlink r:id="Rc21db50ebac34161">
               <w:r>
                 <w:rPr>
                   <w:rStyle w:val="Hyperlink"/>
@@ -62797,7 +64601,7 @@
       <w:pPr>
         <w:pStyle w:val="PARAGRAPH"/>
       </w:pPr>
-      <w:hyperlink r:id="R50021c98009b4e95">
+      <w:hyperlink r:id="R5127e84107a54c5f">
         <w:r>
           <w:rPr>
             <w:rStyle w:val="Hyperlink"/>
@@ -62824,7 +64628,7 @@
         <w:rPr/>
         <w:t xml:space="preserve"> can be found </w:t>
       </w:r>
-      <w:hyperlink r:id="R60ce4a3d730b4d58">
+      <w:hyperlink r:id="R1c4010231675438e">
         <w:r>
           <w:rPr>
             <w:rStyle w:val="Hyperlink"/>
@@ -62850,7 +64654,7 @@
       <w:pPr>
         <w:pStyle w:val="PARAGRAPH"/>
       </w:pPr>
-      <w:hyperlink r:id="R66db76d0b2464219">
+      <w:hyperlink r:id="Rdb7377554d984bdd">
         <w:r>
           <w:rPr>
             <w:rStyle w:val="Hyperlink"/>
@@ -62872,7 +64676,7 @@
       <w:pPr>
         <w:pStyle w:val="PARAGRAPH"/>
       </w:pPr>
-      <w:hyperlink r:id="R03c3d81c965844eb">
+      <w:hyperlink r:id="R31e0e98e70cf412b">
         <w:r>
           <w:rPr>
             <w:rStyle w:val="Hyperlink"/>
@@ -62894,7 +64698,7 @@
       <w:pPr>
         <w:pStyle w:val="PARAGRAPH"/>
       </w:pPr>
-      <w:hyperlink r:id="R0de0d18d965941ab">
+      <w:hyperlink r:id="R97a6dff2e98249ce">
         <w:r>
           <w:rPr>
             <w:rStyle w:val="Hyperlink"/>
@@ -62916,7 +64720,7 @@
       <w:pPr>
         <w:pStyle w:val="PARAGRAPH"/>
       </w:pPr>
-      <w:hyperlink r:id="R2fb134bf99634270">
+      <w:hyperlink r:id="Rfee51d53f3f146db">
         <w:r>
           <w:rPr>
             <w:rStyle w:val="Hyperlink"/>

</xml_diff>

<commit_message>
Rebuild STS and the browsable specification from 4d77858e
Generated by .github/workflows/publish.yml. Edit source/, model/ or
manifest.json — never artifacts/ or docs/, which the next build discards.
</commit_message>
<xml_diff>
--- a/artifacts/OPC-30050.docx
+++ b/artifacts/OPC-30050.docx
@@ -80,7 +80,7 @@
                                 <pic:cNvPicPr/>
                               </pic:nvPicPr>
                               <pic:blipFill>
-                                <a:blip r:embed="Ra01e0f0105d340b2"/>
+                                <a:blip r:embed="Rbbcb25eee62b4e80"/>
                                 <a:stretch>
                                   <a:fillRect/>
                                 </a:stretch>
@@ -183,7 +183,7 @@
                                 <pic:cNvPicPr/>
                               </pic:nvPicPr>
                               <pic:blipFill>
-                                <a:blip r:embed="R6a376528dfa44222"/>
+                                <a:blip r:embed="R053d6c3e6cd044cf"/>
                                 <a:stretch>
                                   <a:fillRect/>
                                 </a:stretch>
@@ -1485,7 +1485,7 @@
         <w:spacing w:before="60"/>
         <w:ind w:left="340"/>
       </w:pPr>
-      <w:hyperlink r:id="R4388d552fcc44163">
+      <w:hyperlink r:id="R2bc927efd9e34e87">
         <w:r>
           <w:rPr>
             <w:rStyle w:val="Hyperlink"/>
@@ -1520,7 +1520,7 @@
         <w:spacing w:before="60"/>
         <w:ind w:left="340"/>
       </w:pPr>
-      <w:hyperlink r:id="R70dd215fb880470d">
+      <w:hyperlink r:id="R65679c08634841b1">
         <w:r>
           <w:rPr>
             <w:rStyle w:val="Hyperlink"/>
@@ -1555,7 +1555,7 @@
         <w:spacing w:before="60"/>
         <w:ind w:left="340"/>
       </w:pPr>
-      <w:hyperlink r:id="Rbdfcc7a3b3694cd7">
+      <w:hyperlink r:id="R89d2d5c7dcbb40bc">
         <w:r>
           <w:rPr>
             <w:rStyle w:val="Hyperlink"/>
@@ -1590,7 +1590,7 @@
         <w:spacing w:before="60"/>
         <w:ind w:left="340"/>
       </w:pPr>
-      <w:hyperlink r:id="R6ae8b06f2ed94149">
+      <w:hyperlink r:id="R18eda28859554c87">
         <w:r>
           <w:rPr>
             <w:rStyle w:val="Hyperlink"/>
@@ -1625,7 +1625,7 @@
         <w:spacing w:before="60"/>
         <w:ind w:left="340"/>
       </w:pPr>
-      <w:hyperlink r:id="R75d33752e725472c">
+      <w:hyperlink r:id="R943b407dfa9649d6">
         <w:r>
           <w:rPr>
             <w:rStyle w:val="Hyperlink"/>
@@ -1660,7 +1660,7 @@
         <w:spacing w:before="60"/>
         <w:ind w:left="340"/>
       </w:pPr>
-      <w:hyperlink r:id="R5e3eecafff484cd8">
+      <w:hyperlink r:id="R0d80e99d34534b7c">
         <w:r>
           <w:rPr>
             <w:rStyle w:val="Hyperlink"/>
@@ -1695,7 +1695,7 @@
         <w:spacing w:before="60"/>
         <w:ind w:left="340"/>
       </w:pPr>
-      <w:hyperlink r:id="Rfab901df6e7b4b59">
+      <w:hyperlink r:id="R80fb01fca1c94cf3">
         <w:r>
           <w:rPr>
             <w:rStyle w:val="Hyperlink"/>
@@ -1730,7 +1730,7 @@
         <w:spacing w:before="60"/>
         <w:ind w:left="340"/>
       </w:pPr>
-      <w:hyperlink r:id="R4f31b96fc5874ebd">
+      <w:hyperlink r:id="Rd792a4cdcec64067">
         <w:r>
           <w:rPr>
             <w:rStyle w:val="Hyperlink"/>
@@ -1765,7 +1765,7 @@
         <w:spacing w:before="60"/>
         <w:ind w:left="340"/>
       </w:pPr>
-      <w:hyperlink r:id="Ra820312116324891">
+      <w:hyperlink r:id="R1896e9a812d1488d">
         <w:r>
           <w:rPr>
             <w:rStyle w:val="Hyperlink"/>
@@ -1800,7 +1800,7 @@
         <w:spacing w:before="60"/>
         <w:ind w:left="340"/>
       </w:pPr>
-      <w:hyperlink r:id="R0cf9bec5481c4f0e">
+      <w:hyperlink r:id="Ree71aa7773e84c3a">
         <w:r>
           <w:rPr>
             <w:rStyle w:val="Hyperlink"/>
@@ -1835,7 +1835,7 @@
         <w:spacing w:before="60"/>
         <w:ind w:left="340"/>
       </w:pPr>
-      <w:hyperlink r:id="R3d5e529a27f74b6d">
+      <w:hyperlink r:id="R445e9fdcb0314039">
         <w:r>
           <w:rPr>
             <w:rStyle w:val="Hyperlink"/>
@@ -1870,7 +1870,7 @@
         <w:spacing w:before="60"/>
         <w:ind w:left="340"/>
       </w:pPr>
-      <w:hyperlink r:id="R8771ea4acf2c4eea">
+      <w:hyperlink r:id="Rfd699fd8fddd4050">
         <w:r>
           <w:rPr>
             <w:rStyle w:val="Hyperlink"/>
@@ -1905,7 +1905,7 @@
         <w:spacing w:before="60"/>
         <w:ind w:left="340"/>
       </w:pPr>
-      <w:hyperlink r:id="Rcc0a7a90a1ab4348">
+      <w:hyperlink r:id="R1431416726dc415c">
         <w:r>
           <w:rPr>
             <w:rStyle w:val="Hyperlink"/>
@@ -1940,7 +1940,7 @@
         <w:spacing w:before="60"/>
         <w:ind w:left="340"/>
       </w:pPr>
-      <w:hyperlink r:id="Rf22ee0b6fc2f412c">
+      <w:hyperlink r:id="R2ec7b9c3df364aed">
         <w:r>
           <w:rPr>
             <w:rStyle w:val="Hyperlink"/>
@@ -1975,7 +1975,7 @@
         <w:spacing w:before="60"/>
         <w:ind w:left="340"/>
       </w:pPr>
-      <w:hyperlink r:id="R321edb555bb44044">
+      <w:hyperlink r:id="R826cf0a5b5984de0">
         <w:r>
           <w:rPr>
             <w:rStyle w:val="Hyperlink"/>
@@ -2010,7 +2010,7 @@
         <w:spacing w:before="60"/>
         <w:ind w:left="340"/>
       </w:pPr>
-      <w:hyperlink r:id="R4f9b104f4bb34ef9">
+      <w:hyperlink r:id="Rc69591335d0b4b65">
         <w:r>
           <w:rPr>
             <w:rStyle w:val="Hyperlink"/>
@@ -2045,7 +2045,7 @@
         <w:spacing w:before="60"/>
         <w:ind w:left="340"/>
       </w:pPr>
-      <w:hyperlink r:id="Rf0761bbff55a4021">
+      <w:hyperlink r:id="R6008dc209b5348ba">
         <w:r>
           <w:rPr>
             <w:rStyle w:val="Hyperlink"/>
@@ -2080,7 +2080,7 @@
         <w:spacing w:before="60"/>
         <w:ind w:left="340"/>
       </w:pPr>
-      <w:hyperlink r:id="R2bbfff73fa004e1d">
+      <w:hyperlink r:id="Rad4a398c27dd4290">
         <w:r>
           <w:rPr>
             <w:rStyle w:val="Hyperlink"/>
@@ -3323,7 +3323,7 @@
                     <pic:cNvPicPr/>
                   </pic:nvPicPr>
                   <pic:blipFill>
-                    <a:blip r:embed="R7fcb0047437e4af8"/>
+                    <a:blip r:embed="R7d3f1d2df71441c9"/>
                     <a:stretch>
                       <a:fillRect/>
                     </a:stretch>
@@ -3626,7 +3626,7 @@
                     <pic:cNvPicPr/>
                   </pic:nvPicPr>
                   <pic:blipFill>
-                    <a:blip r:embed="R8efe19e247174443"/>
+                    <a:blip r:embed="Rb14b7e2239f841ca"/>
                     <a:stretch>
                       <a:fillRect/>
                     </a:stretch>
@@ -4867,7 +4867,7 @@
                     <pic:cNvPicPr/>
                   </pic:nvPicPr>
                   <pic:blipFill>
-                    <a:blip r:embed="R2beb5b2f2a21403f"/>
+                    <a:blip r:embed="R02f087b3734249ae"/>
                     <a:stretch>
                       <a:fillRect/>
                     </a:stretch>
@@ -5172,7 +5172,7 @@
                     <pic:cNvPicPr/>
                   </pic:nvPicPr>
                   <pic:blipFill>
-                    <a:blip r:embed="Rb41ee27259e34d5c"/>
+                    <a:blip r:embed="R86372ae0d1984ea9"/>
                     <a:stretch>
                       <a:fillRect/>
                     </a:stretch>
@@ -5580,7 +5580,7 @@
                     <pic:cNvPicPr/>
                   </pic:nvPicPr>
                   <pic:blipFill>
-                    <a:blip r:embed="R8195ec889477442b"/>
+                    <a:blip r:embed="Rbe9d98fc95a04882"/>
                     <a:stretch>
                       <a:fillRect/>
                     </a:stretch>
@@ -5810,7 +5810,7 @@
                     <pic:cNvPicPr/>
                   </pic:nvPicPr>
                   <pic:blipFill>
-                    <a:blip r:embed="R127acc32a4264389"/>
+                    <a:blip r:embed="R968a8dcf919e4fc8"/>
                     <a:stretch>
                       <a:fillRect/>
                     </a:stretch>
@@ -5914,7 +5914,7 @@
                     <pic:cNvPicPr/>
                   </pic:nvPicPr>
                   <pic:blipFill>
-                    <a:blip r:embed="R02e1892b2c8f44a6"/>
+                    <a:blip r:embed="R9627df5a187b49c4"/>
                     <a:stretch>
                       <a:fillRect/>
                     </a:stretch>
@@ -7525,7 +7525,7 @@
                     <pic:cNvPicPr/>
                   </pic:nvPicPr>
                   <pic:blipFill>
-                    <a:blip r:embed="Ra9c805a040124a44"/>
+                    <a:blip r:embed="Re11e1743c5724b21"/>
                     <a:stretch>
                       <a:fillRect/>
                     </a:stretch>
@@ -8149,7 +8149,7 @@
                     <pic:cNvPicPr/>
                   </pic:nvPicPr>
                   <pic:blipFill>
-                    <a:blip r:embed="R2d1916983a084f7d"/>
+                    <a:blip r:embed="Rd7366062168940eb"/>
                     <a:stretch>
                       <a:fillRect/>
                     </a:stretch>
@@ -8318,7 +8318,7 @@
                     <pic:cNvPicPr/>
                   </pic:nvPicPr>
                   <pic:blipFill>
-                    <a:blip r:embed="R62932c998c8f4b7c"/>
+                    <a:blip r:embed="R16082376092c441b"/>
                     <a:stretch>
                       <a:fillRect/>
                     </a:stretch>
@@ -8930,7 +8930,7 @@
                     <pic:cNvPicPr/>
                   </pic:nvPicPr>
                   <pic:blipFill>
-                    <a:blip r:embed="Rd8adc4cffd654d14"/>
+                    <a:blip r:embed="R21e1ba8da80c41d1"/>
                     <a:stretch>
                       <a:fillRect/>
                     </a:stretch>
@@ -10950,7 +10950,7 @@
                     <pic:cNvPicPr/>
                   </pic:nvPicPr>
                   <pic:blipFill>
-                    <a:blip r:embed="R9a013927d728470b"/>
+                    <a:blip r:embed="Rd6532e4bf62c467a"/>
                     <a:stretch>
                       <a:fillRect/>
                     </a:stretch>
@@ -13482,7 +13482,7 @@
                     <pic:cNvPicPr/>
                   </pic:nvPicPr>
                   <pic:blipFill>
-                    <a:blip r:embed="Rbf55a40ef88a47a2"/>
+                    <a:blip r:embed="Rb8194332c42d461f"/>
                     <a:stretch>
                       <a:fillRect/>
                     </a:stretch>
@@ -16241,7 +16241,7 @@
                     <pic:cNvPicPr/>
                   </pic:nvPicPr>
                   <pic:blipFill>
-                    <a:blip r:embed="R24762306429c45b2"/>
+                    <a:blip r:embed="R22472f3ab3e946c6"/>
                     <a:stretch>
                       <a:fillRect/>
                     </a:stretch>
@@ -16621,7 +16621,7 @@
                     <pic:cNvPicPr/>
                   </pic:nvPicPr>
                   <pic:blipFill>
-                    <a:blip r:embed="R9a7d2feaa3d0435c"/>
+                    <a:blip r:embed="R3724f7b856014036"/>
                     <a:stretch>
                       <a:fillRect/>
                     </a:stretch>
@@ -16826,7 +16826,7 @@
                     <pic:cNvPicPr/>
                   </pic:nvPicPr>
                   <pic:blipFill>
-                    <a:blip r:embed="R31847fd4ff1249d1"/>
+                    <a:blip r:embed="R5a6f1809508a4795"/>
                     <a:stretch>
                       <a:fillRect/>
                     </a:stretch>
@@ -19200,7 +19200,7 @@
                     <pic:cNvPicPr/>
                   </pic:nvPicPr>
                   <pic:blipFill>
-                    <a:blip r:embed="Rc12fc497a2754e59"/>
+                    <a:blip r:embed="Ra4a5641bbfc045ff"/>
                     <a:stretch>
                       <a:fillRect/>
                     </a:stretch>
@@ -21818,7 +21818,7 @@
                     <pic:cNvPicPr/>
                   </pic:nvPicPr>
                   <pic:blipFill>
-                    <a:blip r:embed="R724872192bcb4c1e"/>
+                    <a:blip r:embed="R3e37d43e672e4086"/>
                     <a:stretch>
                       <a:fillRect/>
                     </a:stretch>
@@ -29317,10 +29317,6 @@
         <w:pStyle w:val="PARAGRAPH"/>
       </w:pPr>
       <w:r>
-        <w:rPr/>
-        <w:t xml:space="preserve">The </w:t>
-      </w:r>
-      <w:r>
         <w:rPr>
           <w:i/>
         </w:rPr>
@@ -29338,7 +29334,7 @@
       </w:r>
       <w:r>
         <w:rPr/>
-        <w:t xml:space="preserve"> may define additional enumeration that describe the modes they support, but any such enumeration must include "Produce" as enumeration 1 and if Maintenance or Manual are include, they must be 2 and 3 respectively. Any additional mode must start at 4 or greater. If vendor specific or end user specific mode enumerations are included, they shall be defined as a subtype of this enumeration. The ProductionMaintenanceModeEnum is the default enumeration that shall be used if no vendor or end user mode enumeration is defined. The </w:t>
+        <w:t xml:space="preserve"> may define additional enumerations that describe the modes it supports, but any such enumeration must include "Production" as enumeration 1 and if Maintenance or Manual are included, they must be 2 and 3 respectively. Any additional modes must start at 4 or greater. If vendor specific or end user specific mode enumerations are included, they shall be defined as a subtype of this enumeration. ProductionMaintenanceModeEnum is the default enumeration that shall be used if no vendor or end user mode enumeration is defined. </w:t>
       </w:r>
       <w:r>
         <w:rPr>
@@ -29510,7 +29506,7 @@
             </w:pPr>
             <w:r>
               <w:rPr/>
-              <w:t xml:space="preserve">This is an invalid mode</w:t>
+              <w:t xml:space="preserve">Not used</w:t>
             </w:r>
           </w:p>
         </w:tc>
@@ -29527,7 +29523,7 @@
             </w:pPr>
             <w:r>
               <w:rPr/>
-              <w:t xml:space="preserve">Produce</w:t>
+              <w:t xml:space="preserve">Production</w:t>
             </w:r>
           </w:p>
         </w:tc>
@@ -29668,7 +29664,7 @@
       </w:pPr>
       <w:r>
         <w:rPr/>
-        <w:t xml:space="preserve">where the following definition apply:</w:t>
+        <w:t xml:space="preserve">where the following definitions apply:</w:t>
       </w:r>
     </w:p>
     <w:p>
@@ -29677,7 +29673,7 @@
       </w:pPr>
       <w:r>
         <w:rPr/>
-        <w:t xml:space="preserve">-Produce corresponds to the PackML Production Mode which is routine production.</w:t>
+        <w:t xml:space="preserve">-Production corresponds to the PackML Production Mode which is routine production.</w:t>
       </w:r>
     </w:p>
     <w:p>
@@ -44551,7 +44547,7 @@
                     <pic:cNvPicPr/>
                   </pic:nvPicPr>
                   <pic:blipFill>
-                    <a:blip r:embed="R3316b9f77aeb4db9"/>
+                    <a:blip r:embed="Ra72b90d637ca4aaf"/>
                     <a:stretch>
                       <a:fillRect/>
                     </a:stretch>
@@ -44626,7 +44622,7 @@
                     <pic:cNvPicPr/>
                   </pic:nvPicPr>
                   <pic:blipFill>
-                    <a:blip r:embed="Rb090c39ac1a048d8"/>
+                    <a:blip r:embed="R037c8854e4ed4096"/>
                     <a:stretch>
                       <a:fillRect/>
                     </a:stretch>
@@ -52818,7 +52814,7 @@
             <w:pPr>
               <w:pStyle w:val="TABLE-cell"/>
             </w:pPr>
-            <w:hyperlink r:id="Rf1727f4b5c534e18">
+            <w:hyperlink r:id="R5380716e60a5456c">
               <w:r>
                 <w:rPr>
                   <w:rStyle w:val="Hyperlink"/>
@@ -52854,7 +52850,7 @@
             <w:pPr>
               <w:pStyle w:val="TABLE-cell"/>
             </w:pPr>
-            <w:hyperlink r:id="Rc21db50ebac34161">
+            <w:hyperlink r:id="Re02339cd195f47a9">
               <w:r>
                 <w:rPr>
                   <w:rStyle w:val="Hyperlink"/>
@@ -57444,7 +57440,7 @@
             </w:pPr>
             <w:r>
               <w:rPr/>
-              <w:t xml:space="preserve">1.01</w:t>
+              <w:t xml:space="preserve">2.0.1-alpha</w:t>
             </w:r>
           </w:p>
         </w:tc>
@@ -57491,7 +57487,7 @@
             </w:pPr>
             <w:r>
               <w:rPr/>
-              <w:t xml:space="preserve">2020-10-08</w:t>
+              <w:t xml:space="preserve">2026-09-08</w:t>
             </w:r>
           </w:p>
         </w:tc>
@@ -64601,7 +64597,7 @@
       <w:pPr>
         <w:pStyle w:val="PARAGRAPH"/>
       </w:pPr>
-      <w:hyperlink r:id="R5127e84107a54c5f">
+      <w:hyperlink r:id="R64b0724c5296468c">
         <w:r>
           <w:rPr>
             <w:rStyle w:val="Hyperlink"/>
@@ -64628,7 +64624,7 @@
         <w:rPr/>
         <w:t xml:space="preserve"> can be found </w:t>
       </w:r>
-      <w:hyperlink r:id="R1c4010231675438e">
+      <w:hyperlink r:id="R240a06e547784780">
         <w:r>
           <w:rPr>
             <w:rStyle w:val="Hyperlink"/>
@@ -64654,7 +64650,7 @@
       <w:pPr>
         <w:pStyle w:val="PARAGRAPH"/>
       </w:pPr>
-      <w:hyperlink r:id="Rdb7377554d984bdd">
+      <w:hyperlink r:id="Rab8ab35a8b8c4057">
         <w:r>
           <w:rPr>
             <w:rStyle w:val="Hyperlink"/>
@@ -64676,7 +64672,7 @@
       <w:pPr>
         <w:pStyle w:val="PARAGRAPH"/>
       </w:pPr>
-      <w:hyperlink r:id="R31e0e98e70cf412b">
+      <w:hyperlink r:id="R06fe3d25bb2c468d">
         <w:r>
           <w:rPr>
             <w:rStyle w:val="Hyperlink"/>
@@ -64698,7 +64694,7 @@
       <w:pPr>
         <w:pStyle w:val="PARAGRAPH"/>
       </w:pPr>
-      <w:hyperlink r:id="R97a6dff2e98249ce">
+      <w:hyperlink r:id="R84f354ae9bf4473a">
         <w:r>
           <w:rPr>
             <w:rStyle w:val="Hyperlink"/>
@@ -64720,7 +64716,7 @@
       <w:pPr>
         <w:pStyle w:val="PARAGRAPH"/>
       </w:pPr>
-      <w:hyperlink r:id="Rfee51d53f3f146db">
+      <w:hyperlink r:id="R6ff4157149d649ed">
         <w:r>
           <w:rPr>
             <w:rStyle w:val="Hyperlink"/>

</xml_diff>

<commit_message>
Rebuild STS and the browsable specification from 34d780a6
Generated by .github/workflows/publish.yml. Edit source/, model/ or
manifest.json — never artifacts/ or docs/, which the next build discards.
</commit_message>
<xml_diff>
--- a/artifacts/OPC-30050.docx
+++ b/artifacts/OPC-30050.docx
@@ -80,7 +80,7 @@
                                 <pic:cNvPicPr/>
                               </pic:nvPicPr>
                               <pic:blipFill>
-                                <a:blip r:embed="Rbbcb25eee62b4e80"/>
+                                <a:blip r:embed="R61a6e7f0ec804481"/>
                                 <a:stretch>
                                   <a:fillRect/>
                                 </a:stretch>
@@ -183,7 +183,7 @@
                                 <pic:cNvPicPr/>
                               </pic:nvPicPr>
                               <pic:blipFill>
-                                <a:blip r:embed="R053d6c3e6cd044cf"/>
+                                <a:blip r:embed="Rc7b2b851699245f5"/>
                                 <a:stretch>
                                   <a:fillRect/>
                                 </a:stretch>
@@ -1485,7 +1485,7 @@
         <w:spacing w:before="60"/>
         <w:ind w:left="340"/>
       </w:pPr>
-      <w:hyperlink r:id="R2bc927efd9e34e87">
+      <w:hyperlink r:id="R132a19d534db458d">
         <w:r>
           <w:rPr>
             <w:rStyle w:val="Hyperlink"/>
@@ -1520,7 +1520,7 @@
         <w:spacing w:before="60"/>
         <w:ind w:left="340"/>
       </w:pPr>
-      <w:hyperlink r:id="R65679c08634841b1">
+      <w:hyperlink r:id="R0a07ded267e340e1">
         <w:r>
           <w:rPr>
             <w:rStyle w:val="Hyperlink"/>
@@ -1555,7 +1555,7 @@
         <w:spacing w:before="60"/>
         <w:ind w:left="340"/>
       </w:pPr>
-      <w:hyperlink r:id="R89d2d5c7dcbb40bc">
+      <w:hyperlink r:id="R948548378000468a">
         <w:r>
           <w:rPr>
             <w:rStyle w:val="Hyperlink"/>
@@ -1590,7 +1590,7 @@
         <w:spacing w:before="60"/>
         <w:ind w:left="340"/>
       </w:pPr>
-      <w:hyperlink r:id="R18eda28859554c87">
+      <w:hyperlink r:id="R51edf797f82d439c">
         <w:r>
           <w:rPr>
             <w:rStyle w:val="Hyperlink"/>
@@ -1625,7 +1625,7 @@
         <w:spacing w:before="60"/>
         <w:ind w:left="340"/>
       </w:pPr>
-      <w:hyperlink r:id="R943b407dfa9649d6">
+      <w:hyperlink r:id="Ra2b6a980d3eb4f13">
         <w:r>
           <w:rPr>
             <w:rStyle w:val="Hyperlink"/>
@@ -1660,7 +1660,7 @@
         <w:spacing w:before="60"/>
         <w:ind w:left="340"/>
       </w:pPr>
-      <w:hyperlink r:id="R0d80e99d34534b7c">
+      <w:hyperlink r:id="R77550a7e6c57408c">
         <w:r>
           <w:rPr>
             <w:rStyle w:val="Hyperlink"/>
@@ -1695,7 +1695,7 @@
         <w:spacing w:before="60"/>
         <w:ind w:left="340"/>
       </w:pPr>
-      <w:hyperlink r:id="R80fb01fca1c94cf3">
+      <w:hyperlink r:id="R5eff885f6c674899">
         <w:r>
           <w:rPr>
             <w:rStyle w:val="Hyperlink"/>
@@ -1730,7 +1730,7 @@
         <w:spacing w:before="60"/>
         <w:ind w:left="340"/>
       </w:pPr>
-      <w:hyperlink r:id="Rd792a4cdcec64067">
+      <w:hyperlink r:id="R8e3ccea8c5f14698">
         <w:r>
           <w:rPr>
             <w:rStyle w:val="Hyperlink"/>
@@ -1765,7 +1765,7 @@
         <w:spacing w:before="60"/>
         <w:ind w:left="340"/>
       </w:pPr>
-      <w:hyperlink r:id="R1896e9a812d1488d">
+      <w:hyperlink r:id="Rc16086641f5d4763">
         <w:r>
           <w:rPr>
             <w:rStyle w:val="Hyperlink"/>
@@ -1800,7 +1800,7 @@
         <w:spacing w:before="60"/>
         <w:ind w:left="340"/>
       </w:pPr>
-      <w:hyperlink r:id="Ree71aa7773e84c3a">
+      <w:hyperlink r:id="Re10a36374cbf4f80">
         <w:r>
           <w:rPr>
             <w:rStyle w:val="Hyperlink"/>
@@ -1835,7 +1835,7 @@
         <w:spacing w:before="60"/>
         <w:ind w:left="340"/>
       </w:pPr>
-      <w:hyperlink r:id="R445e9fdcb0314039">
+      <w:hyperlink r:id="Rb059751693094f76">
         <w:r>
           <w:rPr>
             <w:rStyle w:val="Hyperlink"/>
@@ -1870,7 +1870,7 @@
         <w:spacing w:before="60"/>
         <w:ind w:left="340"/>
       </w:pPr>
-      <w:hyperlink r:id="Rfd699fd8fddd4050">
+      <w:hyperlink r:id="R1e81cab00d0a4a9c">
         <w:r>
           <w:rPr>
             <w:rStyle w:val="Hyperlink"/>
@@ -1905,7 +1905,7 @@
         <w:spacing w:before="60"/>
         <w:ind w:left="340"/>
       </w:pPr>
-      <w:hyperlink r:id="R1431416726dc415c">
+      <w:hyperlink r:id="Re9e537fc6daa4572">
         <w:r>
           <w:rPr>
             <w:rStyle w:val="Hyperlink"/>
@@ -1940,7 +1940,7 @@
         <w:spacing w:before="60"/>
         <w:ind w:left="340"/>
       </w:pPr>
-      <w:hyperlink r:id="R2ec7b9c3df364aed">
+      <w:hyperlink r:id="Rb8df3f966105424d">
         <w:r>
           <w:rPr>
             <w:rStyle w:val="Hyperlink"/>
@@ -1975,7 +1975,7 @@
         <w:spacing w:before="60"/>
         <w:ind w:left="340"/>
       </w:pPr>
-      <w:hyperlink r:id="R826cf0a5b5984de0">
+      <w:hyperlink r:id="Rf6cfec2870544545">
         <w:r>
           <w:rPr>
             <w:rStyle w:val="Hyperlink"/>
@@ -2010,7 +2010,7 @@
         <w:spacing w:before="60"/>
         <w:ind w:left="340"/>
       </w:pPr>
-      <w:hyperlink r:id="Rc69591335d0b4b65">
+      <w:hyperlink r:id="R3e807869733f4945">
         <w:r>
           <w:rPr>
             <w:rStyle w:val="Hyperlink"/>
@@ -2045,7 +2045,7 @@
         <w:spacing w:before="60"/>
         <w:ind w:left="340"/>
       </w:pPr>
-      <w:hyperlink r:id="R6008dc209b5348ba">
+      <w:hyperlink r:id="Rf97e1f32529442e0">
         <w:r>
           <w:rPr>
             <w:rStyle w:val="Hyperlink"/>
@@ -2080,7 +2080,7 @@
         <w:spacing w:before="60"/>
         <w:ind w:left="340"/>
       </w:pPr>
-      <w:hyperlink r:id="Rad4a398c27dd4290">
+      <w:hyperlink r:id="Refbd1f796bc14eb5">
         <w:r>
           <w:rPr>
             <w:rStyle w:val="Hyperlink"/>
@@ -3323,7 +3323,7 @@
                     <pic:cNvPicPr/>
                   </pic:nvPicPr>
                   <pic:blipFill>
-                    <a:blip r:embed="R7d3f1d2df71441c9"/>
+                    <a:blip r:embed="Re87fe5533a444006"/>
                     <a:stretch>
                       <a:fillRect/>
                     </a:stretch>
@@ -3626,7 +3626,7 @@
                     <pic:cNvPicPr/>
                   </pic:nvPicPr>
                   <pic:blipFill>
-                    <a:blip r:embed="Rb14b7e2239f841ca"/>
+                    <a:blip r:embed="R0fff991955f34179"/>
                     <a:stretch>
                       <a:fillRect/>
                     </a:stretch>
@@ -4867,7 +4867,7 @@
                     <pic:cNvPicPr/>
                   </pic:nvPicPr>
                   <pic:blipFill>
-                    <a:blip r:embed="R02f087b3734249ae"/>
+                    <a:blip r:embed="Rc06e133711ec46ae"/>
                     <a:stretch>
                       <a:fillRect/>
                     </a:stretch>
@@ -5172,7 +5172,7 @@
                     <pic:cNvPicPr/>
                   </pic:nvPicPr>
                   <pic:blipFill>
-                    <a:blip r:embed="R86372ae0d1984ea9"/>
+                    <a:blip r:embed="Racdd6048bccb4e4f"/>
                     <a:stretch>
                       <a:fillRect/>
                     </a:stretch>
@@ -5580,7 +5580,7 @@
                     <pic:cNvPicPr/>
                   </pic:nvPicPr>
                   <pic:blipFill>
-                    <a:blip r:embed="Rbe9d98fc95a04882"/>
+                    <a:blip r:embed="R64bfcbb61d0740c4"/>
                     <a:stretch>
                       <a:fillRect/>
                     </a:stretch>
@@ -5810,7 +5810,7 @@
                     <pic:cNvPicPr/>
                   </pic:nvPicPr>
                   <pic:blipFill>
-                    <a:blip r:embed="R968a8dcf919e4fc8"/>
+                    <a:blip r:embed="Ra4bbcfe7ff6e48b6"/>
                     <a:stretch>
                       <a:fillRect/>
                     </a:stretch>
@@ -5914,7 +5914,7 @@
                     <pic:cNvPicPr/>
                   </pic:nvPicPr>
                   <pic:blipFill>
-                    <a:blip r:embed="R9627df5a187b49c4"/>
+                    <a:blip r:embed="Rdf691298200741ac"/>
                     <a:stretch>
                       <a:fillRect/>
                     </a:stretch>
@@ -7525,7 +7525,7 @@
                     <pic:cNvPicPr/>
                   </pic:nvPicPr>
                   <pic:blipFill>
-                    <a:blip r:embed="Re11e1743c5724b21"/>
+                    <a:blip r:embed="R7fd28ec156f542a8"/>
                     <a:stretch>
                       <a:fillRect/>
                     </a:stretch>
@@ -8149,7 +8149,7 @@
                     <pic:cNvPicPr/>
                   </pic:nvPicPr>
                   <pic:blipFill>
-                    <a:blip r:embed="Rd7366062168940eb"/>
+                    <a:blip r:embed="R0c36a764f41a45ed"/>
                     <a:stretch>
                       <a:fillRect/>
                     </a:stretch>
@@ -8318,7 +8318,7 @@
                     <pic:cNvPicPr/>
                   </pic:nvPicPr>
                   <pic:blipFill>
-                    <a:blip r:embed="R16082376092c441b"/>
+                    <a:blip r:embed="Rb507592024e14be4"/>
                     <a:stretch>
                       <a:fillRect/>
                     </a:stretch>
@@ -8930,7 +8930,7 @@
                     <pic:cNvPicPr/>
                   </pic:nvPicPr>
                   <pic:blipFill>
-                    <a:blip r:embed="R21e1ba8da80c41d1"/>
+                    <a:blip r:embed="R9704a8de49384200"/>
                     <a:stretch>
                       <a:fillRect/>
                     </a:stretch>
@@ -10950,7 +10950,7 @@
                     <pic:cNvPicPr/>
                   </pic:nvPicPr>
                   <pic:blipFill>
-                    <a:blip r:embed="Rd6532e4bf62c467a"/>
+                    <a:blip r:embed="Rd2819114e6884b4b"/>
                     <a:stretch>
                       <a:fillRect/>
                     </a:stretch>
@@ -13482,7 +13482,7 @@
                     <pic:cNvPicPr/>
                   </pic:nvPicPr>
                   <pic:blipFill>
-                    <a:blip r:embed="Rb8194332c42d461f"/>
+                    <a:blip r:embed="Rded06ff4dcfa4870"/>
                     <a:stretch>
                       <a:fillRect/>
                     </a:stretch>
@@ -14022,7 +14022,7 @@
             </w:pPr>
             <w:r>
               <w:rPr/>
-              <w:t xml:space="preserve">PackMLAlarmDataType[]</w:t>
+              <w:t xml:space="preserve">PackMLEventDataType[]</w:t>
             </w:r>
           </w:p>
         </w:tc>
@@ -14236,7 +14236,7 @@
             </w:pPr>
             <w:r>
               <w:rPr/>
-              <w:t xml:space="preserve">PackMLAlarmDataType[]</w:t>
+              <w:t xml:space="preserve">PackMLEventDataType[]</w:t>
             </w:r>
           </w:p>
         </w:tc>
@@ -14450,7 +14450,7 @@
             </w:pPr>
             <w:r>
               <w:rPr/>
-              <w:t xml:space="preserve">PackMLAlarmDataType[]</w:t>
+              <w:t xml:space="preserve">PackMLEventDataType[]</w:t>
             </w:r>
           </w:p>
         </w:tc>
@@ -14664,7 +14664,7 @@
             </w:pPr>
             <w:r>
               <w:rPr/>
-              <w:t xml:space="preserve">PackMLAlarmDataType</w:t>
+              <w:t xml:space="preserve">PackMLEventDataType</w:t>
             </w:r>
           </w:p>
         </w:tc>
@@ -16241,7 +16241,7 @@
                     <pic:cNvPicPr/>
                   </pic:nvPicPr>
                   <pic:blipFill>
-                    <a:blip r:embed="R22472f3ab3e946c6"/>
+                    <a:blip r:embed="Rfb187c45243a4c2a"/>
                     <a:stretch>
                       <a:fillRect/>
                     </a:stretch>
@@ -16621,7 +16621,7 @@
                     <pic:cNvPicPr/>
                   </pic:nvPicPr>
                   <pic:blipFill>
-                    <a:blip r:embed="R3724f7b856014036"/>
+                    <a:blip r:embed="Rd4d65f6d0d684db9"/>
                     <a:stretch>
                       <a:fillRect/>
                     </a:stretch>
@@ -16826,7 +16826,7 @@
                     <pic:cNvPicPr/>
                   </pic:nvPicPr>
                   <pic:blipFill>
-                    <a:blip r:embed="R5a6f1809508a4795"/>
+                    <a:blip r:embed="R914e571074db4578"/>
                     <a:stretch>
                       <a:fillRect/>
                     </a:stretch>
@@ -19200,7 +19200,7 @@
                     <pic:cNvPicPr/>
                   </pic:nvPicPr>
                   <pic:blipFill>
-                    <a:blip r:embed="Ra4a5641bbfc045ff"/>
+                    <a:blip r:embed="Rbfe1d76ba2f7473b"/>
                     <a:stretch>
                       <a:fillRect/>
                     </a:stretch>
@@ -21818,7 +21818,7 @@
                     <pic:cNvPicPr/>
                   </pic:nvPicPr>
                   <pic:blipFill>
-                    <a:blip r:embed="R3e37d43e672e4086"/>
+                    <a:blip r:embed="R25742d8e8f404dbc"/>
                     <a:stretch>
                       <a:fillRect/>
                     </a:stretch>
@@ -44547,7 +44547,7 @@
                     <pic:cNvPicPr/>
                   </pic:nvPicPr>
                   <pic:blipFill>
-                    <a:blip r:embed="Ra72b90d637ca4aaf"/>
+                    <a:blip r:embed="R140d56397d22443c"/>
                     <a:stretch>
                       <a:fillRect/>
                     </a:stretch>
@@ -44622,7 +44622,7 @@
                     <pic:cNvPicPr/>
                   </pic:nvPicPr>
                   <pic:blipFill>
-                    <a:blip r:embed="R037c8854e4ed4096"/>
+                    <a:blip r:embed="Rbdf52c80dc94487c"/>
                     <a:stretch>
                       <a:fillRect/>
                     </a:stretch>
@@ -48187,7 +48187,7 @@
       <w:bookmarkStart w:name="Sts_sec_6_8_2_2" w:id="187"/>
       <w:r>
         <w:rPr/>
-        <w:t xml:space="preserve">PackMLAlarmDataType</w:t>
+        <w:t xml:space="preserve">PackMLEventDataType</w:t>
       </w:r>
       <w:bookmarkEnd w:id="187"/>
     </w:p>
@@ -48197,7 +48197,7 @@
       </w:pPr>
       <w:r>
         <w:rPr/>
-        <w:t xml:space="preserve">The PackMLAlarmDataType provides the PackML tag alarm structure. It is formally defined in </w:t>
+        <w:t xml:space="preserve">The PackMLEventDataType provides the PackML tag alarm structure. It is formally defined in </w:t>
       </w:r>
       <w:r>
         <w:fldChar w:fldCharType="begin"/>
@@ -48250,7 +48250,7 @@
       </w:r>
       <w:r>
         <w:rPr/>
-        <w:t xml:space="preserve">PackMLAlarmDataType Structure</w:t>
+        <w:t xml:space="preserve">PackMLEventDataType Structure</w:t>
       </w:r>
     </w:p>
     <w:tbl>
@@ -48329,7 +48329,7 @@
             </w:pPr>
             <w:r>
               <w:rPr/>
-              <w:t xml:space="preserve">PackMLAlarmDataType</w:t>
+              <w:t xml:space="preserve">PackMLEventDataType</w:t>
             </w:r>
           </w:p>
         </w:tc>
@@ -52814,7 +52814,7 @@
             <w:pPr>
               <w:pStyle w:val="TABLE-cell"/>
             </w:pPr>
-            <w:hyperlink r:id="R5380716e60a5456c">
+            <w:hyperlink r:id="Rac09cd837a9541df">
               <w:r>
                 <w:rPr>
                   <w:rStyle w:val="Hyperlink"/>
@@ -52850,7 +52850,7 @@
             <w:pPr>
               <w:pStyle w:val="TABLE-cell"/>
             </w:pPr>
-            <w:hyperlink r:id="Re02339cd195f47a9">
+            <w:hyperlink r:id="R0a6884b5b134461c">
               <w:r>
                 <w:rPr>
                   <w:rStyle w:val="Hyperlink"/>
@@ -57440,7 +57440,7 @@
             </w:pPr>
             <w:r>
               <w:rPr/>
-              <w:t xml:space="preserve">2.0.1-alpha</w:t>
+              <w:t xml:space="preserve">2.0.2</w:t>
             </w:r>
           </w:p>
         </w:tc>
@@ -64597,7 +64597,7 @@
       <w:pPr>
         <w:pStyle w:val="PARAGRAPH"/>
       </w:pPr>
-      <w:hyperlink r:id="R64b0724c5296468c">
+      <w:hyperlink r:id="R5cf18b577c774961">
         <w:r>
           <w:rPr>
             <w:rStyle w:val="Hyperlink"/>
@@ -64624,7 +64624,7 @@
         <w:rPr/>
         <w:t xml:space="preserve"> can be found </w:t>
       </w:r>
-      <w:hyperlink r:id="R240a06e547784780">
+      <w:hyperlink r:id="Rfd0ce11d052f4ba4">
         <w:r>
           <w:rPr>
             <w:rStyle w:val="Hyperlink"/>
@@ -64650,7 +64650,7 @@
       <w:pPr>
         <w:pStyle w:val="PARAGRAPH"/>
       </w:pPr>
-      <w:hyperlink r:id="Rab8ab35a8b8c4057">
+      <w:hyperlink r:id="Redc2f6a8d8f04902">
         <w:r>
           <w:rPr>
             <w:rStyle w:val="Hyperlink"/>
@@ -64672,7 +64672,7 @@
       <w:pPr>
         <w:pStyle w:val="PARAGRAPH"/>
       </w:pPr>
-      <w:hyperlink r:id="R06fe3d25bb2c468d">
+      <w:hyperlink r:id="R072a526309904583">
         <w:r>
           <w:rPr>
             <w:rStyle w:val="Hyperlink"/>
@@ -64694,7 +64694,7 @@
       <w:pPr>
         <w:pStyle w:val="PARAGRAPH"/>
       </w:pPr>
-      <w:hyperlink r:id="R84f354ae9bf4473a">
+      <w:hyperlink r:id="Rf6b7901a0c6a48b2">
         <w:r>
           <w:rPr>
             <w:rStyle w:val="Hyperlink"/>
@@ -64716,7 +64716,7 @@
       <w:pPr>
         <w:pStyle w:val="PARAGRAPH"/>
       </w:pPr>
-      <w:hyperlink r:id="R6ff4157149d649ed">
+      <w:hyperlink r:id="R72acfb240c444253">
         <w:r>
           <w:rPr>
             <w:rStyle w:val="Hyperlink"/>

</xml_diff>